<commit_message>
Fix copy job: blank since_timestamp now processes all pending rows
- When since_timestamp is blank, the Copy KA Examples job now selects ALL rows
  with copied_examples = 'Pending' across every run (previously it defaulted to
  the latest run only via leftover run_id logic).
- run_id is now a purely optional explicit override, never applied by default.
- Set since_timestamp default back to "" and update variables.yml comment.
- Regenerate user manual to match the corrected behavior.

Co-authored-by: Isaac
</commit_message>
<xml_diff>
--- a/KA_Deployment_User_Manual.docx
+++ b/KA_Deployment_User_Manual.docx
@@ -2723,7 +2723,7 @@
                 <w:sz w:val="18"/>
                 <w:szCs w:val="18"/>
               </w:rPr>
-              <w:t xml:space="preserve">Copy job: only process rows completed after this time.</w:t>
+              <w:t xml:space="preserve">Copy job: only rows completed after this (blank = all pending).</w:t>
             </w:r>
           </w:p>
         </w:tc>
@@ -8269,7 +8269,7 @@
         <w:rPr>
           <w:rFonts w:ascii="DM Sans" w:hAnsi="DM Sans" w:cs="DM Sans"/>
         </w:rPr>
-        <w:t xml:space="preserve">The copy job accepts an optional since_timestamp. When set, it processes only deploy rows whose completed_at is newer than that timestamp (across all runs). When blank, it processes the latest run.</w:t>
+        <w:t xml:space="preserve">The copy job accepts an optional since_timestamp. When set, it processes only deploy rows whose completed_at is newer than that timestamp (across all runs). When blank, it processes ALL rows still pending copy (copied_examples = 'Pending') across every run.</w:t>
       </w:r>
     </w:p>
     <w:p>

</xml_diff>

<commit_message>
Enrich manual section 3 with variables.yml comments, defaults, examples
- Expand the variables table to mirror the inline comments in variables.yml
- Add a Default column alongside the Example column
- Capture key nuances: per-KA wait ceiling (not additive), blank behaviors,
  secret-scope keys, and classic-only compute settings

Co-authored-by: Isaac
</commit_message>
<xml_diff>
--- a/KA_Deployment_User_Manual.docx
+++ b/KA_Deployment_User_Manual.docx
@@ -1734,7 +1734,7 @@
         <w:rPr>
           <w:rFonts w:ascii="DM Sans" w:hAnsi="DM Sans" w:cs="DM Sans"/>
         </w:rPr>
-        <w:t xml:space="preserve">variables.yml defines the settings the jobs use. Each variable has a default and can be overridden per environment (dev / staging / prod) in the targets section.</w:t>
+        <w:t xml:space="preserve">variables.yml defines the settings the jobs use. Each variable has a default and can be overridden per environment (dev / staging / prod) in the targets section. The table below mirrors the inline comments in variables.yml.</w:t>
       </w:r>
     </w:p>
     <w:p>
@@ -1763,14 +1763,15 @@
         </w:tblBorders>
       </w:tblPr>
       <w:tblGrid>
-        <w:gridCol w:w="2400"/>
-        <w:gridCol w:w="4400"/>
-        <w:gridCol w:w="2200"/>
+        <w:gridCol w:w="1950"/>
+        <w:gridCol w:w="4350"/>
+        <w:gridCol w:w="1450"/>
+        <w:gridCol w:w="1250"/>
       </w:tblGrid>
       <w:tr>
         <w:tc>
           <w:tcPr>
-            <w:tcW w:w="2400" w:type="dxa"/>
+            <w:tcW w:w="1950" w:type="dxa"/>
             <w:shd w:val="clear" w:color="auto" w:fill="1B3139"/>
             <w:tcMar>
               <w:top w:w="50" w:type="dxa"/>
@@ -1798,7 +1799,7 @@
         </w:tc>
         <w:tc>
           <w:tcPr>
-            <w:tcW w:w="4400" w:type="dxa"/>
+            <w:tcW w:w="4350" w:type="dxa"/>
             <w:shd w:val="clear" w:color="auto" w:fill="1B3139"/>
             <w:tcMar>
               <w:top w:w="50" w:type="dxa"/>
@@ -1826,7 +1827,7 @@
         </w:tc>
         <w:tc>
           <w:tcPr>
-            <w:tcW w:w="2200" w:type="dxa"/>
+            <w:tcW w:w="1450" w:type="dxa"/>
             <w:shd w:val="clear" w:color="auto" w:fill="1B3139"/>
             <w:tcMar>
               <w:top w:w="50" w:type="dxa"/>
@@ -1848,7 +1849,35 @@
                 <w:sz w:val="18"/>
                 <w:szCs w:val="18"/>
               </w:rPr>
-              <w:t xml:space="preserve">Example value</w:t>
+              <w:t xml:space="preserve">Default</w:t>
+            </w:r>
+          </w:p>
+        </w:tc>
+        <w:tc>
+          <w:tcPr>
+            <w:tcW w:w="1250" w:type="dxa"/>
+            <w:shd w:val="clear" w:color="auto" w:fill="1B3139"/>
+            <w:tcMar>
+              <w:top w:w="50" w:type="dxa"/>
+              <w:bottom w:w="50" w:type="dxa"/>
+              <w:left w:w="90" w:type="dxa"/>
+              <w:right w:w="90" w:type="dxa"/>
+            </w:tcMar>
+            <w:vAlign w:val="center"/>
+          </w:tcPr>
+          <w:p>
+            <w:pPr>
+              <w:spacing w:after="20"/>
+            </w:pPr>
+            <w:r>
+              <w:rPr>
+                <w:rFonts w:ascii="DM Sans" w:hAnsi="DM Sans" w:cs="DM Sans"/>
+                <w:b/>
+                <w:color w:val="FFFFFF"/>
+                <w:sz w:val="18"/>
+                <w:szCs w:val="18"/>
+              </w:rPr>
+              <w:t xml:space="preserve">Example</w:t>
             </w:r>
           </w:p>
         </w:tc>
@@ -1856,7 +1885,7 @@
       <w:tr>
         <w:tc>
           <w:tcPr>
-            <w:tcW w:w="2400" w:type="dxa"/>
+            <w:tcW w:w="1950" w:type="dxa"/>
             <w:shd w:val="clear" w:color="auto" w:fill="FFFFFF"/>
             <w:tcMar>
               <w:top w:w="50" w:type="dxa"/>
@@ -1883,33 +1912,60 @@
         </w:tc>
         <w:tc>
           <w:tcPr>
-            <w:tcW w:w="4400" w:type="dxa"/>
-            <w:shd w:val="clear" w:color="auto" w:fill="FFFFFF"/>
-            <w:tcMar>
-              <w:top w:w="50" w:type="dxa"/>
-              <w:bottom w:w="50" w:type="dxa"/>
-              <w:left w:w="90" w:type="dxa"/>
-              <w:right w:w="90" w:type="dxa"/>
-            </w:tcMar>
-            <w:vAlign w:val="center"/>
-          </w:tcPr>
-          <w:p>
-            <w:pPr>
-              <w:spacing w:after="20"/>
-            </w:pPr>
-            <w:r>
-              <w:rPr>
-                <w:rFonts w:ascii="DM Sans" w:hAnsi="DM Sans" w:cs="DM Sans"/>
-                <w:sz w:val="18"/>
-                <w:szCs w:val="18"/>
-              </w:rPr>
-              <w:t xml:space="preserve">Prefix for job names (include trailing underscore).</w:t>
-            </w:r>
-          </w:p>
-        </w:tc>
-        <w:tc>
-          <w:tcPr>
-            <w:tcW w:w="2200" w:type="dxa"/>
+            <w:tcW w:w="4350" w:type="dxa"/>
+            <w:shd w:val="clear" w:color="auto" w:fill="FFFFFF"/>
+            <w:tcMar>
+              <w:top w:w="50" w:type="dxa"/>
+              <w:bottom w:w="50" w:type="dxa"/>
+              <w:left w:w="90" w:type="dxa"/>
+              <w:right w:w="90" w:type="dxa"/>
+            </w:tcMar>
+            <w:vAlign w:val="center"/>
+          </w:tcPr>
+          <w:p>
+            <w:pPr>
+              <w:spacing w:after="20"/>
+            </w:pPr>
+            <w:r>
+              <w:rPr>
+                <w:rFonts w:ascii="DM Sans" w:hAnsi="DM Sans" w:cs="DM Sans"/>
+                <w:sz w:val="18"/>
+                <w:szCs w:val="18"/>
+              </w:rPr>
+              <w:t xml:space="preserve">Prefix added to every job name. Include the trailing underscore yourself (no space is added). Set per environment.</w:t>
+            </w:r>
+          </w:p>
+        </w:tc>
+        <w:tc>
+          <w:tcPr>
+            <w:tcW w:w="1450" w:type="dxa"/>
+            <w:shd w:val="clear" w:color="auto" w:fill="FFFFFF"/>
+            <w:tcMar>
+              <w:top w:w="50" w:type="dxa"/>
+              <w:bottom w:w="50" w:type="dxa"/>
+              <w:left w:w="90" w:type="dxa"/>
+              <w:right w:w="90" w:type="dxa"/>
+            </w:tcMar>
+            <w:vAlign w:val="center"/>
+          </w:tcPr>
+          <w:p>
+            <w:pPr>
+              <w:spacing w:after="20"/>
+            </w:pPr>
+            <w:r>
+              <w:rPr>
+                <w:rFonts w:ascii="Consolas" w:hAnsi="Consolas" w:cs="Consolas"/>
+                <w:color w:val="1B3139"/>
+                <w:sz w:val="18"/>
+                <w:szCs w:val="18"/>
+              </w:rPr>
+              <w:t xml:space="preserve">Dev_</w:t>
+            </w:r>
+          </w:p>
+        </w:tc>
+        <w:tc>
+          <w:tcPr>
+            <w:tcW w:w="1250" w:type="dxa"/>
             <w:shd w:val="clear" w:color="auto" w:fill="FFFFFF"/>
             <w:tcMar>
               <w:top w:w="50" w:type="dxa"/>
@@ -1938,7 +1994,7 @@
       <w:tr>
         <w:tc>
           <w:tcPr>
-            <w:tcW w:w="2400" w:type="dxa"/>
+            <w:tcW w:w="1950" w:type="dxa"/>
             <w:shd w:val="clear" w:color="auto" w:fill="FFFFFF"/>
             <w:tcMar>
               <w:top w:w="50" w:type="dxa"/>
@@ -1965,33 +2021,60 @@
         </w:tc>
         <w:tc>
           <w:tcPr>
-            <w:tcW w:w="4400" w:type="dxa"/>
-            <w:shd w:val="clear" w:color="auto" w:fill="FFFFFF"/>
-            <w:tcMar>
-              <w:top w:w="50" w:type="dxa"/>
-              <w:bottom w:w="50" w:type="dxa"/>
-              <w:left w:w="90" w:type="dxa"/>
-              <w:right w:w="90" w:type="dxa"/>
-            </w:tcMar>
-            <w:vAlign w:val="center"/>
-          </w:tcPr>
-          <w:p>
-            <w:pPr>
-              <w:spacing w:after="20"/>
-            </w:pPr>
-            <w:r>
-              <w:rPr>
-                <w:rFonts w:ascii="DM Sans" w:hAnsi="DM Sans" w:cs="DM Sans"/>
-                <w:sz w:val="18"/>
-                <w:szCs w:val="18"/>
-              </w:rPr>
-              <w:t xml:space="preserve">Default catalog KAs deploy into.</w:t>
-            </w:r>
-          </w:p>
-        </w:tc>
-        <w:tc>
-          <w:tcPr>
-            <w:tcW w:w="2200" w:type="dxa"/>
+            <w:tcW w:w="4350" w:type="dxa"/>
+            <w:shd w:val="clear" w:color="auto" w:fill="FFFFFF"/>
+            <w:tcMar>
+              <w:top w:w="50" w:type="dxa"/>
+              <w:bottom w:w="50" w:type="dxa"/>
+              <w:left w:w="90" w:type="dxa"/>
+              <w:right w:w="90" w:type="dxa"/>
+            </w:tcMar>
+            <w:vAlign w:val="center"/>
+          </w:tcPr>
+          <w:p>
+            <w:pPr>
+              <w:spacing w:after="20"/>
+            </w:pPr>
+            <w:r>
+              <w:rPr>
+                <w:rFonts w:ascii="DM Sans" w:hAnsi="DM Sans" w:cs="DM Sans"/>
+                <w:sz w:val="18"/>
+                <w:szCs w:val="18"/>
+              </w:rPr>
+              <w:t xml:space="preserve">Default catalog KAs deploy into. Overridden per row by the target_catalog column in agents_input.csv when non-empty.</w:t>
+            </w:r>
+          </w:p>
+        </w:tc>
+        <w:tc>
+          <w:tcPr>
+            <w:tcW w:w="1450" w:type="dxa"/>
+            <w:shd w:val="clear" w:color="auto" w:fill="FFFFFF"/>
+            <w:tcMar>
+              <w:top w:w="50" w:type="dxa"/>
+              <w:bottom w:w="50" w:type="dxa"/>
+              <w:left w:w="90" w:type="dxa"/>
+              <w:right w:w="90" w:type="dxa"/>
+            </w:tcMar>
+            <w:vAlign w:val="center"/>
+          </w:tcPr>
+          <w:p>
+            <w:pPr>
+              <w:spacing w:after="20"/>
+            </w:pPr>
+            <w:r>
+              <w:rPr>
+                <w:rFonts w:ascii="Consolas" w:hAnsi="Consolas" w:cs="Consolas"/>
+                <w:color w:val="1B3139"/>
+                <w:sz w:val="18"/>
+                <w:szCs w:val="18"/>
+              </w:rPr>
+              <w:t xml:space="preserve">main</w:t>
+            </w:r>
+          </w:p>
+        </w:tc>
+        <w:tc>
+          <w:tcPr>
+            <w:tcW w:w="1250" w:type="dxa"/>
             <w:shd w:val="clear" w:color="auto" w:fill="FFFFFF"/>
             <w:tcMar>
               <w:top w:w="50" w:type="dxa"/>
@@ -2020,7 +2103,7 @@
       <w:tr>
         <w:tc>
           <w:tcPr>
-            <w:tcW w:w="2400" w:type="dxa"/>
+            <w:tcW w:w="1950" w:type="dxa"/>
             <w:shd w:val="clear" w:color="auto" w:fill="FFFFFF"/>
             <w:tcMar>
               <w:top w:w="50" w:type="dxa"/>
@@ -2047,33 +2130,60 @@
         </w:tc>
         <w:tc>
           <w:tcPr>
-            <w:tcW w:w="4400" w:type="dxa"/>
-            <w:shd w:val="clear" w:color="auto" w:fill="FFFFFF"/>
-            <w:tcMar>
-              <w:top w:w="50" w:type="dxa"/>
-              <w:bottom w:w="50" w:type="dxa"/>
-              <w:left w:w="90" w:type="dxa"/>
-              <w:right w:w="90" w:type="dxa"/>
-            </w:tcMar>
-            <w:vAlign w:val="center"/>
-          </w:tcPr>
-          <w:p>
-            <w:pPr>
-              <w:spacing w:after="20"/>
-            </w:pPr>
-            <w:r>
-              <w:rPr>
-                <w:rFonts w:ascii="DM Sans" w:hAnsi="DM Sans" w:cs="DM Sans"/>
-                <w:sz w:val="18"/>
-                <w:szCs w:val="18"/>
-              </w:rPr>
-              <w:t xml:space="preserve">Default schema KAs deploy into.</w:t>
-            </w:r>
-          </w:p>
-        </w:tc>
-        <w:tc>
-          <w:tcPr>
-            <w:tcW w:w="2200" w:type="dxa"/>
+            <w:tcW w:w="4350" w:type="dxa"/>
+            <w:shd w:val="clear" w:color="auto" w:fill="FFFFFF"/>
+            <w:tcMar>
+              <w:top w:w="50" w:type="dxa"/>
+              <w:bottom w:w="50" w:type="dxa"/>
+              <w:left w:w="90" w:type="dxa"/>
+              <w:right w:w="90" w:type="dxa"/>
+            </w:tcMar>
+            <w:vAlign w:val="center"/>
+          </w:tcPr>
+          <w:p>
+            <w:pPr>
+              <w:spacing w:after="20"/>
+            </w:pPr>
+            <w:r>
+              <w:rPr>
+                <w:rFonts w:ascii="DM Sans" w:hAnsi="DM Sans" w:cs="DM Sans"/>
+                <w:sz w:val="18"/>
+                <w:szCs w:val="18"/>
+              </w:rPr>
+              <w:t xml:space="preserve">Default schema KAs deploy into. Overridden per row by the target_schema column in agents_input.csv when non-empty.</w:t>
+            </w:r>
+          </w:p>
+        </w:tc>
+        <w:tc>
+          <w:tcPr>
+            <w:tcW w:w="1450" w:type="dxa"/>
+            <w:shd w:val="clear" w:color="auto" w:fill="FFFFFF"/>
+            <w:tcMar>
+              <w:top w:w="50" w:type="dxa"/>
+              <w:bottom w:w="50" w:type="dxa"/>
+              <w:left w:w="90" w:type="dxa"/>
+              <w:right w:w="90" w:type="dxa"/>
+            </w:tcMar>
+            <w:vAlign w:val="center"/>
+          </w:tcPr>
+          <w:p>
+            <w:pPr>
+              <w:spacing w:after="20"/>
+            </w:pPr>
+            <w:r>
+              <w:rPr>
+                <w:rFonts w:ascii="Consolas" w:hAnsi="Consolas" w:cs="Consolas"/>
+                <w:color w:val="1B3139"/>
+                <w:sz w:val="18"/>
+                <w:szCs w:val="18"/>
+              </w:rPr>
+              <w:t xml:space="preserve">default</w:t>
+            </w:r>
+          </w:p>
+        </w:tc>
+        <w:tc>
+          <w:tcPr>
+            <w:tcW w:w="1250" w:type="dxa"/>
             <w:shd w:val="clear" w:color="auto" w:fill="FFFFFF"/>
             <w:tcMar>
               <w:top w:w="50" w:type="dxa"/>
@@ -2102,7 +2212,7 @@
       <w:tr>
         <w:tc>
           <w:tcPr>
-            <w:tcW w:w="2400" w:type="dxa"/>
+            <w:tcW w:w="1950" w:type="dxa"/>
             <w:shd w:val="clear" w:color="auto" w:fill="FFFFFF"/>
             <w:tcMar>
               <w:top w:w="50" w:type="dxa"/>
@@ -2129,33 +2239,59 @@
         </w:tc>
         <w:tc>
           <w:tcPr>
-            <w:tcW w:w="4400" w:type="dxa"/>
-            <w:shd w:val="clear" w:color="auto" w:fill="FFFFFF"/>
-            <w:tcMar>
-              <w:top w:w="50" w:type="dxa"/>
-              <w:bottom w:w="50" w:type="dxa"/>
-              <w:left w:w="90" w:type="dxa"/>
-              <w:right w:w="90" w:type="dxa"/>
-            </w:tcMar>
-            <w:vAlign w:val="center"/>
-          </w:tcPr>
-          <w:p>
-            <w:pPr>
-              <w:spacing w:after="20"/>
-            </w:pPr>
-            <w:r>
-              <w:rPr>
-                <w:rFonts w:ascii="DM Sans" w:hAnsi="DM Sans" w:cs="DM Sans"/>
-                <w:sz w:val="18"/>
-                <w:szCs w:val="18"/>
-              </w:rPr>
-              <w:t xml:space="preserve">Deploy status table (blank = {catalog}.{schema}.ka_deployment_status).</w:t>
-            </w:r>
-          </w:p>
-        </w:tc>
-        <w:tc>
-          <w:tcPr>
-            <w:tcW w:w="2200" w:type="dxa"/>
+            <w:tcW w:w="4350" w:type="dxa"/>
+            <w:shd w:val="clear" w:color="auto" w:fill="FFFFFF"/>
+            <w:tcMar>
+              <w:top w:w="50" w:type="dxa"/>
+              <w:bottom w:w="50" w:type="dxa"/>
+              <w:left w:w="90" w:type="dxa"/>
+              <w:right w:w="90" w:type="dxa"/>
+            </w:tcMar>
+            <w:vAlign w:val="center"/>
+          </w:tcPr>
+          <w:p>
+            <w:pPr>
+              <w:spacing w:after="20"/>
+            </w:pPr>
+            <w:r>
+              <w:rPr>
+                <w:rFonts w:ascii="DM Sans" w:hAnsi="DM Sans" w:cs="DM Sans"/>
+                <w:sz w:val="18"/>
+                <w:szCs w:val="18"/>
+              </w:rPr>
+              <w:t xml:space="preserve">Fully-qualified Delta status table. Blank uses the convention {catalog}.{schema}.ka_deployment_status.</w:t>
+            </w:r>
+          </w:p>
+        </w:tc>
+        <w:tc>
+          <w:tcPr>
+            <w:tcW w:w="1450" w:type="dxa"/>
+            <w:shd w:val="clear" w:color="auto" w:fill="FFFFFF"/>
+            <w:tcMar>
+              <w:top w:w="50" w:type="dxa"/>
+              <w:bottom w:w="50" w:type="dxa"/>
+              <w:left w:w="90" w:type="dxa"/>
+              <w:right w:w="90" w:type="dxa"/>
+            </w:tcMar>
+            <w:vAlign w:val="center"/>
+          </w:tcPr>
+          <w:p>
+            <w:pPr>
+              <w:spacing w:after="20"/>
+            </w:pPr>
+            <w:r>
+              <w:rPr>
+                <w:rFonts w:ascii="DM Sans" w:hAnsi="DM Sans" w:cs="DM Sans"/>
+                <w:sz w:val="18"/>
+                <w:szCs w:val="18"/>
+              </w:rPr>
+              <w:t xml:space="preserve">(blank)</w:t>
+            </w:r>
+          </w:p>
+        </w:tc>
+        <w:tc>
+          <w:tcPr>
+            <w:tcW w:w="1250" w:type="dxa"/>
             <w:shd w:val="clear" w:color="auto" w:fill="FFFFFF"/>
             <w:tcMar>
               <w:top w:w="50" w:type="dxa"/>
@@ -2184,7 +2320,7 @@
       <w:tr>
         <w:tc>
           <w:tcPr>
-            <w:tcW w:w="2400" w:type="dxa"/>
+            <w:tcW w:w="1950" w:type="dxa"/>
             <w:shd w:val="clear" w:color="auto" w:fill="FFFFFF"/>
             <w:tcMar>
               <w:top w:w="50" w:type="dxa"/>
@@ -2211,54 +2347,80 @@
         </w:tc>
         <w:tc>
           <w:tcPr>
-            <w:tcW w:w="4400" w:type="dxa"/>
-            <w:shd w:val="clear" w:color="auto" w:fill="FFFFFF"/>
-            <w:tcMar>
-              <w:top w:w="50" w:type="dxa"/>
-              <w:bottom w:w="50" w:type="dxa"/>
-              <w:left w:w="90" w:type="dxa"/>
-              <w:right w:w="90" w:type="dxa"/>
-            </w:tcMar>
-            <w:vAlign w:val="center"/>
-          </w:tcPr>
-          <w:p>
-            <w:pPr>
-              <w:spacing w:after="20"/>
-            </w:pPr>
-            <w:r>
-              <w:rPr>
-                <w:rFonts w:ascii="DM Sans" w:hAnsi="DM Sans" w:cs="DM Sans"/>
-                <w:sz w:val="18"/>
-                <w:szCs w:val="18"/>
-              </w:rPr>
-              <w:t xml:space="preserve">Source workspace URL to export from.</w:t>
-            </w:r>
-          </w:p>
-        </w:tc>
-        <w:tc>
-          <w:tcPr>
-            <w:tcW w:w="2200" w:type="dxa"/>
-            <w:shd w:val="clear" w:color="auto" w:fill="FFFFFF"/>
-            <w:tcMar>
-              <w:top w:w="50" w:type="dxa"/>
-              <w:bottom w:w="50" w:type="dxa"/>
-              <w:left w:w="90" w:type="dxa"/>
-              <w:right w:w="90" w:type="dxa"/>
-            </w:tcMar>
-            <w:vAlign w:val="center"/>
-          </w:tcPr>
-          <w:p>
-            <w:pPr>
-              <w:spacing w:after="20"/>
-            </w:pPr>
-            <w:r>
-              <w:rPr>
-                <w:rFonts w:ascii="Consolas" w:hAnsi="Consolas" w:cs="Consolas"/>
-                <w:color w:val="1B3139"/>
-                <w:sz w:val="18"/>
-                <w:szCs w:val="18"/>
-              </w:rPr>
-              <w:t xml:space="preserve">https://adb-7405617211688462.2.azuredatabricks.net</w:t>
+            <w:tcW w:w="4350" w:type="dxa"/>
+            <w:shd w:val="clear" w:color="auto" w:fill="FFFFFF"/>
+            <w:tcMar>
+              <w:top w:w="50" w:type="dxa"/>
+              <w:bottom w:w="50" w:type="dxa"/>
+              <w:left w:w="90" w:type="dxa"/>
+              <w:right w:w="90" w:type="dxa"/>
+            </w:tcMar>
+            <w:vAlign w:val="center"/>
+          </w:tcPr>
+          <w:p>
+            <w:pPr>
+              <w:spacing w:after="20"/>
+            </w:pPr>
+            <w:r>
+              <w:rPr>
+                <w:rFonts w:ascii="DM Sans" w:hAnsi="DM Sans" w:cs="DM Sans"/>
+                <w:sz w:val="18"/>
+                <w:szCs w:val="18"/>
+              </w:rPr>
+              <w:t xml:space="preserve">Source workspace to export KAs FROM (full https URL). Blank = export from the same workspace.</w:t>
+            </w:r>
+          </w:p>
+        </w:tc>
+        <w:tc>
+          <w:tcPr>
+            <w:tcW w:w="1450" w:type="dxa"/>
+            <w:shd w:val="clear" w:color="auto" w:fill="FFFFFF"/>
+            <w:tcMar>
+              <w:top w:w="50" w:type="dxa"/>
+              <w:bottom w:w="50" w:type="dxa"/>
+              <w:left w:w="90" w:type="dxa"/>
+              <w:right w:w="90" w:type="dxa"/>
+            </w:tcMar>
+            <w:vAlign w:val="center"/>
+          </w:tcPr>
+          <w:p>
+            <w:pPr>
+              <w:spacing w:after="20"/>
+            </w:pPr>
+            <w:r>
+              <w:rPr>
+                <w:rFonts w:ascii="DM Sans" w:hAnsi="DM Sans" w:cs="DM Sans"/>
+                <w:sz w:val="18"/>
+                <w:szCs w:val="18"/>
+              </w:rPr>
+              <w:t xml:space="preserve">(set)</w:t>
+            </w:r>
+          </w:p>
+        </w:tc>
+        <w:tc>
+          <w:tcPr>
+            <w:tcW w:w="1250" w:type="dxa"/>
+            <w:shd w:val="clear" w:color="auto" w:fill="FFFFFF"/>
+            <w:tcMar>
+              <w:top w:w="50" w:type="dxa"/>
+              <w:bottom w:w="50" w:type="dxa"/>
+              <w:left w:w="90" w:type="dxa"/>
+              <w:right w:w="90" w:type="dxa"/>
+            </w:tcMar>
+            <w:vAlign w:val="center"/>
+          </w:tcPr>
+          <w:p>
+            <w:pPr>
+              <w:spacing w:after="20"/>
+            </w:pPr>
+            <w:r>
+              <w:rPr>
+                <w:rFonts w:ascii="Consolas" w:hAnsi="Consolas" w:cs="Consolas"/>
+                <w:color w:val="1B3139"/>
+                <w:sz w:val="18"/>
+                <w:szCs w:val="18"/>
+              </w:rPr>
+              <w:t xml:space="preserve">https://adb-xxxx.7.azuredatabricks.net</w:t>
             </w:r>
           </w:p>
         </w:tc>
@@ -2266,7 +2428,7 @@
       <w:tr>
         <w:tc>
           <w:tcPr>
-            <w:tcW w:w="2400" w:type="dxa"/>
+            <w:tcW w:w="1950" w:type="dxa"/>
             <w:shd w:val="clear" w:color="auto" w:fill="FFFFFF"/>
             <w:tcMar>
               <w:top w:w="50" w:type="dxa"/>
@@ -2293,33 +2455,60 @@
         </w:tc>
         <w:tc>
           <w:tcPr>
-            <w:tcW w:w="4400" w:type="dxa"/>
-            <w:shd w:val="clear" w:color="auto" w:fill="FFFFFF"/>
-            <w:tcMar>
-              <w:top w:w="50" w:type="dxa"/>
-              <w:bottom w:w="50" w:type="dxa"/>
-              <w:left w:w="90" w:type="dxa"/>
-              <w:right w:w="90" w:type="dxa"/>
-            </w:tcMar>
-            <w:vAlign w:val="center"/>
-          </w:tcPr>
-          <w:p>
-            <w:pPr>
-              <w:spacing w:after="20"/>
-            </w:pPr>
-            <w:r>
-              <w:rPr>
-                <w:rFonts w:ascii="DM Sans" w:hAnsi="DM Sans" w:cs="DM Sans"/>
-                <w:sz w:val="18"/>
-                <w:szCs w:val="18"/>
-              </w:rPr>
-              <w:t xml:space="preserve">Secret scope holding source credentials.</w:t>
-            </w:r>
-          </w:p>
-        </w:tc>
-        <w:tc>
-          <w:tcPr>
-            <w:tcW w:w="2200" w:type="dxa"/>
+            <w:tcW w:w="4350" w:type="dxa"/>
+            <w:shd w:val="clear" w:color="auto" w:fill="FFFFFF"/>
+            <w:tcMar>
+              <w:top w:w="50" w:type="dxa"/>
+              <w:bottom w:w="50" w:type="dxa"/>
+              <w:left w:w="90" w:type="dxa"/>
+              <w:right w:w="90" w:type="dxa"/>
+            </w:tcMar>
+            <w:vAlign w:val="center"/>
+          </w:tcPr>
+          <w:p>
+            <w:pPr>
+              <w:spacing w:after="20"/>
+            </w:pPr>
+            <w:r>
+              <w:rPr>
+                <w:rFonts w:ascii="DM Sans" w:hAnsi="DM Sans" w:cs="DM Sans"/>
+                <w:sz w:val="18"/>
+                <w:szCs w:val="18"/>
+              </w:rPr>
+              <w:t xml:space="preserve">Secret scope holding SOURCE credentials. Keys: source-token, source-client-id, source-client-secret.</w:t>
+            </w:r>
+          </w:p>
+        </w:tc>
+        <w:tc>
+          <w:tcPr>
+            <w:tcW w:w="1450" w:type="dxa"/>
+            <w:shd w:val="clear" w:color="auto" w:fill="FFFFFF"/>
+            <w:tcMar>
+              <w:top w:w="50" w:type="dxa"/>
+              <w:bottom w:w="50" w:type="dxa"/>
+              <w:left w:w="90" w:type="dxa"/>
+              <w:right w:w="90" w:type="dxa"/>
+            </w:tcMar>
+            <w:vAlign w:val="center"/>
+          </w:tcPr>
+          <w:p>
+            <w:pPr>
+              <w:spacing w:after="20"/>
+            </w:pPr>
+            <w:r>
+              <w:rPr>
+                <w:rFonts w:ascii="Consolas" w:hAnsi="Consolas" w:cs="Consolas"/>
+                <w:color w:val="1B3139"/>
+                <w:sz w:val="18"/>
+                <w:szCs w:val="18"/>
+              </w:rPr>
+              <w:t xml:space="preserve">ka-deployment</w:t>
+            </w:r>
+          </w:p>
+        </w:tc>
+        <w:tc>
+          <w:tcPr>
+            <w:tcW w:w="1250" w:type="dxa"/>
             <w:shd w:val="clear" w:color="auto" w:fill="FFFFFF"/>
             <w:tcMar>
               <w:top w:w="50" w:type="dxa"/>
@@ -2348,7 +2537,7 @@
       <w:tr>
         <w:tc>
           <w:tcPr>
-            <w:tcW w:w="2400" w:type="dxa"/>
+            <w:tcW w:w="1950" w:type="dxa"/>
             <w:shd w:val="clear" w:color="auto" w:fill="FFFFFF"/>
             <w:tcMar>
               <w:top w:w="50" w:type="dxa"/>
@@ -2375,33 +2564,59 @@
         </w:tc>
         <w:tc>
           <w:tcPr>
-            <w:tcW w:w="4400" w:type="dxa"/>
-            <w:shd w:val="clear" w:color="auto" w:fill="FFFFFF"/>
-            <w:tcMar>
-              <w:top w:w="50" w:type="dxa"/>
-              <w:bottom w:w="50" w:type="dxa"/>
-              <w:left w:w="90" w:type="dxa"/>
-              <w:right w:w="90" w:type="dxa"/>
-            </w:tcMar>
-            <w:vAlign w:val="center"/>
-          </w:tcPr>
-          <w:p>
-            <w:pPr>
-              <w:spacing w:after="20"/>
-            </w:pPr>
-            <w:r>
-              <w:rPr>
-                <w:rFonts w:ascii="DM Sans" w:hAnsi="DM Sans" w:cs="DM Sans"/>
-                <w:sz w:val="18"/>
-                <w:szCs w:val="18"/>
-              </w:rPr>
-              <w:t xml:space="preserve">Serverless usage policy ID for the jobs.</w:t>
-            </w:r>
-          </w:p>
-        </w:tc>
-        <w:tc>
-          <w:tcPr>
-            <w:tcW w:w="2200" w:type="dxa"/>
+            <w:tcW w:w="4350" w:type="dxa"/>
+            <w:shd w:val="clear" w:color="auto" w:fill="FFFFFF"/>
+            <w:tcMar>
+              <w:top w:w="50" w:type="dxa"/>
+              <w:bottom w:w="50" w:type="dxa"/>
+              <w:left w:w="90" w:type="dxa"/>
+              <w:right w:w="90" w:type="dxa"/>
+            </w:tcMar>
+            <w:vAlign w:val="center"/>
+          </w:tcPr>
+          <w:p>
+            <w:pPr>
+              <w:spacing w:after="20"/>
+            </w:pPr>
+            <w:r>
+              <w:rPr>
+                <w:rFonts w:ascii="DM Sans" w:hAnsi="DM Sans" w:cs="DM Sans"/>
+                <w:sz w:val="18"/>
+                <w:szCs w:val="18"/>
+              </w:rPr>
+              <w:t xml:space="preserve">Serverless usage policy ID attached to the jobs. Blank = workspace default. List IDs: databricks budget-policies list.</w:t>
+            </w:r>
+          </w:p>
+        </w:tc>
+        <w:tc>
+          <w:tcPr>
+            <w:tcW w:w="1450" w:type="dxa"/>
+            <w:shd w:val="clear" w:color="auto" w:fill="FFFFFF"/>
+            <w:tcMar>
+              <w:top w:w="50" w:type="dxa"/>
+              <w:bottom w:w="50" w:type="dxa"/>
+              <w:left w:w="90" w:type="dxa"/>
+              <w:right w:w="90" w:type="dxa"/>
+            </w:tcMar>
+            <w:vAlign w:val="center"/>
+          </w:tcPr>
+          <w:p>
+            <w:pPr>
+              <w:spacing w:after="20"/>
+            </w:pPr>
+            <w:r>
+              <w:rPr>
+                <w:rFonts w:ascii="DM Sans" w:hAnsi="DM Sans" w:cs="DM Sans"/>
+                <w:sz w:val="18"/>
+                <w:szCs w:val="18"/>
+              </w:rPr>
+              <w:t xml:space="preserve">(set)</w:t>
+            </w:r>
+          </w:p>
+        </w:tc>
+        <w:tc>
+          <w:tcPr>
+            <w:tcW w:w="1250" w:type="dxa"/>
             <w:shd w:val="clear" w:color="auto" w:fill="FFFFFF"/>
             <w:tcMar>
               <w:top w:w="50" w:type="dxa"/>
@@ -2430,7 +2645,7 @@
       <w:tr>
         <w:tc>
           <w:tcPr>
-            <w:tcW w:w="2400" w:type="dxa"/>
+            <w:tcW w:w="1950" w:type="dxa"/>
             <w:shd w:val="clear" w:color="auto" w:fill="FFFFFF"/>
             <w:tcMar>
               <w:top w:w="50" w:type="dxa"/>
@@ -2457,33 +2672,60 @@
         </w:tc>
         <w:tc>
           <w:tcPr>
-            <w:tcW w:w="4400" w:type="dxa"/>
-            <w:shd w:val="clear" w:color="auto" w:fill="FFFFFF"/>
-            <w:tcMar>
-              <w:top w:w="50" w:type="dxa"/>
-              <w:bottom w:w="50" w:type="dxa"/>
-              <w:left w:w="90" w:type="dxa"/>
-              <w:right w:w="90" w:type="dxa"/>
-            </w:tcMar>
-            <w:vAlign w:val="center"/>
-          </w:tcPr>
-          <w:p>
-            <w:pPr>
-              <w:spacing w:after="20"/>
-            </w:pPr>
-            <w:r>
-              <w:rPr>
-                <w:rFonts w:ascii="DM Sans" w:hAnsi="DM Sans" w:cs="DM Sans"/>
-                <w:sz w:val="18"/>
-                <w:szCs w:val="18"/>
-              </w:rPr>
-              <w:t xml:space="preserve">true = copy examples inline; false = defer to copy job.</w:t>
-            </w:r>
-          </w:p>
-        </w:tc>
-        <w:tc>
-          <w:tcPr>
-            <w:tcW w:w="2200" w:type="dxa"/>
+            <w:tcW w:w="4350" w:type="dxa"/>
+            <w:shd w:val="clear" w:color="auto" w:fill="FFFFFF"/>
+            <w:tcMar>
+              <w:top w:w="50" w:type="dxa"/>
+              <w:bottom w:w="50" w:type="dxa"/>
+              <w:left w:w="90" w:type="dxa"/>
+              <w:right w:w="90" w:type="dxa"/>
+            </w:tcMar>
+            <w:vAlign w:val="center"/>
+          </w:tcPr>
+          <w:p>
+            <w:pPr>
+              <w:spacing w:after="20"/>
+            </w:pPr>
+            <w:r>
+              <w:rPr>
+                <w:rFonts w:ascii="DM Sans" w:hAnsi="DM Sans" w:cs="DM Sans"/>
+                <w:sz w:val="18"/>
+                <w:szCs w:val="18"/>
+              </w:rPr>
+              <w:t xml:space="preserve">true = deploy job waits for ACTIVE and copies examples inline. false = defer to the Copy KA Examples job.</w:t>
+            </w:r>
+          </w:p>
+        </w:tc>
+        <w:tc>
+          <w:tcPr>
+            <w:tcW w:w="1450" w:type="dxa"/>
+            <w:shd w:val="clear" w:color="auto" w:fill="FFFFFF"/>
+            <w:tcMar>
+              <w:top w:w="50" w:type="dxa"/>
+              <w:bottom w:w="50" w:type="dxa"/>
+              <w:left w:w="90" w:type="dxa"/>
+              <w:right w:w="90" w:type="dxa"/>
+            </w:tcMar>
+            <w:vAlign w:val="center"/>
+          </w:tcPr>
+          <w:p>
+            <w:pPr>
+              <w:spacing w:after="20"/>
+            </w:pPr>
+            <w:r>
+              <w:rPr>
+                <w:rFonts w:ascii="Consolas" w:hAnsi="Consolas" w:cs="Consolas"/>
+                <w:color w:val="1B3139"/>
+                <w:sz w:val="18"/>
+                <w:szCs w:val="18"/>
+              </w:rPr>
+              <w:t xml:space="preserve">true</w:t>
+            </w:r>
+          </w:p>
+        </w:tc>
+        <w:tc>
+          <w:tcPr>
+            <w:tcW w:w="1250" w:type="dxa"/>
             <w:shd w:val="clear" w:color="auto" w:fill="FFFFFF"/>
             <w:tcMar>
               <w:top w:w="50" w:type="dxa"/>
@@ -2512,7 +2754,7 @@
       <w:tr>
         <w:tc>
           <w:tcPr>
-            <w:tcW w:w="2400" w:type="dxa"/>
+            <w:tcW w:w="1950" w:type="dxa"/>
             <w:shd w:val="clear" w:color="auto" w:fill="FFFFFF"/>
             <w:tcMar>
               <w:top w:w="50" w:type="dxa"/>
@@ -2539,33 +2781,60 @@
         </w:tc>
         <w:tc>
           <w:tcPr>
-            <w:tcW w:w="4400" w:type="dxa"/>
-            <w:shd w:val="clear" w:color="auto" w:fill="FFFFFF"/>
-            <w:tcMar>
-              <w:top w:w="50" w:type="dxa"/>
-              <w:bottom w:w="50" w:type="dxa"/>
-              <w:left w:w="90" w:type="dxa"/>
-              <w:right w:w="90" w:type="dxa"/>
-            </w:tcMar>
-            <w:vAlign w:val="center"/>
-          </w:tcPr>
-          <w:p>
-            <w:pPr>
-              <w:spacing w:after="20"/>
-            </w:pPr>
-            <w:r>
-              <w:rPr>
-                <w:rFonts w:ascii="DM Sans" w:hAnsi="DM Sans" w:cs="DM Sans"/>
-                <w:sz w:val="18"/>
-                <w:szCs w:val="18"/>
-              </w:rPr>
-              <w:t xml:space="preserve">Max minutes to wait per KA for ACTIVE (inline copy).</w:t>
-            </w:r>
-          </w:p>
-        </w:tc>
-        <w:tc>
-          <w:tcPr>
-            <w:tcW w:w="2200" w:type="dxa"/>
+            <w:tcW w:w="4350" w:type="dxa"/>
+            <w:shd w:val="clear" w:color="auto" w:fill="FFFFFF"/>
+            <w:tcMar>
+              <w:top w:w="50" w:type="dxa"/>
+              <w:bottom w:w="50" w:type="dxa"/>
+              <w:left w:w="90" w:type="dxa"/>
+              <w:right w:w="90" w:type="dxa"/>
+            </w:tcMar>
+            <w:vAlign w:val="center"/>
+          </w:tcPr>
+          <w:p>
+            <w:pPr>
+              <w:spacing w:after="20"/>
+            </w:pPr>
+            <w:r>
+              <w:rPr>
+                <w:rFonts w:ascii="DM Sans" w:hAnsi="DM Sans" w:cs="DM Sans"/>
+                <w:sz w:val="18"/>
+                <w:szCs w:val="18"/>
+              </w:rPr>
+              <w:t xml:space="preserve">Used when wait_and_copy_examples=true. Max MINUTES to poll each KA for ACTIVE before copying. A per-KA ceiling, not an added delay for every KA (KAs provision in parallel).</w:t>
+            </w:r>
+          </w:p>
+        </w:tc>
+        <w:tc>
+          <w:tcPr>
+            <w:tcW w:w="1450" w:type="dxa"/>
+            <w:shd w:val="clear" w:color="auto" w:fill="FFFFFF"/>
+            <w:tcMar>
+              <w:top w:w="50" w:type="dxa"/>
+              <w:bottom w:w="50" w:type="dxa"/>
+              <w:left w:w="90" w:type="dxa"/>
+              <w:right w:w="90" w:type="dxa"/>
+            </w:tcMar>
+            <w:vAlign w:val="center"/>
+          </w:tcPr>
+          <w:p>
+            <w:pPr>
+              <w:spacing w:after="20"/>
+            </w:pPr>
+            <w:r>
+              <w:rPr>
+                <w:rFonts w:ascii="Consolas" w:hAnsi="Consolas" w:cs="Consolas"/>
+                <w:color w:val="1B3139"/>
+                <w:sz w:val="18"/>
+                <w:szCs w:val="18"/>
+              </w:rPr>
+              <w:t xml:space="preserve">40</w:t>
+            </w:r>
+          </w:p>
+        </w:tc>
+        <w:tc>
+          <w:tcPr>
+            <w:tcW w:w="1250" w:type="dxa"/>
             <w:shd w:val="clear" w:color="auto" w:fill="FFFFFF"/>
             <w:tcMar>
               <w:top w:w="50" w:type="dxa"/>
@@ -2594,7 +2863,7 @@
       <w:tr>
         <w:tc>
           <w:tcPr>
-            <w:tcW w:w="2400" w:type="dxa"/>
+            <w:tcW w:w="1950" w:type="dxa"/>
             <w:shd w:val="clear" w:color="auto" w:fill="FFFFFF"/>
             <w:tcMar>
               <w:top w:w="50" w:type="dxa"/>
@@ -2621,33 +2890,60 @@
         </w:tc>
         <w:tc>
           <w:tcPr>
-            <w:tcW w:w="4400" w:type="dxa"/>
-            <w:shd w:val="clear" w:color="auto" w:fill="FFFFFF"/>
-            <w:tcMar>
-              <w:top w:w="50" w:type="dxa"/>
-              <w:bottom w:w="50" w:type="dxa"/>
-              <w:left w:w="90" w:type="dxa"/>
-              <w:right w:w="90" w:type="dxa"/>
-            </w:tcMar>
-            <w:vAlign w:val="center"/>
-          </w:tcPr>
-          <w:p>
-            <w:pPr>
-              <w:spacing w:after="20"/>
-            </w:pPr>
-            <w:r>
-              <w:rPr>
-                <w:rFonts w:ascii="DM Sans" w:hAnsi="DM Sans" w:cs="DM Sans"/>
-                <w:sz w:val="18"/>
-                <w:szCs w:val="18"/>
-              </w:rPr>
-              <w:t xml:space="preserve">Max minutes the copy job polls per KA for ACTIVE.</w:t>
-            </w:r>
-          </w:p>
-        </w:tc>
-        <w:tc>
-          <w:tcPr>
-            <w:tcW w:w="2200" w:type="dxa"/>
+            <w:tcW w:w="4350" w:type="dxa"/>
+            <w:shd w:val="clear" w:color="auto" w:fill="FFFFFF"/>
+            <w:tcMar>
+              <w:top w:w="50" w:type="dxa"/>
+              <w:bottom w:w="50" w:type="dxa"/>
+              <w:left w:w="90" w:type="dxa"/>
+              <w:right w:w="90" w:type="dxa"/>
+            </w:tcMar>
+            <w:vAlign w:val="center"/>
+          </w:tcPr>
+          <w:p>
+            <w:pPr>
+              <w:spacing w:after="20"/>
+            </w:pPr>
+            <w:r>
+              <w:rPr>
+                <w:rFonts w:ascii="DM Sans" w:hAnsi="DM Sans" w:cs="DM Sans"/>
+                <w:sz w:val="18"/>
+                <w:szCs w:val="18"/>
+              </w:rPr>
+              <w:t xml:space="preserve">Max MINUTES the Copy KA Examples job polls each KA for ACTIVE before skipping it. A skipped KA stays Pending and is retried next run.</w:t>
+            </w:r>
+          </w:p>
+        </w:tc>
+        <w:tc>
+          <w:tcPr>
+            <w:tcW w:w="1450" w:type="dxa"/>
+            <w:shd w:val="clear" w:color="auto" w:fill="FFFFFF"/>
+            <w:tcMar>
+              <w:top w:w="50" w:type="dxa"/>
+              <w:bottom w:w="50" w:type="dxa"/>
+              <w:left w:w="90" w:type="dxa"/>
+              <w:right w:w="90" w:type="dxa"/>
+            </w:tcMar>
+            <w:vAlign w:val="center"/>
+          </w:tcPr>
+          <w:p>
+            <w:pPr>
+              <w:spacing w:after="20"/>
+            </w:pPr>
+            <w:r>
+              <w:rPr>
+                <w:rFonts w:ascii="Consolas" w:hAnsi="Consolas" w:cs="Consolas"/>
+                <w:color w:val="1B3139"/>
+                <w:sz w:val="18"/>
+                <w:szCs w:val="18"/>
+              </w:rPr>
+              <w:t xml:space="preserve">3</w:t>
+            </w:r>
+          </w:p>
+        </w:tc>
+        <w:tc>
+          <w:tcPr>
+            <w:tcW w:w="1250" w:type="dxa"/>
             <w:shd w:val="clear" w:color="auto" w:fill="FFFFFF"/>
             <w:tcMar>
               <w:top w:w="50" w:type="dxa"/>
@@ -2676,7 +2972,7 @@
       <w:tr>
         <w:tc>
           <w:tcPr>
-            <w:tcW w:w="2400" w:type="dxa"/>
+            <w:tcW w:w="1950" w:type="dxa"/>
             <w:shd w:val="clear" w:color="auto" w:fill="FFFFFF"/>
             <w:tcMar>
               <w:top w:w="50" w:type="dxa"/>
@@ -2703,33 +2999,59 @@
         </w:tc>
         <w:tc>
           <w:tcPr>
-            <w:tcW w:w="4400" w:type="dxa"/>
-            <w:shd w:val="clear" w:color="auto" w:fill="FFFFFF"/>
-            <w:tcMar>
-              <w:top w:w="50" w:type="dxa"/>
-              <w:bottom w:w="50" w:type="dxa"/>
-              <w:left w:w="90" w:type="dxa"/>
-              <w:right w:w="90" w:type="dxa"/>
-            </w:tcMar>
-            <w:vAlign w:val="center"/>
-          </w:tcPr>
-          <w:p>
-            <w:pPr>
-              <w:spacing w:after="20"/>
-            </w:pPr>
-            <w:r>
-              <w:rPr>
-                <w:rFonts w:ascii="DM Sans" w:hAnsi="DM Sans" w:cs="DM Sans"/>
-                <w:sz w:val="18"/>
-                <w:szCs w:val="18"/>
-              </w:rPr>
-              <w:t xml:space="preserve">Copy job: only rows completed after this (blank = all pending).</w:t>
-            </w:r>
-          </w:p>
-        </w:tc>
-        <w:tc>
-          <w:tcPr>
-            <w:tcW w:w="2200" w:type="dxa"/>
+            <w:tcW w:w="4350" w:type="dxa"/>
+            <w:shd w:val="clear" w:color="auto" w:fill="FFFFFF"/>
+            <w:tcMar>
+              <w:top w:w="50" w:type="dxa"/>
+              <w:bottom w:w="50" w:type="dxa"/>
+              <w:left w:w="90" w:type="dxa"/>
+              <w:right w:w="90" w:type="dxa"/>
+            </w:tcMar>
+            <w:vAlign w:val="center"/>
+          </w:tcPr>
+          <w:p>
+            <w:pPr>
+              <w:spacing w:after="20"/>
+            </w:pPr>
+            <w:r>
+              <w:rPr>
+                <w:rFonts w:ascii="DM Sans" w:hAnsi="DM Sans" w:cs="DM Sans"/>
+                <w:sz w:val="18"/>
+                <w:szCs w:val="18"/>
+              </w:rPr>
+              <w:t xml:space="preserve">Copy job filter. Set = only rows with completed_at newer than this (all runs). Blank = ALL rows still pending copy. Format YYYY-MM-DDTHH:MM:SS.</w:t>
+            </w:r>
+          </w:p>
+        </w:tc>
+        <w:tc>
+          <w:tcPr>
+            <w:tcW w:w="1450" w:type="dxa"/>
+            <w:shd w:val="clear" w:color="auto" w:fill="FFFFFF"/>
+            <w:tcMar>
+              <w:top w:w="50" w:type="dxa"/>
+              <w:bottom w:w="50" w:type="dxa"/>
+              <w:left w:w="90" w:type="dxa"/>
+              <w:right w:w="90" w:type="dxa"/>
+            </w:tcMar>
+            <w:vAlign w:val="center"/>
+          </w:tcPr>
+          <w:p>
+            <w:pPr>
+              <w:spacing w:after="20"/>
+            </w:pPr>
+            <w:r>
+              <w:rPr>
+                <w:rFonts w:ascii="DM Sans" w:hAnsi="DM Sans" w:cs="DM Sans"/>
+                <w:sz w:val="18"/>
+                <w:szCs w:val="18"/>
+              </w:rPr>
+              <w:t xml:space="preserve">(blank)</w:t>
+            </w:r>
+          </w:p>
+        </w:tc>
+        <w:tc>
+          <w:tcPr>
+            <w:tcW w:w="1250" w:type="dxa"/>
             <w:shd w:val="clear" w:color="auto" w:fill="FFFFFF"/>
             <w:tcMar>
               <w:top w:w="50" w:type="dxa"/>
@@ -2758,7 +3080,7 @@
       <w:tr>
         <w:tc>
           <w:tcPr>
-            <w:tcW w:w="2400" w:type="dxa"/>
+            <w:tcW w:w="1950" w:type="dxa"/>
             <w:shd w:val="clear" w:color="auto" w:fill="FFFFFF"/>
             <w:tcMar>
               <w:top w:w="50" w:type="dxa"/>
@@ -2785,33 +3107,60 @@
         </w:tc>
         <w:tc>
           <w:tcPr>
-            <w:tcW w:w="4400" w:type="dxa"/>
-            <w:shd w:val="clear" w:color="auto" w:fill="FFFFFF"/>
-            <w:tcMar>
-              <w:top w:w="50" w:type="dxa"/>
-              <w:bottom w:w="50" w:type="dxa"/>
-              <w:left w:w="90" w:type="dxa"/>
-              <w:right w:w="90" w:type="dxa"/>
-            </w:tcMar>
-            <w:vAlign w:val="center"/>
-          </w:tcPr>
-          <w:p>
-            <w:pPr>
-              <w:spacing w:after="20"/>
-            </w:pPr>
-            <w:r>
-              <w:rPr>
-                <w:rFonts w:ascii="DM Sans" w:hAnsi="DM Sans" w:cs="DM Sans"/>
-                <w:sz w:val="18"/>
-                <w:szCs w:val="18"/>
-              </w:rPr>
-              <w:t xml:space="preserve">Spark version (classic compute only).</w:t>
-            </w:r>
-          </w:p>
-        </w:tc>
-        <w:tc>
-          <w:tcPr>
-            <w:tcW w:w="2200" w:type="dxa"/>
+            <w:tcW w:w="4350" w:type="dxa"/>
+            <w:shd w:val="clear" w:color="auto" w:fill="FFFFFF"/>
+            <w:tcMar>
+              <w:top w:w="50" w:type="dxa"/>
+              <w:bottom w:w="50" w:type="dxa"/>
+              <w:left w:w="90" w:type="dxa"/>
+              <w:right w:w="90" w:type="dxa"/>
+            </w:tcMar>
+            <w:vAlign w:val="center"/>
+          </w:tcPr>
+          <w:p>
+            <w:pPr>
+              <w:spacing w:after="20"/>
+            </w:pPr>
+            <w:r>
+              <w:rPr>
+                <w:rFonts w:ascii="DM Sans" w:hAnsi="DM Sans" w:cs="DM Sans"/>
+                <w:sz w:val="18"/>
+                <w:szCs w:val="18"/>
+              </w:rPr>
+              <w:t xml:space="preserve">Spark version for CLASSIC compute only (ignored on serverless).</w:t>
+            </w:r>
+          </w:p>
+        </w:tc>
+        <w:tc>
+          <w:tcPr>
+            <w:tcW w:w="1450" w:type="dxa"/>
+            <w:shd w:val="clear" w:color="auto" w:fill="FFFFFF"/>
+            <w:tcMar>
+              <w:top w:w="50" w:type="dxa"/>
+              <w:bottom w:w="50" w:type="dxa"/>
+              <w:left w:w="90" w:type="dxa"/>
+              <w:right w:w="90" w:type="dxa"/>
+            </w:tcMar>
+            <w:vAlign w:val="center"/>
+          </w:tcPr>
+          <w:p>
+            <w:pPr>
+              <w:spacing w:after="20"/>
+            </w:pPr>
+            <w:r>
+              <w:rPr>
+                <w:rFonts w:ascii="Consolas" w:hAnsi="Consolas" w:cs="Consolas"/>
+                <w:color w:val="1B3139"/>
+                <w:sz w:val="18"/>
+                <w:szCs w:val="18"/>
+              </w:rPr>
+              <w:t xml:space="preserve">15.4.x-scala2.12</w:t>
+            </w:r>
+          </w:p>
+        </w:tc>
+        <w:tc>
+          <w:tcPr>
+            <w:tcW w:w="1250" w:type="dxa"/>
             <w:shd w:val="clear" w:color="auto" w:fill="FFFFFF"/>
             <w:tcMar>
               <w:top w:w="50" w:type="dxa"/>
@@ -2840,7 +3189,7 @@
       <w:tr>
         <w:tc>
           <w:tcPr>
-            <w:tcW w:w="2400" w:type="dxa"/>
+            <w:tcW w:w="1950" w:type="dxa"/>
             <w:shd w:val="clear" w:color="auto" w:fill="FFFFFF"/>
             <w:tcMar>
               <w:top w:w="50" w:type="dxa"/>
@@ -2867,33 +3216,60 @@
         </w:tc>
         <w:tc>
           <w:tcPr>
-            <w:tcW w:w="4400" w:type="dxa"/>
-            <w:shd w:val="clear" w:color="auto" w:fill="FFFFFF"/>
-            <w:tcMar>
-              <w:top w:w="50" w:type="dxa"/>
-              <w:bottom w:w="50" w:type="dxa"/>
-              <w:left w:w="90" w:type="dxa"/>
-              <w:right w:w="90" w:type="dxa"/>
-            </w:tcMar>
-            <w:vAlign w:val="center"/>
-          </w:tcPr>
-          <w:p>
-            <w:pPr>
-              <w:spacing w:after="20"/>
-            </w:pPr>
-            <w:r>
-              <w:rPr>
-                <w:rFonts w:ascii="DM Sans" w:hAnsi="DM Sans" w:cs="DM Sans"/>
-                <w:sz w:val="18"/>
-                <w:szCs w:val="18"/>
-              </w:rPr>
-              <w:t xml:space="preserve">Node type (classic compute only).</w:t>
-            </w:r>
-          </w:p>
-        </w:tc>
-        <w:tc>
-          <w:tcPr>
-            <w:tcW w:w="2200" w:type="dxa"/>
+            <w:tcW w:w="4350" w:type="dxa"/>
+            <w:shd w:val="clear" w:color="auto" w:fill="FFFFFF"/>
+            <w:tcMar>
+              <w:top w:w="50" w:type="dxa"/>
+              <w:bottom w:w="50" w:type="dxa"/>
+              <w:left w:w="90" w:type="dxa"/>
+              <w:right w:w="90" w:type="dxa"/>
+            </w:tcMar>
+            <w:vAlign w:val="center"/>
+          </w:tcPr>
+          <w:p>
+            <w:pPr>
+              <w:spacing w:after="20"/>
+            </w:pPr>
+            <w:r>
+              <w:rPr>
+                <w:rFonts w:ascii="DM Sans" w:hAnsi="DM Sans" w:cs="DM Sans"/>
+                <w:sz w:val="18"/>
+                <w:szCs w:val="18"/>
+              </w:rPr>
+              <w:t xml:space="preserve">Node type for CLASSIC compute only (ignored on serverless).</w:t>
+            </w:r>
+          </w:p>
+        </w:tc>
+        <w:tc>
+          <w:tcPr>
+            <w:tcW w:w="1450" w:type="dxa"/>
+            <w:shd w:val="clear" w:color="auto" w:fill="FFFFFF"/>
+            <w:tcMar>
+              <w:top w:w="50" w:type="dxa"/>
+              <w:bottom w:w="50" w:type="dxa"/>
+              <w:left w:w="90" w:type="dxa"/>
+              <w:right w:w="90" w:type="dxa"/>
+            </w:tcMar>
+            <w:vAlign w:val="center"/>
+          </w:tcPr>
+          <w:p>
+            <w:pPr>
+              <w:spacing w:after="20"/>
+            </w:pPr>
+            <w:r>
+              <w:rPr>
+                <w:rFonts w:ascii="Consolas" w:hAnsi="Consolas" w:cs="Consolas"/>
+                <w:color w:val="1B3139"/>
+                <w:sz w:val="18"/>
+                <w:szCs w:val="18"/>
+              </w:rPr>
+              <w:t xml:space="preserve">Standard_DS3_v2</w:t>
+            </w:r>
+          </w:p>
+        </w:tc>
+        <w:tc>
+          <w:tcPr>
+            <w:tcW w:w="1250" w:type="dxa"/>
             <w:shd w:val="clear" w:color="auto" w:fill="FFFFFF"/>
             <w:tcMar>
               <w:top w:w="50" w:type="dxa"/>
@@ -2941,6 +3317,17 @@
           <w:rFonts w:ascii="DM Sans" w:hAnsi="DM Sans" w:cs="DM Sans"/>
         </w:rPr>
         <w:t xml:space="preserve">Per-environment overrides</w:t>
+      </w:r>
+    </w:p>
+    <w:p>
+      <w:pPr>
+        <w:spacing w:before="0" w:after="120"/>
+      </w:pPr>
+      <w:r>
+        <w:rPr>
+          <w:rFonts w:ascii="DM Sans" w:hAnsi="DM Sans" w:cs="DM Sans"/>
+        </w:rPr>
+        <w:t xml:space="preserve">Any variable can be overridden per environment in the targets section. Values not listed there fall back to the defaults above.</w:t>
       </w:r>
     </w:p>
     <w:p>
@@ -3168,7 +3555,7 @@
           <w:sz w:val="20"/>
           <w:szCs w:val="20"/>
         </w:rPr>
-        <w:t xml:space="preserve">Timestamp format is YYYY-MM-DDTHH:MM:SS, e.g. 2026-07-16T06:13:58.</w:t>
+        <w:t xml:space="preserve">Timestamp format is YYYY-MM-DDTHH:MM:SS, e.g. 2026-07-16T06:13:58. Wait times (deploy_wait_minutes, copy_wait_minutes) are in MINUTES.</w:t>
       </w:r>
     </w:p>
     <w:p>

</xml_diff>

<commit_message>
Add Prerequisites & Permissions Checklist section to user manual
New section 5 captures every access the SP/PAT needs, derived from the code:
- Platform: UC + serverless enabled, Agent Bricks preview, serverless usage
  policy User role, not enrolled in Serverless Access Controls Preview
- Target: create/manage KAs + serving endpoint; UC grants (USE CATALOG,
  USE SCHEMA, CREATE/READ/WRITE VOLUME), vector index access; CREATE TABLE +
  MODIFY on status tables
- Source: read KAs/sources/examples; READ VOLUME + USE CATALOG/SCHEMA for
  file-based source volumes
- Credentials/secret scope requirements and a quick pre-flight checklist table

Renumber subsequent sections (GitHub secrets -> 6 ... Troubleshooting -> 10)
and update the TOC and cross-reference.

Co-authored-by: Isaac
</commit_message>
<xml_diff>
--- a/KA_Deployment_User_Manual.docx
+++ b/KA_Deployment_User_Manual.docx
@@ -179,7 +179,7 @@
           <w:sz w:val="22"/>
           <w:szCs w:val="22"/>
         </w:rPr>
-        <w:t xml:space="preserve">5.  GitHub Secrets &amp; Variables by Environment</w:t>
+        <w:t xml:space="preserve">5.  Prerequisites &amp; Permissions Checklist</w:t>
       </w:r>
     </w:p>
     <w:p>
@@ -194,7 +194,7 @@
           <w:sz w:val="22"/>
           <w:szCs w:val="22"/>
         </w:rPr>
-        <w:t xml:space="preserve">6.  How to Deploy (Run the Tool)</w:t>
+        <w:t xml:space="preserve">6.  GitHub Secrets &amp; Variables by Environment</w:t>
       </w:r>
     </w:p>
     <w:p>
@@ -209,7 +209,7 @@
           <w:sz w:val="22"/>
           <w:szCs w:val="22"/>
         </w:rPr>
-        <w:t xml:space="preserve">7.  Status Tracking Tables</w:t>
+        <w:t xml:space="preserve">7.  How to Deploy (Run the Tool)</w:t>
       </w:r>
     </w:p>
     <w:p>
@@ -224,7 +224,7 @@
           <w:sz w:val="22"/>
           <w:szCs w:val="22"/>
         </w:rPr>
-        <w:t xml:space="preserve">8.  Copying Examples</w:t>
+        <w:t xml:space="preserve">8.  Status Tracking Tables</w:t>
       </w:r>
     </w:p>
     <w:p>
@@ -239,7 +239,22 @@
           <w:sz w:val="22"/>
           <w:szCs w:val="22"/>
         </w:rPr>
-        <w:t xml:space="preserve">9.  Troubleshooting</w:t>
+        <w:t xml:space="preserve">9.  Copying Examples</w:t>
+      </w:r>
+    </w:p>
+    <w:p>
+      <w:pPr>
+        <w:spacing w:before="0" w:after="40"/>
+      </w:pPr>
+      <w:r>
+        <w:rPr>
+          <w:rFonts w:ascii="DM Sans" w:hAnsi="DM Sans" w:cs="DM Sans"/>
+          <w:b/>
+          <w:color w:val="1B3139"/>
+          <w:sz w:val="22"/>
+          <w:szCs w:val="22"/>
+        </w:rPr>
+        <w:t xml:space="preserve">10.  Troubleshooting</w:t>
       </w:r>
     </w:p>
     <w:p>
@@ -4326,7 +4341,2085 @@
         <w:rPr>
           <w:rFonts w:ascii="DM Sans" w:hAnsi="DM Sans" w:cs="DM Sans"/>
         </w:rPr>
-        <w:t xml:space="preserve">5.  GitHub Secrets &amp; Variables by Environment</w:t>
+        <w:t xml:space="preserve">5.  Prerequisites &amp; Permissions Checklist</w:t>
+      </w:r>
+    </w:p>
+    <w:p>
+      <w:pPr>
+        <w:spacing w:before="0" w:after="120"/>
+      </w:pPr>
+      <w:r>
+        <w:rPr>
+          <w:rFonts w:ascii="DM Sans" w:hAnsi="DM Sans" w:cs="DM Sans"/>
+        </w:rPr>
+        <w:t xml:space="preserve">Grant these BEFORE running the tool. Requirements are derived from the actual API and SDK calls the jobs make. The identity is the Service Principal (or PAT owner) used for each workspace — TARGET is where KAs are created, SOURCE is where they are exported from.</w:t>
+      </w:r>
+    </w:p>
+    <w:p>
+      <w:pPr>
+        <w:pStyle w:val="Heading2"/>
+        <w:spacing w:before="0" w:after="120"/>
+      </w:pPr>
+      <w:r>
+        <w:rPr>
+          <w:rFonts w:ascii="DM Sans" w:hAnsi="DM Sans" w:cs="DM Sans"/>
+        </w:rPr>
+        <w:t xml:space="preserve">Workspace &amp; platform</w:t>
+      </w:r>
+    </w:p>
+    <w:p>
+      <w:pPr>
+        <w:ind w:left="360" w:hanging="180"/>
+        <w:spacing w:after="60"/>
+      </w:pPr>
+      <w:r>
+        <w:rPr>
+          <w:rFonts w:ascii="DM Sans" w:hAnsi="DM Sans" w:cs="DM Sans"/>
+          <w:b/>
+          <w:color w:val="FF3621"/>
+        </w:rPr>
+        <w:t xml:space="preserve">•  </w:t>
+      </w:r>
+      <w:r>
+        <w:rPr>
+          <w:rFonts w:ascii="DM Sans" w:hAnsi="DM Sans" w:cs="DM Sans"/>
+        </w:rPr>
+        <w:t xml:space="preserve">TARGET workspace: Unity Catalog enabled, serverless compute enabled, Premium/Enterprise tier.</w:t>
+      </w:r>
+    </w:p>
+    <w:p>
+      <w:pPr>
+        <w:ind w:left="360" w:hanging="180"/>
+        <w:spacing w:after="60"/>
+      </w:pPr>
+      <w:r>
+        <w:rPr>
+          <w:rFonts w:ascii="DM Sans" w:hAnsi="DM Sans" w:cs="DM Sans"/>
+          <w:b/>
+          <w:color w:val="FF3621"/>
+        </w:rPr>
+        <w:t xml:space="preserve">•  </w:t>
+      </w:r>
+      <w:r>
+        <w:rPr>
+          <w:rFonts w:ascii="DM Sans" w:hAnsi="DM Sans" w:cs="DM Sans"/>
+        </w:rPr>
+        <w:t xml:space="preserve">TARGET workspace: NOT enrolled in the Serverless Access Controls Preview (it blocks KA creation).</w:t>
+      </w:r>
+    </w:p>
+    <w:p>
+      <w:pPr>
+        <w:ind w:left="360" w:hanging="180"/>
+        <w:spacing w:after="60"/>
+      </w:pPr>
+      <w:r>
+        <w:rPr>
+          <w:rFonts w:ascii="DM Sans" w:hAnsi="DM Sans" w:cs="DM Sans"/>
+          <w:b/>
+          <w:color w:val="FF3621"/>
+        </w:rPr>
+        <w:t xml:space="preserve">•  </w:t>
+      </w:r>
+      <w:r>
+        <w:rPr>
+          <w:rFonts w:ascii="DM Sans" w:hAnsi="DM Sans" w:cs="DM Sans"/>
+        </w:rPr>
+        <w:t xml:space="preserve">Mosaic AI Agent Bricks preview enabled (Admin Console → Workspace Settings → Previews).</w:t>
+      </w:r>
+    </w:p>
+    <w:p>
+      <w:pPr>
+        <w:ind w:left="360" w:hanging="180"/>
+        <w:spacing w:after="60"/>
+      </w:pPr>
+      <w:r>
+        <w:rPr>
+          <w:rFonts w:ascii="DM Sans" w:hAnsi="DM Sans" w:cs="DM Sans"/>
+          <w:b/>
+          <w:color w:val="FF3621"/>
+        </w:rPr>
+        <w:t xml:space="preserve">•  </w:t>
+      </w:r>
+      <w:r>
+        <w:rPr>
+          <w:rFonts w:ascii="DM Sans" w:hAnsi="DM Sans" w:cs="DM Sans"/>
+        </w:rPr>
+        <w:t xml:space="preserve">Serverless usage policy exists and the running identity has the User role on it (needed for KA / serverless AI).</w:t>
+      </w:r>
+    </w:p>
+    <w:p>
+      <w:pPr>
+        <w:ind w:left="360" w:hanging="180"/>
+        <w:spacing w:after="60"/>
+      </w:pPr>
+      <w:r>
+        <w:rPr>
+          <w:rFonts w:ascii="DM Sans" w:hAnsi="DM Sans" w:cs="DM Sans"/>
+          <w:b/>
+          <w:color w:val="FF3621"/>
+        </w:rPr>
+        <w:t xml:space="preserve">•  </w:t>
+      </w:r>
+      <w:r>
+        <w:rPr>
+          <w:rFonts w:ascii="DM Sans" w:hAnsi="DM Sans" w:cs="DM Sans"/>
+        </w:rPr>
+        <w:t xml:space="preserve">Both workspaces are in a region where Knowledge Assistant is supported.</w:t>
+      </w:r>
+    </w:p>
+    <w:p>
+      <w:pPr>
+        <w:pStyle w:val="Heading2"/>
+        <w:spacing w:before="0" w:after="120"/>
+      </w:pPr>
+      <w:r>
+        <w:rPr>
+          <w:rFonts w:ascii="DM Sans" w:hAnsi="DM Sans" w:cs="DM Sans"/>
+        </w:rPr>
+        <w:t xml:space="preserve">TARGET identity — Knowledge Assistant</w:t>
+      </w:r>
+    </w:p>
+    <w:p>
+      <w:pPr>
+        <w:spacing w:before="0" w:after="120"/>
+      </w:pPr>
+      <w:r>
+        <w:rPr>
+          <w:rFonts w:ascii="DM Sans" w:hAnsi="DM Sans" w:cs="DM Sans"/>
+        </w:rPr>
+        <w:t xml:space="preserve">The job creates KAs via POST/DELETE on the knowledge-assistants REST API and reads examples/sources. The identity needs to create and manage KAs on the target.</w:t>
+      </w:r>
+    </w:p>
+    <w:p>
+      <w:pPr>
+        <w:ind w:left="360" w:hanging="180"/>
+        <w:spacing w:after="60"/>
+      </w:pPr>
+      <w:r>
+        <w:rPr>
+          <w:rFonts w:ascii="DM Sans" w:hAnsi="DM Sans" w:cs="DM Sans"/>
+          <w:b/>
+          <w:color w:val="FF3621"/>
+        </w:rPr>
+        <w:t xml:space="preserve">•  </w:t>
+      </w:r>
+      <w:r>
+        <w:rPr>
+          <w:rFonts w:ascii="DM Sans" w:hAnsi="DM Sans" w:cs="DM Sans"/>
+        </w:rPr>
+        <w:t xml:space="preserve">Create, read, update, delete Knowledge Assistants (KA admin / can-manage on the target).</w:t>
+      </w:r>
+    </w:p>
+    <w:p>
+      <w:pPr>
+        <w:ind w:left="360" w:hanging="180"/>
+        <w:spacing w:after="60"/>
+      </w:pPr>
+      <w:r>
+        <w:rPr>
+          <w:rFonts w:ascii="DM Sans" w:hAnsi="DM Sans" w:cs="DM Sans"/>
+          <w:b/>
+          <w:color w:val="FF3621"/>
+        </w:rPr>
+        <w:t xml:space="preserve">•  </w:t>
+      </w:r>
+      <w:r>
+        <w:rPr>
+          <w:rFonts w:ascii="DM Sans" w:hAnsi="DM Sans" w:cs="DM Sans"/>
+        </w:rPr>
+        <w:t xml:space="preserve">Permission to create the KA's backing serving endpoint (serverless model serving).</w:t>
+      </w:r>
+    </w:p>
+    <w:p>
+      <w:pPr>
+        <w:pStyle w:val="Heading2"/>
+        <w:spacing w:before="0" w:after="120"/>
+      </w:pPr>
+      <w:r>
+        <w:rPr>
+          <w:rFonts w:ascii="DM Sans" w:hAnsi="DM Sans" w:cs="DM Sans"/>
+        </w:rPr>
+        <w:t xml:space="preserve">TARGET identity — Unity Catalog</w:t>
+      </w:r>
+    </w:p>
+    <w:p>
+      <w:pPr>
+        <w:spacing w:before="0" w:after="120"/>
+      </w:pPr>
+      <w:r>
+        <w:rPr>
+          <w:rFonts w:ascii="DM Sans" w:hAnsi="DM Sans" w:cs="DM Sans"/>
+        </w:rPr>
+        <w:t xml:space="preserve">KAs and their knowledge sources live under a catalog/schema, and file-based sources use UC Volumes. Grants needed on the TARGET catalog and schema:</w:t>
+      </w:r>
+    </w:p>
+    <w:tbl>
+      <w:tblPr>
+        <w:tblW w:w="9000" w:type="dxa"/>
+        <w:tblLayout w:type="fixed"/>
+        <w:tblBorders>
+          <w:top w:val="single" w:sz="4" w:color="C6CDD2"/>
+          <w:left w:val="single" w:sz="4" w:color="C6CDD2"/>
+          <w:bottom w:val="single" w:sz="4" w:color="C6CDD2"/>
+          <w:right w:val="single" w:sz="4" w:color="C6CDD2"/>
+          <w:insideH w:val="single" w:sz="4" w:color="C6CDD2"/>
+          <w:insideV w:val="single" w:sz="4" w:color="C6CDD2"/>
+        </w:tblBorders>
+      </w:tblPr>
+      <w:tblGrid>
+        <w:gridCol w:w="2600"/>
+        <w:gridCol w:w="2400"/>
+        <w:gridCol w:w="4000"/>
+      </w:tblGrid>
+      <w:tr>
+        <w:tc>
+          <w:tcPr>
+            <w:tcW w:w="2600" w:type="dxa"/>
+            <w:shd w:val="clear" w:color="auto" w:fill="1B3139"/>
+            <w:tcMar>
+              <w:top w:w="50" w:type="dxa"/>
+              <w:bottom w:w="50" w:type="dxa"/>
+              <w:left w:w="90" w:type="dxa"/>
+              <w:right w:w="90" w:type="dxa"/>
+            </w:tcMar>
+            <w:vAlign w:val="center"/>
+          </w:tcPr>
+          <w:p>
+            <w:pPr>
+              <w:spacing w:after="20"/>
+            </w:pPr>
+            <w:r>
+              <w:rPr>
+                <w:rFonts w:ascii="DM Sans" w:hAnsi="DM Sans" w:cs="DM Sans"/>
+                <w:b/>
+                <w:color w:val="FFFFFF"/>
+                <w:sz w:val="18"/>
+                <w:szCs w:val="18"/>
+              </w:rPr>
+              <w:t xml:space="preserve">UC privilege</w:t>
+            </w:r>
+          </w:p>
+        </w:tc>
+        <w:tc>
+          <w:tcPr>
+            <w:tcW w:w="2400" w:type="dxa"/>
+            <w:shd w:val="clear" w:color="auto" w:fill="1B3139"/>
+            <w:tcMar>
+              <w:top w:w="50" w:type="dxa"/>
+              <w:bottom w:w="50" w:type="dxa"/>
+              <w:left w:w="90" w:type="dxa"/>
+              <w:right w:w="90" w:type="dxa"/>
+            </w:tcMar>
+            <w:vAlign w:val="center"/>
+          </w:tcPr>
+          <w:p>
+            <w:pPr>
+              <w:spacing w:after="20"/>
+            </w:pPr>
+            <w:r>
+              <w:rPr>
+                <w:rFonts w:ascii="DM Sans" w:hAnsi="DM Sans" w:cs="DM Sans"/>
+                <w:b/>
+                <w:color w:val="FFFFFF"/>
+                <w:sz w:val="18"/>
+                <w:szCs w:val="18"/>
+              </w:rPr>
+              <w:t xml:space="preserve">On</w:t>
+            </w:r>
+          </w:p>
+        </w:tc>
+        <w:tc>
+          <w:tcPr>
+            <w:tcW w:w="4000" w:type="dxa"/>
+            <w:shd w:val="clear" w:color="auto" w:fill="1B3139"/>
+            <w:tcMar>
+              <w:top w:w="50" w:type="dxa"/>
+              <w:bottom w:w="50" w:type="dxa"/>
+              <w:left w:w="90" w:type="dxa"/>
+              <w:right w:w="90" w:type="dxa"/>
+            </w:tcMar>
+            <w:vAlign w:val="center"/>
+          </w:tcPr>
+          <w:p>
+            <w:pPr>
+              <w:spacing w:after="20"/>
+            </w:pPr>
+            <w:r>
+              <w:rPr>
+                <w:rFonts w:ascii="DM Sans" w:hAnsi="DM Sans" w:cs="DM Sans"/>
+                <w:b/>
+                <w:color w:val="FFFFFF"/>
+                <w:sz w:val="18"/>
+                <w:szCs w:val="18"/>
+              </w:rPr>
+              <w:t xml:space="preserve">Why (code path)</w:t>
+            </w:r>
+          </w:p>
+        </w:tc>
+      </w:tr>
+      <w:tr>
+        <w:tc>
+          <w:tcPr>
+            <w:tcW w:w="2600" w:type="dxa"/>
+            <w:shd w:val="clear" w:color="auto" w:fill="FFFFFF"/>
+            <w:tcMar>
+              <w:top w:w="50" w:type="dxa"/>
+              <w:bottom w:w="50" w:type="dxa"/>
+              <w:left w:w="90" w:type="dxa"/>
+              <w:right w:w="90" w:type="dxa"/>
+            </w:tcMar>
+            <w:vAlign w:val="center"/>
+          </w:tcPr>
+          <w:p>
+            <w:pPr>
+              <w:spacing w:after="20"/>
+            </w:pPr>
+            <w:r>
+              <w:rPr>
+                <w:rFonts w:ascii="Consolas" w:hAnsi="Consolas" w:cs="Consolas"/>
+                <w:color w:val="1B3139"/>
+                <w:sz w:val="18"/>
+                <w:szCs w:val="18"/>
+              </w:rPr>
+              <w:t xml:space="preserve">USE CATALOG</w:t>
+            </w:r>
+          </w:p>
+        </w:tc>
+        <w:tc>
+          <w:tcPr>
+            <w:tcW w:w="2400" w:type="dxa"/>
+            <w:shd w:val="clear" w:color="auto" w:fill="FFFFFF"/>
+            <w:tcMar>
+              <w:top w:w="50" w:type="dxa"/>
+              <w:bottom w:w="50" w:type="dxa"/>
+              <w:left w:w="90" w:type="dxa"/>
+              <w:right w:w="90" w:type="dxa"/>
+            </w:tcMar>
+            <w:vAlign w:val="center"/>
+          </w:tcPr>
+          <w:p>
+            <w:pPr>
+              <w:spacing w:after="20"/>
+            </w:pPr>
+            <w:r>
+              <w:rPr>
+                <w:rFonts w:ascii="DM Sans" w:hAnsi="DM Sans" w:cs="DM Sans"/>
+                <w:sz w:val="18"/>
+                <w:szCs w:val="18"/>
+              </w:rPr>
+              <w:t xml:space="preserve">target catalog</w:t>
+            </w:r>
+          </w:p>
+        </w:tc>
+        <w:tc>
+          <w:tcPr>
+            <w:tcW w:w="4000" w:type="dxa"/>
+            <w:shd w:val="clear" w:color="auto" w:fill="FFFFFF"/>
+            <w:tcMar>
+              <w:top w:w="50" w:type="dxa"/>
+              <w:bottom w:w="50" w:type="dxa"/>
+              <w:left w:w="90" w:type="dxa"/>
+              <w:right w:w="90" w:type="dxa"/>
+            </w:tcMar>
+            <w:vAlign w:val="center"/>
+          </w:tcPr>
+          <w:p>
+            <w:pPr>
+              <w:spacing w:after="20"/>
+            </w:pPr>
+            <w:r>
+              <w:rPr>
+                <w:rFonts w:ascii="DM Sans" w:hAnsi="DM Sans" w:cs="DM Sans"/>
+                <w:sz w:val="18"/>
+                <w:szCs w:val="18"/>
+              </w:rPr>
+              <w:t xml:space="preserve">Resolve/deploy KA and sources under the catalog.</w:t>
+            </w:r>
+          </w:p>
+        </w:tc>
+      </w:tr>
+      <w:tr>
+        <w:tc>
+          <w:tcPr>
+            <w:tcW w:w="2600" w:type="dxa"/>
+            <w:shd w:val="clear" w:color="auto" w:fill="FFFFFF"/>
+            <w:tcMar>
+              <w:top w:w="50" w:type="dxa"/>
+              <w:bottom w:w="50" w:type="dxa"/>
+              <w:left w:w="90" w:type="dxa"/>
+              <w:right w:w="90" w:type="dxa"/>
+            </w:tcMar>
+            <w:vAlign w:val="center"/>
+          </w:tcPr>
+          <w:p>
+            <w:pPr>
+              <w:spacing w:after="20"/>
+            </w:pPr>
+            <w:r>
+              <w:rPr>
+                <w:rFonts w:ascii="Consolas" w:hAnsi="Consolas" w:cs="Consolas"/>
+                <w:color w:val="1B3139"/>
+                <w:sz w:val="18"/>
+                <w:szCs w:val="18"/>
+              </w:rPr>
+              <w:t xml:space="preserve">USE SCHEMA</w:t>
+            </w:r>
+          </w:p>
+        </w:tc>
+        <w:tc>
+          <w:tcPr>
+            <w:tcW w:w="2400" w:type="dxa"/>
+            <w:shd w:val="clear" w:color="auto" w:fill="FFFFFF"/>
+            <w:tcMar>
+              <w:top w:w="50" w:type="dxa"/>
+              <w:bottom w:w="50" w:type="dxa"/>
+              <w:left w:w="90" w:type="dxa"/>
+              <w:right w:w="90" w:type="dxa"/>
+            </w:tcMar>
+            <w:vAlign w:val="center"/>
+          </w:tcPr>
+          <w:p>
+            <w:pPr>
+              <w:spacing w:after="20"/>
+            </w:pPr>
+            <w:r>
+              <w:rPr>
+                <w:rFonts w:ascii="DM Sans" w:hAnsi="DM Sans" w:cs="DM Sans"/>
+                <w:sz w:val="18"/>
+                <w:szCs w:val="18"/>
+              </w:rPr>
+              <w:t xml:space="preserve">target schema</w:t>
+            </w:r>
+          </w:p>
+        </w:tc>
+        <w:tc>
+          <w:tcPr>
+            <w:tcW w:w="4000" w:type="dxa"/>
+            <w:shd w:val="clear" w:color="auto" w:fill="FFFFFF"/>
+            <w:tcMar>
+              <w:top w:w="50" w:type="dxa"/>
+              <w:bottom w:w="50" w:type="dxa"/>
+              <w:left w:w="90" w:type="dxa"/>
+              <w:right w:w="90" w:type="dxa"/>
+            </w:tcMar>
+            <w:vAlign w:val="center"/>
+          </w:tcPr>
+          <w:p>
+            <w:pPr>
+              <w:spacing w:after="20"/>
+            </w:pPr>
+            <w:r>
+              <w:rPr>
+                <w:rFonts w:ascii="DM Sans" w:hAnsi="DM Sans" w:cs="DM Sans"/>
+                <w:sz w:val="18"/>
+                <w:szCs w:val="18"/>
+              </w:rPr>
+              <w:t xml:space="preserve">Resolve/deploy KA and sources under the schema.</w:t>
+            </w:r>
+          </w:p>
+        </w:tc>
+      </w:tr>
+      <w:tr>
+        <w:tc>
+          <w:tcPr>
+            <w:tcW w:w="2600" w:type="dxa"/>
+            <w:shd w:val="clear" w:color="auto" w:fill="FFFFFF"/>
+            <w:tcMar>
+              <w:top w:w="50" w:type="dxa"/>
+              <w:bottom w:w="50" w:type="dxa"/>
+              <w:left w:w="90" w:type="dxa"/>
+              <w:right w:w="90" w:type="dxa"/>
+            </w:tcMar>
+            <w:vAlign w:val="center"/>
+          </w:tcPr>
+          <w:p>
+            <w:pPr>
+              <w:spacing w:after="20"/>
+            </w:pPr>
+            <w:r>
+              <w:rPr>
+                <w:rFonts w:ascii="Consolas" w:hAnsi="Consolas" w:cs="Consolas"/>
+                <w:color w:val="1B3139"/>
+                <w:sz w:val="18"/>
+                <w:szCs w:val="18"/>
+              </w:rPr>
+              <w:t xml:space="preserve">CREATE VOLUME</w:t>
+            </w:r>
+          </w:p>
+        </w:tc>
+        <w:tc>
+          <w:tcPr>
+            <w:tcW w:w="2400" w:type="dxa"/>
+            <w:shd w:val="clear" w:color="auto" w:fill="FFFFFF"/>
+            <w:tcMar>
+              <w:top w:w="50" w:type="dxa"/>
+              <w:bottom w:w="50" w:type="dxa"/>
+              <w:left w:w="90" w:type="dxa"/>
+              <w:right w:w="90" w:type="dxa"/>
+            </w:tcMar>
+            <w:vAlign w:val="center"/>
+          </w:tcPr>
+          <w:p>
+            <w:pPr>
+              <w:spacing w:after="20"/>
+            </w:pPr>
+            <w:r>
+              <w:rPr>
+                <w:rFonts w:ascii="DM Sans" w:hAnsi="DM Sans" w:cs="DM Sans"/>
+                <w:sz w:val="18"/>
+                <w:szCs w:val="18"/>
+              </w:rPr>
+              <w:t xml:space="preserve">target schema</w:t>
+            </w:r>
+          </w:p>
+        </w:tc>
+        <w:tc>
+          <w:tcPr>
+            <w:tcW w:w="4000" w:type="dxa"/>
+            <w:shd w:val="clear" w:color="auto" w:fill="FFFFFF"/>
+            <w:tcMar>
+              <w:top w:w="50" w:type="dxa"/>
+              <w:bottom w:w="50" w:type="dxa"/>
+              <w:left w:w="90" w:type="dxa"/>
+              <w:right w:w="90" w:type="dxa"/>
+            </w:tcMar>
+            <w:vAlign w:val="center"/>
+          </w:tcPr>
+          <w:p>
+            <w:pPr>
+              <w:spacing w:after="20"/>
+            </w:pPr>
+            <w:r>
+              <w:rPr>
+                <w:rFonts w:ascii="DM Sans" w:hAnsi="DM Sans" w:cs="DM Sans"/>
+                <w:sz w:val="18"/>
+                <w:szCs w:val="18"/>
+              </w:rPr>
+              <w:t xml:space="preserve">volumes.create() when copy_volumes=true (create missing volume).</w:t>
+            </w:r>
+          </w:p>
+        </w:tc>
+      </w:tr>
+      <w:tr>
+        <w:tc>
+          <w:tcPr>
+            <w:tcW w:w="2600" w:type="dxa"/>
+            <w:shd w:val="clear" w:color="auto" w:fill="FFFFFF"/>
+            <w:tcMar>
+              <w:top w:w="50" w:type="dxa"/>
+              <w:bottom w:w="50" w:type="dxa"/>
+              <w:left w:w="90" w:type="dxa"/>
+              <w:right w:w="90" w:type="dxa"/>
+            </w:tcMar>
+            <w:vAlign w:val="center"/>
+          </w:tcPr>
+          <w:p>
+            <w:pPr>
+              <w:spacing w:after="20"/>
+            </w:pPr>
+            <w:r>
+              <w:rPr>
+                <w:rFonts w:ascii="Consolas" w:hAnsi="Consolas" w:cs="Consolas"/>
+                <w:color w:val="1B3139"/>
+                <w:sz w:val="18"/>
+                <w:szCs w:val="18"/>
+              </w:rPr>
+              <w:t xml:space="preserve">READ VOLUME</w:t>
+            </w:r>
+          </w:p>
+        </w:tc>
+        <w:tc>
+          <w:tcPr>
+            <w:tcW w:w="2400" w:type="dxa"/>
+            <w:shd w:val="clear" w:color="auto" w:fill="FFFFFF"/>
+            <w:tcMar>
+              <w:top w:w="50" w:type="dxa"/>
+              <w:bottom w:w="50" w:type="dxa"/>
+              <w:left w:w="90" w:type="dxa"/>
+              <w:right w:w="90" w:type="dxa"/>
+            </w:tcMar>
+            <w:vAlign w:val="center"/>
+          </w:tcPr>
+          <w:p>
+            <w:pPr>
+              <w:spacing w:after="20"/>
+            </w:pPr>
+            <w:r>
+              <w:rPr>
+                <w:rFonts w:ascii="DM Sans" w:hAnsi="DM Sans" w:cs="DM Sans"/>
+                <w:sz w:val="18"/>
+                <w:szCs w:val="18"/>
+              </w:rPr>
+              <w:t xml:space="preserve">target volume(s)</w:t>
+            </w:r>
+          </w:p>
+        </w:tc>
+        <w:tc>
+          <w:tcPr>
+            <w:tcW w:w="4000" w:type="dxa"/>
+            <w:shd w:val="clear" w:color="auto" w:fill="FFFFFF"/>
+            <w:tcMar>
+              <w:top w:w="50" w:type="dxa"/>
+              <w:bottom w:w="50" w:type="dxa"/>
+              <w:left w:w="90" w:type="dxa"/>
+              <w:right w:w="90" w:type="dxa"/>
+            </w:tcMar>
+            <w:vAlign w:val="center"/>
+          </w:tcPr>
+          <w:p>
+            <w:pPr>
+              <w:spacing w:after="20"/>
+            </w:pPr>
+            <w:r>
+              <w:rPr>
+                <w:rFonts w:ascii="DM Sans" w:hAnsi="DM Sans" w:cs="DM Sans"/>
+                <w:sz w:val="18"/>
+                <w:szCs w:val="18"/>
+              </w:rPr>
+              <w:t xml:space="preserve">volumes.read() to verify a volume exists; files.upload().</w:t>
+            </w:r>
+          </w:p>
+        </w:tc>
+      </w:tr>
+      <w:tr>
+        <w:tc>
+          <w:tcPr>
+            <w:tcW w:w="2600" w:type="dxa"/>
+            <w:shd w:val="clear" w:color="auto" w:fill="FFFFFF"/>
+            <w:tcMar>
+              <w:top w:w="50" w:type="dxa"/>
+              <w:bottom w:w="50" w:type="dxa"/>
+              <w:left w:w="90" w:type="dxa"/>
+              <w:right w:w="90" w:type="dxa"/>
+            </w:tcMar>
+            <w:vAlign w:val="center"/>
+          </w:tcPr>
+          <w:p>
+            <w:pPr>
+              <w:spacing w:after="20"/>
+            </w:pPr>
+            <w:r>
+              <w:rPr>
+                <w:rFonts w:ascii="Consolas" w:hAnsi="Consolas" w:cs="Consolas"/>
+                <w:color w:val="1B3139"/>
+                <w:sz w:val="18"/>
+                <w:szCs w:val="18"/>
+              </w:rPr>
+              <w:t xml:space="preserve">WRITE VOLUME</w:t>
+            </w:r>
+          </w:p>
+        </w:tc>
+        <w:tc>
+          <w:tcPr>
+            <w:tcW w:w="2400" w:type="dxa"/>
+            <w:shd w:val="clear" w:color="auto" w:fill="FFFFFF"/>
+            <w:tcMar>
+              <w:top w:w="50" w:type="dxa"/>
+              <w:bottom w:w="50" w:type="dxa"/>
+              <w:left w:w="90" w:type="dxa"/>
+              <w:right w:w="90" w:type="dxa"/>
+            </w:tcMar>
+            <w:vAlign w:val="center"/>
+          </w:tcPr>
+          <w:p>
+            <w:pPr>
+              <w:spacing w:after="20"/>
+            </w:pPr>
+            <w:r>
+              <w:rPr>
+                <w:rFonts w:ascii="DM Sans" w:hAnsi="DM Sans" w:cs="DM Sans"/>
+                <w:sz w:val="18"/>
+                <w:szCs w:val="18"/>
+              </w:rPr>
+              <w:t xml:space="preserve">target volume(s)</w:t>
+            </w:r>
+          </w:p>
+        </w:tc>
+        <w:tc>
+          <w:tcPr>
+            <w:tcW w:w="4000" w:type="dxa"/>
+            <w:shd w:val="clear" w:color="auto" w:fill="FFFFFF"/>
+            <w:tcMar>
+              <w:top w:w="50" w:type="dxa"/>
+              <w:bottom w:w="50" w:type="dxa"/>
+              <w:left w:w="90" w:type="dxa"/>
+              <w:right w:w="90" w:type="dxa"/>
+            </w:tcMar>
+            <w:vAlign w:val="center"/>
+          </w:tcPr>
+          <w:p>
+            <w:pPr>
+              <w:spacing w:after="20"/>
+            </w:pPr>
+            <w:r>
+              <w:rPr>
+                <w:rFonts w:ascii="DM Sans" w:hAnsi="DM Sans" w:cs="DM Sans"/>
+                <w:sz w:val="18"/>
+                <w:szCs w:val="18"/>
+              </w:rPr>
+              <w:t xml:space="preserve">files.upload() copies source files into the target volume.</w:t>
+            </w:r>
+          </w:p>
+        </w:tc>
+      </w:tr>
+      <w:tr>
+        <w:tc>
+          <w:tcPr>
+            <w:tcW w:w="2600" w:type="dxa"/>
+            <w:shd w:val="clear" w:color="auto" w:fill="FFFFFF"/>
+            <w:tcMar>
+              <w:top w:w="50" w:type="dxa"/>
+              <w:bottom w:w="50" w:type="dxa"/>
+              <w:left w:w="90" w:type="dxa"/>
+              <w:right w:w="90" w:type="dxa"/>
+            </w:tcMar>
+            <w:vAlign w:val="center"/>
+          </w:tcPr>
+          <w:p>
+            <w:pPr>
+              <w:spacing w:after="20"/>
+            </w:pPr>
+            <w:r>
+              <w:rPr>
+                <w:rFonts w:ascii="DM Sans" w:hAnsi="DM Sans" w:cs="DM Sans"/>
+                <w:sz w:val="18"/>
+                <w:szCs w:val="18"/>
+              </w:rPr>
+              <w:t xml:space="preserve">USE CATALOG + USE SCHEMA</w:t>
+            </w:r>
+          </w:p>
+        </w:tc>
+        <w:tc>
+          <w:tcPr>
+            <w:tcW w:w="2400" w:type="dxa"/>
+            <w:shd w:val="clear" w:color="auto" w:fill="FFFFFF"/>
+            <w:tcMar>
+              <w:top w:w="50" w:type="dxa"/>
+              <w:bottom w:w="50" w:type="dxa"/>
+              <w:left w:w="90" w:type="dxa"/>
+              <w:right w:w="90" w:type="dxa"/>
+            </w:tcMar>
+            <w:vAlign w:val="center"/>
+          </w:tcPr>
+          <w:p>
+            <w:pPr>
+              <w:spacing w:after="20"/>
+            </w:pPr>
+            <w:r>
+              <w:rPr>
+                <w:rFonts w:ascii="DM Sans" w:hAnsi="DM Sans" w:cs="DM Sans"/>
+                <w:sz w:val="18"/>
+                <w:szCs w:val="18"/>
+              </w:rPr>
+              <w:t xml:space="preserve">index catalog/schema</w:t>
+            </w:r>
+          </w:p>
+        </w:tc>
+        <w:tc>
+          <w:tcPr>
+            <w:tcW w:w="4000" w:type="dxa"/>
+            <w:shd w:val="clear" w:color="auto" w:fill="FFFFFF"/>
+            <w:tcMar>
+              <w:top w:w="50" w:type="dxa"/>
+              <w:bottom w:w="50" w:type="dxa"/>
+              <w:left w:w="90" w:type="dxa"/>
+              <w:right w:w="90" w:type="dxa"/>
+            </w:tcMar>
+            <w:vAlign w:val="center"/>
+          </w:tcPr>
+          <w:p>
+            <w:pPr>
+              <w:spacing w:after="20"/>
+            </w:pPr>
+            <w:r>
+              <w:rPr>
+                <w:rFonts w:ascii="DM Sans" w:hAnsi="DM Sans" w:cs="DM Sans"/>
+                <w:sz w:val="18"/>
+                <w:szCs w:val="18"/>
+              </w:rPr>
+              <w:t xml:space="preserve">vector_search_indexes.get_index() pre-flight check for index sources.</w:t>
+            </w:r>
+          </w:p>
+        </w:tc>
+      </w:tr>
+      <w:tr>
+        <w:tc>
+          <w:tcPr>
+            <w:tcW w:w="2600" w:type="dxa"/>
+            <w:shd w:val="clear" w:color="auto" w:fill="FFFFFF"/>
+            <w:tcMar>
+              <w:top w:w="50" w:type="dxa"/>
+              <w:bottom w:w="50" w:type="dxa"/>
+              <w:left w:w="90" w:type="dxa"/>
+              <w:right w:w="90" w:type="dxa"/>
+            </w:tcMar>
+            <w:vAlign w:val="center"/>
+          </w:tcPr>
+          <w:p>
+            <w:pPr>
+              <w:spacing w:after="20"/>
+            </w:pPr>
+            <w:r>
+              <w:rPr>
+                <w:rFonts w:ascii="DM Sans" w:hAnsi="DM Sans" w:cs="DM Sans"/>
+                <w:sz w:val="18"/>
+                <w:szCs w:val="18"/>
+              </w:rPr>
+              <w:t xml:space="preserve">Vector Search index access</w:t>
+            </w:r>
+          </w:p>
+        </w:tc>
+        <w:tc>
+          <w:tcPr>
+            <w:tcW w:w="2400" w:type="dxa"/>
+            <w:shd w:val="clear" w:color="auto" w:fill="FFFFFF"/>
+            <w:tcMar>
+              <w:top w:w="50" w:type="dxa"/>
+              <w:bottom w:w="50" w:type="dxa"/>
+              <w:left w:w="90" w:type="dxa"/>
+              <w:right w:w="90" w:type="dxa"/>
+            </w:tcMar>
+            <w:vAlign w:val="center"/>
+          </w:tcPr>
+          <w:p>
+            <w:pPr>
+              <w:spacing w:after="20"/>
+            </w:pPr>
+            <w:r>
+              <w:rPr>
+                <w:rFonts w:ascii="DM Sans" w:hAnsi="DM Sans" w:cs="DM Sans"/>
+                <w:sz w:val="18"/>
+                <w:szCs w:val="18"/>
+              </w:rPr>
+              <w:t xml:space="preserve">target index</w:t>
+            </w:r>
+          </w:p>
+        </w:tc>
+        <w:tc>
+          <w:tcPr>
+            <w:tcW w:w="4000" w:type="dxa"/>
+            <w:shd w:val="clear" w:color="auto" w:fill="FFFFFF"/>
+            <w:tcMar>
+              <w:top w:w="50" w:type="dxa"/>
+              <w:bottom w:w="50" w:type="dxa"/>
+              <w:left w:w="90" w:type="dxa"/>
+              <w:right w:w="90" w:type="dxa"/>
+            </w:tcMar>
+            <w:vAlign w:val="center"/>
+          </w:tcPr>
+          <w:p>
+            <w:pPr>
+              <w:spacing w:after="20"/>
+            </w:pPr>
+            <w:r>
+              <w:rPr>
+                <w:rFonts w:ascii="DM Sans" w:hAnsi="DM Sans" w:cs="DM Sans"/>
+                <w:sz w:val="18"/>
+                <w:szCs w:val="18"/>
+              </w:rPr>
+              <w:t xml:space="preserve">Index-based sources must already exist on target and be readable.</w:t>
+            </w:r>
+          </w:p>
+        </w:tc>
+      </w:tr>
+    </w:tbl>
+    <w:p>
+      <w:pPr>
+        <w:spacing w:before="0" w:after="80"/>
+      </w:pPr>
+      <w:r>
+        <w:rPr>
+          <w:rFonts w:ascii="DM Sans" w:hAnsi="DM Sans" w:cs="DM Sans"/>
+        </w:rPr>
+        <w:t xml:space="preserve"> </w:t>
+      </w:r>
+    </w:p>
+    <w:p>
+      <w:pPr>
+        <w:spacing w:before="0" w:after="120"/>
+      </w:pPr>
+      <w:r>
+        <w:rPr>
+          <w:rFonts w:ascii="DM Sans" w:hAnsi="DM Sans" w:cs="DM Sans"/>
+          <w:b/>
+          <w:color w:val="FF3621"/>
+          <w:sz w:val="20"/>
+          <w:szCs w:val="20"/>
+        </w:rPr>
+        <w:t xml:space="preserve">Note:  </w:t>
+      </w:r>
+      <w:r>
+        <w:rPr>
+          <w:rFonts w:ascii="DM Sans" w:hAnsi="DM Sans" w:cs="DM Sans"/>
+          <w:i/>
+          <w:color w:val="5A6872"/>
+          <w:sz w:val="20"/>
+          <w:szCs w:val="20"/>
+        </w:rPr>
+        <w:t xml:space="preserve">If copy_volumes=false, the target volume must already exist and be readable — the job only verifies it (volumes.read) and will fail if missing.</w:t>
+      </w:r>
+    </w:p>
+    <w:p>
+      <w:pPr>
+        <w:pStyle w:val="Heading2"/>
+        <w:spacing w:before="0" w:after="120"/>
+      </w:pPr>
+      <w:r>
+        <w:rPr>
+          <w:rFonts w:ascii="DM Sans" w:hAnsi="DM Sans" w:cs="DM Sans"/>
+        </w:rPr>
+        <w:t xml:space="preserve">TARGET identity — status tables</w:t>
+      </w:r>
+    </w:p>
+    <w:p>
+      <w:pPr>
+        <w:spacing w:before="0" w:after="120"/>
+      </w:pPr>
+      <w:r>
+        <w:rPr>
+          <w:rFonts w:ascii="DM Sans" w:hAnsi="DM Sans" w:cs="DM Sans"/>
+        </w:rPr>
+        <w:t xml:space="preserve">The jobs create and write two Delta tables (ka_deployment_status, ka_examples_status) under the target catalog/schema.</w:t>
+      </w:r>
+    </w:p>
+    <w:p>
+      <w:pPr>
+        <w:ind w:left="360" w:hanging="180"/>
+        <w:spacing w:after="60"/>
+      </w:pPr>
+      <w:r>
+        <w:rPr>
+          <w:rFonts w:ascii="DM Sans" w:hAnsi="DM Sans" w:cs="DM Sans"/>
+          <w:b/>
+          <w:color w:val="FF3621"/>
+        </w:rPr>
+        <w:t xml:space="preserve">•  </w:t>
+      </w:r>
+      <w:r>
+        <w:rPr>
+          <w:rFonts w:ascii="DM Sans" w:hAnsi="DM Sans" w:cs="DM Sans"/>
+        </w:rPr>
+        <w:t xml:space="preserve">CREATE TABLE on the target schema (tables are auto-created on first run; ALTER TABLE for migrations).</w:t>
+      </w:r>
+    </w:p>
+    <w:p>
+      <w:pPr>
+        <w:ind w:left="360" w:hanging="180"/>
+        <w:spacing w:after="60"/>
+      </w:pPr>
+      <w:r>
+        <w:rPr>
+          <w:rFonts w:ascii="DM Sans" w:hAnsi="DM Sans" w:cs="DM Sans"/>
+          <w:b/>
+          <w:color w:val="FF3621"/>
+        </w:rPr>
+        <w:t xml:space="preserve">•  </w:t>
+      </w:r>
+      <w:r>
+        <w:rPr>
+          <w:rFonts w:ascii="DM Sans" w:hAnsi="DM Sans" w:cs="DM Sans"/>
+        </w:rPr>
+        <w:t xml:space="preserve">MODIFY / SELECT on those tables (INSERT and UPDATE status rows).</w:t>
+      </w:r>
+    </w:p>
+    <w:p>
+      <w:pPr>
+        <w:pStyle w:val="Heading2"/>
+        <w:spacing w:before="0" w:after="120"/>
+      </w:pPr>
+      <w:r>
+        <w:rPr>
+          <w:rFonts w:ascii="DM Sans" w:hAnsi="DM Sans" w:cs="DM Sans"/>
+        </w:rPr>
+        <w:t xml:space="preserve">SOURCE identity</w:t>
+      </w:r>
+    </w:p>
+    <w:p>
+      <w:pPr>
+        <w:spacing w:before="0" w:after="120"/>
+      </w:pPr>
+      <w:r>
+        <w:rPr>
+          <w:rFonts w:ascii="DM Sans" w:hAnsi="DM Sans" w:cs="DM Sans"/>
+        </w:rPr>
+        <w:t xml:space="preserve">Used to export KA definitions and (optionally) read volume files from the source workspace.</w:t>
+      </w:r>
+    </w:p>
+    <w:p>
+      <w:pPr>
+        <w:ind w:left="360" w:hanging="180"/>
+        <w:spacing w:after="60"/>
+      </w:pPr>
+      <w:r>
+        <w:rPr>
+          <w:rFonts w:ascii="DM Sans" w:hAnsi="DM Sans" w:cs="DM Sans"/>
+          <w:b/>
+          <w:color w:val="FF3621"/>
+        </w:rPr>
+        <w:t xml:space="preserve">•  </w:t>
+      </w:r>
+      <w:r>
+        <w:rPr>
+          <w:rFonts w:ascii="DM Sans" w:hAnsi="DM Sans" w:cs="DM Sans"/>
+        </w:rPr>
+        <w:t xml:space="preserve">Read Knowledge Assistants: GET knowledge-assistants, its knowledge-sources, and examples (can-view on the KAs to migrate).</w:t>
+      </w:r>
+    </w:p>
+    <w:p>
+      <w:pPr>
+        <w:ind w:left="360" w:hanging="180"/>
+        <w:spacing w:after="60"/>
+      </w:pPr>
+      <w:r>
+        <w:rPr>
+          <w:rFonts w:ascii="DM Sans" w:hAnsi="DM Sans" w:cs="DM Sans"/>
+          <w:b/>
+          <w:color w:val="FF3621"/>
+        </w:rPr>
+        <w:t xml:space="preserve">•  </w:t>
+      </w:r>
+      <w:r>
+        <w:rPr>
+          <w:rFonts w:ascii="DM Sans" w:hAnsi="DM Sans" w:cs="DM Sans"/>
+        </w:rPr>
+        <w:t xml:space="preserve">READ VOLUME on any file-based source volumes (files.list_directory_contents + files.download) when copy_volumes=true.</w:t>
+      </w:r>
+    </w:p>
+    <w:p>
+      <w:pPr>
+        <w:ind w:left="360" w:hanging="180"/>
+        <w:spacing w:after="60"/>
+      </w:pPr>
+      <w:r>
+        <w:rPr>
+          <w:rFonts w:ascii="DM Sans" w:hAnsi="DM Sans" w:cs="DM Sans"/>
+          <w:b/>
+          <w:color w:val="FF3621"/>
+        </w:rPr>
+        <w:t xml:space="preserve">•  </w:t>
+      </w:r>
+      <w:r>
+        <w:rPr>
+          <w:rFonts w:ascii="DM Sans" w:hAnsi="DM Sans" w:cs="DM Sans"/>
+        </w:rPr>
+        <w:t xml:space="preserve">USE CATALOG / USE SCHEMA on the source catalog/schema backing those volumes.</w:t>
+      </w:r>
+    </w:p>
+    <w:p>
+      <w:pPr>
+        <w:pStyle w:val="Heading2"/>
+        <w:spacing w:before="0" w:after="120"/>
+      </w:pPr>
+      <w:r>
+        <w:rPr>
+          <w:rFonts w:ascii="DM Sans" w:hAnsi="DM Sans" w:cs="DM Sans"/>
+        </w:rPr>
+        <w:t xml:space="preserve">Credentials / secret scope</w:t>
+      </w:r>
+    </w:p>
+    <w:p>
+      <w:pPr>
+        <w:ind w:left="360" w:hanging="180"/>
+        <w:spacing w:after="60"/>
+      </w:pPr>
+      <w:r>
+        <w:rPr>
+          <w:rFonts w:ascii="DM Sans" w:hAnsi="DM Sans" w:cs="DM Sans"/>
+          <w:b/>
+          <w:color w:val="FF3621"/>
+        </w:rPr>
+        <w:t xml:space="preserve">•  </w:t>
+      </w:r>
+      <w:r>
+        <w:rPr>
+          <w:rFonts w:ascii="DM Sans" w:hAnsi="DM Sans" w:cs="DM Sans"/>
+        </w:rPr>
+        <w:t xml:space="preserve">The CI identity (or you, locally) can create/write the Databricks secret scope named by secret_scope.</w:t>
+      </w:r>
+    </w:p>
+    <w:p>
+      <w:pPr>
+        <w:ind w:left="360" w:hanging="180"/>
+        <w:spacing w:after="60"/>
+      </w:pPr>
+      <w:r>
+        <w:rPr>
+          <w:rFonts w:ascii="DM Sans" w:hAnsi="DM Sans" w:cs="DM Sans"/>
+          <w:b/>
+          <w:color w:val="FF3621"/>
+        </w:rPr>
+        <w:t xml:space="preserve">•  </w:t>
+      </w:r>
+      <w:r>
+        <w:rPr>
+          <w:rFonts w:ascii="DM Sans" w:hAnsi="DM Sans" w:cs="DM Sans"/>
+        </w:rPr>
+        <w:t xml:space="preserve">Source SP credentials (client id + secret) OR a source PAT are stored under the scope keys source-client-id, source-client-secret, source-token.</w:t>
+      </w:r>
+    </w:p>
+    <w:p>
+      <w:pPr>
+        <w:ind w:left="360" w:hanging="180"/>
+        <w:spacing w:after="60"/>
+      </w:pPr>
+      <w:r>
+        <w:rPr>
+          <w:rFonts w:ascii="DM Sans" w:hAnsi="DM Sans" w:cs="DM Sans"/>
+          <w:b/>
+          <w:color w:val="FF3621"/>
+        </w:rPr>
+        <w:t xml:space="preserve">•  </w:t>
+      </w:r>
+      <w:r>
+        <w:rPr>
+          <w:rFonts w:ascii="DM Sans" w:hAnsi="DM Sans" w:cs="DM Sans"/>
+        </w:rPr>
+        <w:t xml:space="preserve">Target auth: SP (DATABRICKS_CLIENT_ID + SECRET) is tried first, then the PAT falls back — provide at least one.</w:t>
+      </w:r>
+    </w:p>
+    <w:p>
+      <w:pPr>
+        <w:pStyle w:val="Heading2"/>
+        <w:spacing w:before="0" w:after="120"/>
+      </w:pPr>
+      <w:r>
+        <w:rPr>
+          <w:rFonts w:ascii="DM Sans" w:hAnsi="DM Sans" w:cs="DM Sans"/>
+        </w:rPr>
+        <w:t xml:space="preserve">Quick pre-flight checklist</w:t>
+      </w:r>
+    </w:p>
+    <w:tbl>
+      <w:tblPr>
+        <w:tblW w:w="9000" w:type="dxa"/>
+        <w:tblLayout w:type="fixed"/>
+        <w:tblBorders>
+          <w:top w:val="single" w:sz="4" w:color="C6CDD2"/>
+          <w:left w:val="single" w:sz="4" w:color="C6CDD2"/>
+          <w:bottom w:val="single" w:sz="4" w:color="C6CDD2"/>
+          <w:right w:val="single" w:sz="4" w:color="C6CDD2"/>
+          <w:insideH w:val="single" w:sz="4" w:color="C6CDD2"/>
+          <w:insideV w:val="single" w:sz="4" w:color="C6CDD2"/>
+        </w:tblBorders>
+      </w:tblPr>
+      <w:tblGrid>
+        <w:gridCol w:w="500"/>
+        <w:gridCol w:w="6100"/>
+        <w:gridCol w:w="2400"/>
+      </w:tblGrid>
+      <w:tr>
+        <w:tc>
+          <w:tcPr>
+            <w:tcW w:w="500" w:type="dxa"/>
+            <w:shd w:val="clear" w:color="auto" w:fill="1B3139"/>
+            <w:tcMar>
+              <w:top w:w="50" w:type="dxa"/>
+              <w:bottom w:w="50" w:type="dxa"/>
+              <w:left w:w="90" w:type="dxa"/>
+              <w:right w:w="90" w:type="dxa"/>
+            </w:tcMar>
+            <w:vAlign w:val="center"/>
+          </w:tcPr>
+          <w:p>
+            <w:pPr>
+              <w:spacing w:after="20"/>
+            </w:pPr>
+            <w:r>
+              <w:rPr>
+                <w:rFonts w:ascii="DM Sans" w:hAnsi="DM Sans" w:cs="DM Sans"/>
+                <w:b/>
+                <w:color w:val="FFFFFF"/>
+                <w:sz w:val="18"/>
+                <w:szCs w:val="18"/>
+              </w:rPr>
+              <w:t xml:space="preserve">#</w:t>
+            </w:r>
+          </w:p>
+        </w:tc>
+        <w:tc>
+          <w:tcPr>
+            <w:tcW w:w="6100" w:type="dxa"/>
+            <w:shd w:val="clear" w:color="auto" w:fill="1B3139"/>
+            <w:tcMar>
+              <w:top w:w="50" w:type="dxa"/>
+              <w:bottom w:w="50" w:type="dxa"/>
+              <w:left w:w="90" w:type="dxa"/>
+              <w:right w:w="90" w:type="dxa"/>
+            </w:tcMar>
+            <w:vAlign w:val="center"/>
+          </w:tcPr>
+          <w:p>
+            <w:pPr>
+              <w:spacing w:after="20"/>
+            </w:pPr>
+            <w:r>
+              <w:rPr>
+                <w:rFonts w:ascii="DM Sans" w:hAnsi="DM Sans" w:cs="DM Sans"/>
+                <w:b/>
+                <w:color w:val="FFFFFF"/>
+                <w:sz w:val="18"/>
+                <w:szCs w:val="18"/>
+              </w:rPr>
+              <w:t xml:space="preserve">Check</w:t>
+            </w:r>
+          </w:p>
+        </w:tc>
+        <w:tc>
+          <w:tcPr>
+            <w:tcW w:w="2400" w:type="dxa"/>
+            <w:shd w:val="clear" w:color="auto" w:fill="1B3139"/>
+            <w:tcMar>
+              <w:top w:w="50" w:type="dxa"/>
+              <w:bottom w:w="50" w:type="dxa"/>
+              <w:left w:w="90" w:type="dxa"/>
+              <w:right w:w="90" w:type="dxa"/>
+            </w:tcMar>
+            <w:vAlign w:val="center"/>
+          </w:tcPr>
+          <w:p>
+            <w:pPr>
+              <w:spacing w:after="20"/>
+            </w:pPr>
+            <w:r>
+              <w:rPr>
+                <w:rFonts w:ascii="DM Sans" w:hAnsi="DM Sans" w:cs="DM Sans"/>
+                <w:b/>
+                <w:color w:val="FFFFFF"/>
+                <w:sz w:val="18"/>
+                <w:szCs w:val="18"/>
+              </w:rPr>
+              <w:t xml:space="preserve">Where</w:t>
+            </w:r>
+          </w:p>
+        </w:tc>
+      </w:tr>
+      <w:tr>
+        <w:tc>
+          <w:tcPr>
+            <w:tcW w:w="500" w:type="dxa"/>
+            <w:shd w:val="clear" w:color="auto" w:fill="FFFFFF"/>
+            <w:tcMar>
+              <w:top w:w="50" w:type="dxa"/>
+              <w:bottom w:w="50" w:type="dxa"/>
+              <w:left w:w="90" w:type="dxa"/>
+              <w:right w:w="90" w:type="dxa"/>
+            </w:tcMar>
+            <w:vAlign w:val="center"/>
+          </w:tcPr>
+          <w:p>
+            <w:pPr>
+              <w:spacing w:after="20"/>
+            </w:pPr>
+            <w:r>
+              <w:rPr>
+                <w:rFonts w:ascii="DM Sans" w:hAnsi="DM Sans" w:cs="DM Sans"/>
+                <w:sz w:val="18"/>
+                <w:szCs w:val="18"/>
+              </w:rPr>
+              <w:t xml:space="preserve">1</w:t>
+            </w:r>
+          </w:p>
+        </w:tc>
+        <w:tc>
+          <w:tcPr>
+            <w:tcW w:w="6100" w:type="dxa"/>
+            <w:shd w:val="clear" w:color="auto" w:fill="FFFFFF"/>
+            <w:tcMar>
+              <w:top w:w="50" w:type="dxa"/>
+              <w:bottom w:w="50" w:type="dxa"/>
+              <w:left w:w="90" w:type="dxa"/>
+              <w:right w:w="90" w:type="dxa"/>
+            </w:tcMar>
+            <w:vAlign w:val="center"/>
+          </w:tcPr>
+          <w:p>
+            <w:pPr>
+              <w:spacing w:after="20"/>
+            </w:pPr>
+            <w:r>
+              <w:rPr>
+                <w:rFonts w:ascii="DM Sans" w:hAnsi="DM Sans" w:cs="DM Sans"/>
+                <w:sz w:val="18"/>
+                <w:szCs w:val="18"/>
+              </w:rPr>
+              <w:t xml:space="preserve">SP/PAT can create &amp; manage KAs</w:t>
+            </w:r>
+          </w:p>
+        </w:tc>
+        <w:tc>
+          <w:tcPr>
+            <w:tcW w:w="2400" w:type="dxa"/>
+            <w:shd w:val="clear" w:color="auto" w:fill="FFFFFF"/>
+            <w:tcMar>
+              <w:top w:w="50" w:type="dxa"/>
+              <w:bottom w:w="50" w:type="dxa"/>
+              <w:left w:w="90" w:type="dxa"/>
+              <w:right w:w="90" w:type="dxa"/>
+            </w:tcMar>
+            <w:vAlign w:val="center"/>
+          </w:tcPr>
+          <w:p>
+            <w:pPr>
+              <w:spacing w:after="20"/>
+            </w:pPr>
+            <w:r>
+              <w:rPr>
+                <w:rFonts w:ascii="DM Sans" w:hAnsi="DM Sans" w:cs="DM Sans"/>
+                <w:sz w:val="18"/>
+                <w:szCs w:val="18"/>
+              </w:rPr>
+              <w:t xml:space="preserve">Target workspace</w:t>
+            </w:r>
+          </w:p>
+        </w:tc>
+      </w:tr>
+      <w:tr>
+        <w:tc>
+          <w:tcPr>
+            <w:tcW w:w="500" w:type="dxa"/>
+            <w:shd w:val="clear" w:color="auto" w:fill="FFFFFF"/>
+            <w:tcMar>
+              <w:top w:w="50" w:type="dxa"/>
+              <w:bottom w:w="50" w:type="dxa"/>
+              <w:left w:w="90" w:type="dxa"/>
+              <w:right w:w="90" w:type="dxa"/>
+            </w:tcMar>
+            <w:vAlign w:val="center"/>
+          </w:tcPr>
+          <w:p>
+            <w:pPr>
+              <w:spacing w:after="20"/>
+            </w:pPr>
+            <w:r>
+              <w:rPr>
+                <w:rFonts w:ascii="DM Sans" w:hAnsi="DM Sans" w:cs="DM Sans"/>
+                <w:sz w:val="18"/>
+                <w:szCs w:val="18"/>
+              </w:rPr>
+              <w:t xml:space="preserve">2</w:t>
+            </w:r>
+          </w:p>
+        </w:tc>
+        <w:tc>
+          <w:tcPr>
+            <w:tcW w:w="6100" w:type="dxa"/>
+            <w:shd w:val="clear" w:color="auto" w:fill="FFFFFF"/>
+            <w:tcMar>
+              <w:top w:w="50" w:type="dxa"/>
+              <w:bottom w:w="50" w:type="dxa"/>
+              <w:left w:w="90" w:type="dxa"/>
+              <w:right w:w="90" w:type="dxa"/>
+            </w:tcMar>
+            <w:vAlign w:val="center"/>
+          </w:tcPr>
+          <w:p>
+            <w:pPr>
+              <w:spacing w:after="20"/>
+            </w:pPr>
+            <w:r>
+              <w:rPr>
+                <w:rFonts w:ascii="DM Sans" w:hAnsi="DM Sans" w:cs="DM Sans"/>
+                <w:sz w:val="18"/>
+                <w:szCs w:val="18"/>
+              </w:rPr>
+              <w:t xml:space="preserve">User role on a serverless usage policy</w:t>
+            </w:r>
+          </w:p>
+        </w:tc>
+        <w:tc>
+          <w:tcPr>
+            <w:tcW w:w="2400" w:type="dxa"/>
+            <w:shd w:val="clear" w:color="auto" w:fill="FFFFFF"/>
+            <w:tcMar>
+              <w:top w:w="50" w:type="dxa"/>
+              <w:bottom w:w="50" w:type="dxa"/>
+              <w:left w:w="90" w:type="dxa"/>
+              <w:right w:w="90" w:type="dxa"/>
+            </w:tcMar>
+            <w:vAlign w:val="center"/>
+          </w:tcPr>
+          <w:p>
+            <w:pPr>
+              <w:spacing w:after="20"/>
+            </w:pPr>
+            <w:r>
+              <w:rPr>
+                <w:rFonts w:ascii="DM Sans" w:hAnsi="DM Sans" w:cs="DM Sans"/>
+                <w:sz w:val="18"/>
+                <w:szCs w:val="18"/>
+              </w:rPr>
+              <w:t xml:space="preserve">Target workspace</w:t>
+            </w:r>
+          </w:p>
+        </w:tc>
+      </w:tr>
+      <w:tr>
+        <w:tc>
+          <w:tcPr>
+            <w:tcW w:w="500" w:type="dxa"/>
+            <w:shd w:val="clear" w:color="auto" w:fill="FFFFFF"/>
+            <w:tcMar>
+              <w:top w:w="50" w:type="dxa"/>
+              <w:bottom w:w="50" w:type="dxa"/>
+              <w:left w:w="90" w:type="dxa"/>
+              <w:right w:w="90" w:type="dxa"/>
+            </w:tcMar>
+            <w:vAlign w:val="center"/>
+          </w:tcPr>
+          <w:p>
+            <w:pPr>
+              <w:spacing w:after="20"/>
+            </w:pPr>
+            <w:r>
+              <w:rPr>
+                <w:rFonts w:ascii="DM Sans" w:hAnsi="DM Sans" w:cs="DM Sans"/>
+                <w:sz w:val="18"/>
+                <w:szCs w:val="18"/>
+              </w:rPr>
+              <w:t xml:space="preserve">3</w:t>
+            </w:r>
+          </w:p>
+        </w:tc>
+        <w:tc>
+          <w:tcPr>
+            <w:tcW w:w="6100" w:type="dxa"/>
+            <w:shd w:val="clear" w:color="auto" w:fill="FFFFFF"/>
+            <w:tcMar>
+              <w:top w:w="50" w:type="dxa"/>
+              <w:bottom w:w="50" w:type="dxa"/>
+              <w:left w:w="90" w:type="dxa"/>
+              <w:right w:w="90" w:type="dxa"/>
+            </w:tcMar>
+            <w:vAlign w:val="center"/>
+          </w:tcPr>
+          <w:p>
+            <w:pPr>
+              <w:spacing w:after="20"/>
+            </w:pPr>
+            <w:r>
+              <w:rPr>
+                <w:rFonts w:ascii="DM Sans" w:hAnsi="DM Sans" w:cs="DM Sans"/>
+                <w:sz w:val="18"/>
+                <w:szCs w:val="18"/>
+              </w:rPr>
+              <w:t xml:space="preserve">USE CATALOG + USE SCHEMA granted</w:t>
+            </w:r>
+          </w:p>
+        </w:tc>
+        <w:tc>
+          <w:tcPr>
+            <w:tcW w:w="2400" w:type="dxa"/>
+            <w:shd w:val="clear" w:color="auto" w:fill="FFFFFF"/>
+            <w:tcMar>
+              <w:top w:w="50" w:type="dxa"/>
+              <w:bottom w:w="50" w:type="dxa"/>
+              <w:left w:w="90" w:type="dxa"/>
+              <w:right w:w="90" w:type="dxa"/>
+            </w:tcMar>
+            <w:vAlign w:val="center"/>
+          </w:tcPr>
+          <w:p>
+            <w:pPr>
+              <w:spacing w:after="20"/>
+            </w:pPr>
+            <w:r>
+              <w:rPr>
+                <w:rFonts w:ascii="DM Sans" w:hAnsi="DM Sans" w:cs="DM Sans"/>
+                <w:sz w:val="18"/>
+                <w:szCs w:val="18"/>
+              </w:rPr>
+              <w:t xml:space="preserve">Target catalog/schema</w:t>
+            </w:r>
+          </w:p>
+        </w:tc>
+      </w:tr>
+      <w:tr>
+        <w:tc>
+          <w:tcPr>
+            <w:tcW w:w="500" w:type="dxa"/>
+            <w:shd w:val="clear" w:color="auto" w:fill="FFFFFF"/>
+            <w:tcMar>
+              <w:top w:w="50" w:type="dxa"/>
+              <w:bottom w:w="50" w:type="dxa"/>
+              <w:left w:w="90" w:type="dxa"/>
+              <w:right w:w="90" w:type="dxa"/>
+            </w:tcMar>
+            <w:vAlign w:val="center"/>
+          </w:tcPr>
+          <w:p>
+            <w:pPr>
+              <w:spacing w:after="20"/>
+            </w:pPr>
+            <w:r>
+              <w:rPr>
+                <w:rFonts w:ascii="DM Sans" w:hAnsi="DM Sans" w:cs="DM Sans"/>
+                <w:sz w:val="18"/>
+                <w:szCs w:val="18"/>
+              </w:rPr>
+              <w:t xml:space="preserve">4</w:t>
+            </w:r>
+          </w:p>
+        </w:tc>
+        <w:tc>
+          <w:tcPr>
+            <w:tcW w:w="6100" w:type="dxa"/>
+            <w:shd w:val="clear" w:color="auto" w:fill="FFFFFF"/>
+            <w:tcMar>
+              <w:top w:w="50" w:type="dxa"/>
+              <w:bottom w:w="50" w:type="dxa"/>
+              <w:left w:w="90" w:type="dxa"/>
+              <w:right w:w="90" w:type="dxa"/>
+            </w:tcMar>
+            <w:vAlign w:val="center"/>
+          </w:tcPr>
+          <w:p>
+            <w:pPr>
+              <w:spacing w:after="20"/>
+            </w:pPr>
+            <w:r>
+              <w:rPr>
+                <w:rFonts w:ascii="DM Sans" w:hAnsi="DM Sans" w:cs="DM Sans"/>
+                <w:sz w:val="18"/>
+                <w:szCs w:val="18"/>
+              </w:rPr>
+              <w:t xml:space="preserve">CREATE/READ/WRITE VOLUME (if copy_volumes=true)</w:t>
+            </w:r>
+          </w:p>
+        </w:tc>
+        <w:tc>
+          <w:tcPr>
+            <w:tcW w:w="2400" w:type="dxa"/>
+            <w:shd w:val="clear" w:color="auto" w:fill="FFFFFF"/>
+            <w:tcMar>
+              <w:top w:w="50" w:type="dxa"/>
+              <w:bottom w:w="50" w:type="dxa"/>
+              <w:left w:w="90" w:type="dxa"/>
+              <w:right w:w="90" w:type="dxa"/>
+            </w:tcMar>
+            <w:vAlign w:val="center"/>
+          </w:tcPr>
+          <w:p>
+            <w:pPr>
+              <w:spacing w:after="20"/>
+            </w:pPr>
+            <w:r>
+              <w:rPr>
+                <w:rFonts w:ascii="DM Sans" w:hAnsi="DM Sans" w:cs="DM Sans"/>
+                <w:sz w:val="18"/>
+                <w:szCs w:val="18"/>
+              </w:rPr>
+              <w:t xml:space="preserve">Target schema/volumes</w:t>
+            </w:r>
+          </w:p>
+        </w:tc>
+      </w:tr>
+      <w:tr>
+        <w:tc>
+          <w:tcPr>
+            <w:tcW w:w="500" w:type="dxa"/>
+            <w:shd w:val="clear" w:color="auto" w:fill="FFFFFF"/>
+            <w:tcMar>
+              <w:top w:w="50" w:type="dxa"/>
+              <w:bottom w:w="50" w:type="dxa"/>
+              <w:left w:w="90" w:type="dxa"/>
+              <w:right w:w="90" w:type="dxa"/>
+            </w:tcMar>
+            <w:vAlign w:val="center"/>
+          </w:tcPr>
+          <w:p>
+            <w:pPr>
+              <w:spacing w:after="20"/>
+            </w:pPr>
+            <w:r>
+              <w:rPr>
+                <w:rFonts w:ascii="DM Sans" w:hAnsi="DM Sans" w:cs="DM Sans"/>
+                <w:sz w:val="18"/>
+                <w:szCs w:val="18"/>
+              </w:rPr>
+              <w:t xml:space="preserve">5</w:t>
+            </w:r>
+          </w:p>
+        </w:tc>
+        <w:tc>
+          <w:tcPr>
+            <w:tcW w:w="6100" w:type="dxa"/>
+            <w:shd w:val="clear" w:color="auto" w:fill="FFFFFF"/>
+            <w:tcMar>
+              <w:top w:w="50" w:type="dxa"/>
+              <w:bottom w:w="50" w:type="dxa"/>
+              <w:left w:w="90" w:type="dxa"/>
+              <w:right w:w="90" w:type="dxa"/>
+            </w:tcMar>
+            <w:vAlign w:val="center"/>
+          </w:tcPr>
+          <w:p>
+            <w:pPr>
+              <w:spacing w:after="20"/>
+            </w:pPr>
+            <w:r>
+              <w:rPr>
+                <w:rFonts w:ascii="DM Sans" w:hAnsi="DM Sans" w:cs="DM Sans"/>
+                <w:sz w:val="18"/>
+                <w:szCs w:val="18"/>
+              </w:rPr>
+              <w:t xml:space="preserve">Vector index exists &amp; readable (index sources)</w:t>
+            </w:r>
+          </w:p>
+        </w:tc>
+        <w:tc>
+          <w:tcPr>
+            <w:tcW w:w="2400" w:type="dxa"/>
+            <w:shd w:val="clear" w:color="auto" w:fill="FFFFFF"/>
+            <w:tcMar>
+              <w:top w:w="50" w:type="dxa"/>
+              <w:bottom w:w="50" w:type="dxa"/>
+              <w:left w:w="90" w:type="dxa"/>
+              <w:right w:w="90" w:type="dxa"/>
+            </w:tcMar>
+            <w:vAlign w:val="center"/>
+          </w:tcPr>
+          <w:p>
+            <w:pPr>
+              <w:spacing w:after="20"/>
+            </w:pPr>
+            <w:r>
+              <w:rPr>
+                <w:rFonts w:ascii="DM Sans" w:hAnsi="DM Sans" w:cs="DM Sans"/>
+                <w:sz w:val="18"/>
+                <w:szCs w:val="18"/>
+              </w:rPr>
+              <w:t xml:space="preserve">Target</w:t>
+            </w:r>
+          </w:p>
+        </w:tc>
+      </w:tr>
+      <w:tr>
+        <w:tc>
+          <w:tcPr>
+            <w:tcW w:w="500" w:type="dxa"/>
+            <w:shd w:val="clear" w:color="auto" w:fill="FFFFFF"/>
+            <w:tcMar>
+              <w:top w:w="50" w:type="dxa"/>
+              <w:bottom w:w="50" w:type="dxa"/>
+              <w:left w:w="90" w:type="dxa"/>
+              <w:right w:w="90" w:type="dxa"/>
+            </w:tcMar>
+            <w:vAlign w:val="center"/>
+          </w:tcPr>
+          <w:p>
+            <w:pPr>
+              <w:spacing w:after="20"/>
+            </w:pPr>
+            <w:r>
+              <w:rPr>
+                <w:rFonts w:ascii="DM Sans" w:hAnsi="DM Sans" w:cs="DM Sans"/>
+                <w:sz w:val="18"/>
+                <w:szCs w:val="18"/>
+              </w:rPr>
+              <w:t xml:space="preserve">6</w:t>
+            </w:r>
+          </w:p>
+        </w:tc>
+        <w:tc>
+          <w:tcPr>
+            <w:tcW w:w="6100" w:type="dxa"/>
+            <w:shd w:val="clear" w:color="auto" w:fill="FFFFFF"/>
+            <w:tcMar>
+              <w:top w:w="50" w:type="dxa"/>
+              <w:bottom w:w="50" w:type="dxa"/>
+              <w:left w:w="90" w:type="dxa"/>
+              <w:right w:w="90" w:type="dxa"/>
+            </w:tcMar>
+            <w:vAlign w:val="center"/>
+          </w:tcPr>
+          <w:p>
+            <w:pPr>
+              <w:spacing w:after="20"/>
+            </w:pPr>
+            <w:r>
+              <w:rPr>
+                <w:rFonts w:ascii="DM Sans" w:hAnsi="DM Sans" w:cs="DM Sans"/>
+                <w:sz w:val="18"/>
+                <w:szCs w:val="18"/>
+              </w:rPr>
+              <w:t xml:space="preserve">CREATE TABLE + MODIFY on status tables</w:t>
+            </w:r>
+          </w:p>
+        </w:tc>
+        <w:tc>
+          <w:tcPr>
+            <w:tcW w:w="2400" w:type="dxa"/>
+            <w:shd w:val="clear" w:color="auto" w:fill="FFFFFF"/>
+            <w:tcMar>
+              <w:top w:w="50" w:type="dxa"/>
+              <w:bottom w:w="50" w:type="dxa"/>
+              <w:left w:w="90" w:type="dxa"/>
+              <w:right w:w="90" w:type="dxa"/>
+            </w:tcMar>
+            <w:vAlign w:val="center"/>
+          </w:tcPr>
+          <w:p>
+            <w:pPr>
+              <w:spacing w:after="20"/>
+            </w:pPr>
+            <w:r>
+              <w:rPr>
+                <w:rFonts w:ascii="DM Sans" w:hAnsi="DM Sans" w:cs="DM Sans"/>
+                <w:sz w:val="18"/>
+                <w:szCs w:val="18"/>
+              </w:rPr>
+              <w:t xml:space="preserve">Target schema</w:t>
+            </w:r>
+          </w:p>
+        </w:tc>
+      </w:tr>
+      <w:tr>
+        <w:tc>
+          <w:tcPr>
+            <w:tcW w:w="500" w:type="dxa"/>
+            <w:shd w:val="clear" w:color="auto" w:fill="FFFFFF"/>
+            <w:tcMar>
+              <w:top w:w="50" w:type="dxa"/>
+              <w:bottom w:w="50" w:type="dxa"/>
+              <w:left w:w="90" w:type="dxa"/>
+              <w:right w:w="90" w:type="dxa"/>
+            </w:tcMar>
+            <w:vAlign w:val="center"/>
+          </w:tcPr>
+          <w:p>
+            <w:pPr>
+              <w:spacing w:after="20"/>
+            </w:pPr>
+            <w:r>
+              <w:rPr>
+                <w:rFonts w:ascii="DM Sans" w:hAnsi="DM Sans" w:cs="DM Sans"/>
+                <w:sz w:val="18"/>
+                <w:szCs w:val="18"/>
+              </w:rPr>
+              <w:t xml:space="preserve">7</w:t>
+            </w:r>
+          </w:p>
+        </w:tc>
+        <w:tc>
+          <w:tcPr>
+            <w:tcW w:w="6100" w:type="dxa"/>
+            <w:shd w:val="clear" w:color="auto" w:fill="FFFFFF"/>
+            <w:tcMar>
+              <w:top w:w="50" w:type="dxa"/>
+              <w:bottom w:w="50" w:type="dxa"/>
+              <w:left w:w="90" w:type="dxa"/>
+              <w:right w:w="90" w:type="dxa"/>
+            </w:tcMar>
+            <w:vAlign w:val="center"/>
+          </w:tcPr>
+          <w:p>
+            <w:pPr>
+              <w:spacing w:after="20"/>
+            </w:pPr>
+            <w:r>
+              <w:rPr>
+                <w:rFonts w:ascii="DM Sans" w:hAnsi="DM Sans" w:cs="DM Sans"/>
+                <w:sz w:val="18"/>
+                <w:szCs w:val="18"/>
+              </w:rPr>
+              <w:t xml:space="preserve">Can view/read KAs to migrate + their examples</w:t>
+            </w:r>
+          </w:p>
+        </w:tc>
+        <w:tc>
+          <w:tcPr>
+            <w:tcW w:w="2400" w:type="dxa"/>
+            <w:shd w:val="clear" w:color="auto" w:fill="FFFFFF"/>
+            <w:tcMar>
+              <w:top w:w="50" w:type="dxa"/>
+              <w:bottom w:w="50" w:type="dxa"/>
+              <w:left w:w="90" w:type="dxa"/>
+              <w:right w:w="90" w:type="dxa"/>
+            </w:tcMar>
+            <w:vAlign w:val="center"/>
+          </w:tcPr>
+          <w:p>
+            <w:pPr>
+              <w:spacing w:after="20"/>
+            </w:pPr>
+            <w:r>
+              <w:rPr>
+                <w:rFonts w:ascii="DM Sans" w:hAnsi="DM Sans" w:cs="DM Sans"/>
+                <w:sz w:val="18"/>
+                <w:szCs w:val="18"/>
+              </w:rPr>
+              <w:t xml:space="preserve">Source workspace</w:t>
+            </w:r>
+          </w:p>
+        </w:tc>
+      </w:tr>
+      <w:tr>
+        <w:tc>
+          <w:tcPr>
+            <w:tcW w:w="500" w:type="dxa"/>
+            <w:shd w:val="clear" w:color="auto" w:fill="FFFFFF"/>
+            <w:tcMar>
+              <w:top w:w="50" w:type="dxa"/>
+              <w:bottom w:w="50" w:type="dxa"/>
+              <w:left w:w="90" w:type="dxa"/>
+              <w:right w:w="90" w:type="dxa"/>
+            </w:tcMar>
+            <w:vAlign w:val="center"/>
+          </w:tcPr>
+          <w:p>
+            <w:pPr>
+              <w:spacing w:after="20"/>
+            </w:pPr>
+            <w:r>
+              <w:rPr>
+                <w:rFonts w:ascii="DM Sans" w:hAnsi="DM Sans" w:cs="DM Sans"/>
+                <w:sz w:val="18"/>
+                <w:szCs w:val="18"/>
+              </w:rPr>
+              <w:t xml:space="preserve">8</w:t>
+            </w:r>
+          </w:p>
+        </w:tc>
+        <w:tc>
+          <w:tcPr>
+            <w:tcW w:w="6100" w:type="dxa"/>
+            <w:shd w:val="clear" w:color="auto" w:fill="FFFFFF"/>
+            <w:tcMar>
+              <w:top w:w="50" w:type="dxa"/>
+              <w:bottom w:w="50" w:type="dxa"/>
+              <w:left w:w="90" w:type="dxa"/>
+              <w:right w:w="90" w:type="dxa"/>
+            </w:tcMar>
+            <w:vAlign w:val="center"/>
+          </w:tcPr>
+          <w:p>
+            <w:pPr>
+              <w:spacing w:after="20"/>
+            </w:pPr>
+            <w:r>
+              <w:rPr>
+                <w:rFonts w:ascii="DM Sans" w:hAnsi="DM Sans" w:cs="DM Sans"/>
+                <w:sz w:val="18"/>
+                <w:szCs w:val="18"/>
+              </w:rPr>
+              <w:t xml:space="preserve">READ VOLUME on source volumes (if copy_volumes=true)</w:t>
+            </w:r>
+          </w:p>
+        </w:tc>
+        <w:tc>
+          <w:tcPr>
+            <w:tcW w:w="2400" w:type="dxa"/>
+            <w:shd w:val="clear" w:color="auto" w:fill="FFFFFF"/>
+            <w:tcMar>
+              <w:top w:w="50" w:type="dxa"/>
+              <w:bottom w:w="50" w:type="dxa"/>
+              <w:left w:w="90" w:type="dxa"/>
+              <w:right w:w="90" w:type="dxa"/>
+            </w:tcMar>
+            <w:vAlign w:val="center"/>
+          </w:tcPr>
+          <w:p>
+            <w:pPr>
+              <w:spacing w:after="20"/>
+            </w:pPr>
+            <w:r>
+              <w:rPr>
+                <w:rFonts w:ascii="DM Sans" w:hAnsi="DM Sans" w:cs="DM Sans"/>
+                <w:sz w:val="18"/>
+                <w:szCs w:val="18"/>
+              </w:rPr>
+              <w:t xml:space="preserve">Source</w:t>
+            </w:r>
+          </w:p>
+        </w:tc>
+      </w:tr>
+      <w:tr>
+        <w:tc>
+          <w:tcPr>
+            <w:tcW w:w="500" w:type="dxa"/>
+            <w:shd w:val="clear" w:color="auto" w:fill="FFFFFF"/>
+            <w:tcMar>
+              <w:top w:w="50" w:type="dxa"/>
+              <w:bottom w:w="50" w:type="dxa"/>
+              <w:left w:w="90" w:type="dxa"/>
+              <w:right w:w="90" w:type="dxa"/>
+            </w:tcMar>
+            <w:vAlign w:val="center"/>
+          </w:tcPr>
+          <w:p>
+            <w:pPr>
+              <w:spacing w:after="20"/>
+            </w:pPr>
+            <w:r>
+              <w:rPr>
+                <w:rFonts w:ascii="DM Sans" w:hAnsi="DM Sans" w:cs="DM Sans"/>
+                <w:sz w:val="18"/>
+                <w:szCs w:val="18"/>
+              </w:rPr>
+              <w:t xml:space="preserve">9</w:t>
+            </w:r>
+          </w:p>
+        </w:tc>
+        <w:tc>
+          <w:tcPr>
+            <w:tcW w:w="6100" w:type="dxa"/>
+            <w:shd w:val="clear" w:color="auto" w:fill="FFFFFF"/>
+            <w:tcMar>
+              <w:top w:w="50" w:type="dxa"/>
+              <w:bottom w:w="50" w:type="dxa"/>
+              <w:left w:w="90" w:type="dxa"/>
+              <w:right w:w="90" w:type="dxa"/>
+            </w:tcMar>
+            <w:vAlign w:val="center"/>
+          </w:tcPr>
+          <w:p>
+            <w:pPr>
+              <w:spacing w:after="20"/>
+            </w:pPr>
+            <w:r>
+              <w:rPr>
+                <w:rFonts w:ascii="DM Sans" w:hAnsi="DM Sans" w:cs="DM Sans"/>
+                <w:sz w:val="18"/>
+                <w:szCs w:val="18"/>
+              </w:rPr>
+              <w:t xml:space="preserve">Secret scope created with source creds</w:t>
+            </w:r>
+          </w:p>
+        </w:tc>
+        <w:tc>
+          <w:tcPr>
+            <w:tcW w:w="2400" w:type="dxa"/>
+            <w:shd w:val="clear" w:color="auto" w:fill="FFFFFF"/>
+            <w:tcMar>
+              <w:top w:w="50" w:type="dxa"/>
+              <w:bottom w:w="50" w:type="dxa"/>
+              <w:left w:w="90" w:type="dxa"/>
+              <w:right w:w="90" w:type="dxa"/>
+            </w:tcMar>
+            <w:vAlign w:val="center"/>
+          </w:tcPr>
+          <w:p>
+            <w:pPr>
+              <w:spacing w:after="20"/>
+            </w:pPr>
+            <w:r>
+              <w:rPr>
+                <w:rFonts w:ascii="DM Sans" w:hAnsi="DM Sans" w:cs="DM Sans"/>
+                <w:sz w:val="18"/>
+                <w:szCs w:val="18"/>
+              </w:rPr>
+              <w:t xml:space="preserve">Target workspace</w:t>
+            </w:r>
+          </w:p>
+        </w:tc>
+      </w:tr>
+      <w:tr>
+        <w:tc>
+          <w:tcPr>
+            <w:tcW w:w="500" w:type="dxa"/>
+            <w:shd w:val="clear" w:color="auto" w:fill="FFFFFF"/>
+            <w:tcMar>
+              <w:top w:w="50" w:type="dxa"/>
+              <w:bottom w:w="50" w:type="dxa"/>
+              <w:left w:w="90" w:type="dxa"/>
+              <w:right w:w="90" w:type="dxa"/>
+            </w:tcMar>
+            <w:vAlign w:val="center"/>
+          </w:tcPr>
+          <w:p>
+            <w:pPr>
+              <w:spacing w:after="20"/>
+            </w:pPr>
+            <w:r>
+              <w:rPr>
+                <w:rFonts w:ascii="DM Sans" w:hAnsi="DM Sans" w:cs="DM Sans"/>
+                <w:sz w:val="18"/>
+                <w:szCs w:val="18"/>
+              </w:rPr>
+              <w:t xml:space="preserve">10</w:t>
+            </w:r>
+          </w:p>
+        </w:tc>
+        <w:tc>
+          <w:tcPr>
+            <w:tcW w:w="6100" w:type="dxa"/>
+            <w:shd w:val="clear" w:color="auto" w:fill="FFFFFF"/>
+            <w:tcMar>
+              <w:top w:w="50" w:type="dxa"/>
+              <w:bottom w:w="50" w:type="dxa"/>
+              <w:left w:w="90" w:type="dxa"/>
+              <w:right w:w="90" w:type="dxa"/>
+            </w:tcMar>
+            <w:vAlign w:val="center"/>
+          </w:tcPr>
+          <w:p>
+            <w:pPr>
+              <w:spacing w:after="20"/>
+            </w:pPr>
+            <w:r>
+              <w:rPr>
+                <w:rFonts w:ascii="DM Sans" w:hAnsi="DM Sans" w:cs="DM Sans"/>
+                <w:sz w:val="18"/>
+                <w:szCs w:val="18"/>
+              </w:rPr>
+              <w:t xml:space="preserve">Not enrolled in Serverless Access Controls Preview</w:t>
+            </w:r>
+          </w:p>
+        </w:tc>
+        <w:tc>
+          <w:tcPr>
+            <w:tcW w:w="2400" w:type="dxa"/>
+            <w:shd w:val="clear" w:color="auto" w:fill="FFFFFF"/>
+            <w:tcMar>
+              <w:top w:w="50" w:type="dxa"/>
+              <w:bottom w:w="50" w:type="dxa"/>
+              <w:left w:w="90" w:type="dxa"/>
+              <w:right w:w="90" w:type="dxa"/>
+            </w:tcMar>
+            <w:vAlign w:val="center"/>
+          </w:tcPr>
+          <w:p>
+            <w:pPr>
+              <w:spacing w:after="20"/>
+            </w:pPr>
+            <w:r>
+              <w:rPr>
+                <w:rFonts w:ascii="DM Sans" w:hAnsi="DM Sans" w:cs="DM Sans"/>
+                <w:sz w:val="18"/>
+                <w:szCs w:val="18"/>
+              </w:rPr>
+              <w:t xml:space="preserve">Target workspace</w:t>
+            </w:r>
+          </w:p>
+        </w:tc>
+      </w:tr>
+    </w:tbl>
+    <w:p>
+      <w:pPr>
+        <w:spacing w:before="0" w:after="80"/>
+      </w:pPr>
+      <w:r>
+        <w:rPr>
+          <w:rFonts w:ascii="DM Sans" w:hAnsi="DM Sans" w:cs="DM Sans"/>
+        </w:rPr>
+        <w:t xml:space="preserve"> </w:t>
+      </w:r>
+    </w:p>
+    <w:p>
+      <w:r>
+        <w:br w:type="page"/>
+      </w:r>
+    </w:p>
+    <w:p>
+      <w:pPr>
+        <w:pStyle w:val="Heading1"/>
+        <w:spacing w:before="0" w:after="120"/>
+      </w:pPr>
+      <w:r>
+        <w:rPr>
+          <w:rFonts w:ascii="DM Sans" w:hAnsi="DM Sans" w:cs="DM Sans"/>
+        </w:rPr>
+        <w:t xml:space="preserve">6.  GitHub Secrets &amp; Variables by Environment</w:t>
       </w:r>
     </w:p>
     <w:p>
@@ -7347,7 +9440,7 @@
         <w:rPr>
           <w:rFonts w:ascii="DM Sans" w:hAnsi="DM Sans" w:cs="DM Sans"/>
         </w:rPr>
-        <w:t xml:space="preserve">6.  How to Deploy (Run the Tool)</w:t>
+        <w:t xml:space="preserve">7.  How to Deploy (Run the Tool)</w:t>
       </w:r>
     </w:p>
     <w:p>
@@ -7370,7 +9463,7 @@
         <w:rPr>
           <w:rFonts w:ascii="DM Sans" w:hAnsi="DM Sans" w:cs="DM Sans"/>
         </w:rPr>
-        <w:t xml:space="preserve">Pushing to the main branch triggers the GitHub Actions workflow, which deploys the bundle and runs the job for staging (prod requires manual approval). Credentials come from the GitHub environment secrets described in section 5.</w:t>
+        <w:t xml:space="preserve">Pushing to the main branch triggers the GitHub Actions workflow, which deploys the bundle and runs the job for staging (prod requires manual approval). Credentials come from the GitHub environment secrets described in section 6.</w:t>
       </w:r>
     </w:p>
     <w:p>
@@ -7536,7 +9629,7 @@
         <w:rPr>
           <w:rFonts w:ascii="DM Sans" w:hAnsi="DM Sans" w:cs="DM Sans"/>
         </w:rPr>
-        <w:t xml:space="preserve">7.  Status Tracking Tables</w:t>
+        <w:t xml:space="preserve">8.  Status Tracking Tables</w:t>
       </w:r>
     </w:p>
     <w:p>
@@ -8576,7 +10669,7 @@
         <w:rPr>
           <w:rFonts w:ascii="DM Sans" w:hAnsi="DM Sans" w:cs="DM Sans"/>
         </w:rPr>
-        <w:t xml:space="preserve">8.  Copying Examples</w:t>
+        <w:t xml:space="preserve">9.  Copying Examples</w:t>
       </w:r>
     </w:p>
     <w:p>
@@ -8741,7 +10834,7 @@
         <w:rPr>
           <w:rFonts w:ascii="DM Sans" w:hAnsi="DM Sans" w:cs="DM Sans"/>
         </w:rPr>
-        <w:t xml:space="preserve">9.  Troubleshooting</w:t>
+        <w:t xml:space="preserve">10.  Troubleshooting</w:t>
       </w:r>
     </w:p>
     <w:tbl>

</xml_diff>

<commit_message>
Clarify SP-vs-PAT ownership in permissions checklist
- Add "Who needs these permissions — SP or PAT?" subsection: SP is tried first,
  PAT is the fallback, so grants go to whichever identity authenticates (grant
  both for fallback to work); target and source are separate identities.
- Name the identity explicitly in the TARGET and SOURCE subsection headers.

Co-authored-by: Isaac
</commit_message>
<xml_diff>
--- a/KA_Deployment_User_Manual.docx
+++ b/KA_Deployment_User_Manual.docx
@@ -4352,7 +4352,7 @@
         <w:rPr>
           <w:rFonts w:ascii="DM Sans" w:hAnsi="DM Sans" w:cs="DM Sans"/>
         </w:rPr>
-        <w:t xml:space="preserve">Grant these BEFORE running the tool. Requirements are derived from the actual API and SDK calls the jobs make. The identity is the Service Principal (or PAT owner) used for each workspace — TARGET is where KAs are created, SOURCE is where they are exported from.</w:t>
+        <w:t xml:space="preserve">Grant these BEFORE running the tool. Requirements are derived from the actual API and SDK calls the jobs make. TARGET is where KAs are created; SOURCE is where they are exported from.</w:t>
       </w:r>
     </w:p>
     <w:p>
@@ -4364,7 +4364,18 @@
         <w:rPr>
           <w:rFonts w:ascii="DM Sans" w:hAnsi="DM Sans" w:cs="DM Sans"/>
         </w:rPr>
-        <w:t xml:space="preserve">Workspace &amp; platform</w:t>
+        <w:t xml:space="preserve">Who needs these permissions — SP or PAT?</w:t>
+      </w:r>
+    </w:p>
+    <w:p>
+      <w:pPr>
+        <w:spacing w:before="0" w:after="120"/>
+      </w:pPr>
+      <w:r>
+        <w:rPr>
+          <w:rFonts w:ascii="DM Sans" w:hAnsi="DM Sans" w:cs="DM Sans"/>
+        </w:rPr>
+        <w:t xml:space="preserve">Each workspace authenticates Service Principal FIRST, then falls back to a PAT if the SP is not set or fails. So the permissions below must be held by whichever identity actually authenticates to that workspace:</w:t>
       </w:r>
     </w:p>
     <w:p>
@@ -4383,8 +4394,15 @@
       <w:r>
         <w:rPr>
           <w:rFonts w:ascii="DM Sans" w:hAnsi="DM Sans" w:cs="DM Sans"/>
-        </w:rPr>
-        <w:t xml:space="preserve">TARGET workspace: Unity Catalog enabled, serverless compute enabled, Premium/Enterprise tier.</w:t>
+          <w:b/>
+        </w:rPr>
+        <w:t xml:space="preserve">If you configure the SP</w:t>
+      </w:r>
+      <w:r>
+        <w:rPr>
+          <w:rFonts w:ascii="DM Sans" w:hAnsi="DM Sans" w:cs="DM Sans"/>
+        </w:rPr>
+        <w:t xml:space="preserve"> → the Service Principal must hold the permissions.</w:t>
       </w:r>
     </w:p>
     <w:p>
@@ -4403,8 +4421,15 @@
       <w:r>
         <w:rPr>
           <w:rFonts w:ascii="DM Sans" w:hAnsi="DM Sans" w:cs="DM Sans"/>
-        </w:rPr>
-        <w:t xml:space="preserve">TARGET workspace: NOT enrolled in the Serverless Access Controls Preview (it blocks KA creation).</w:t>
+          <w:b/>
+        </w:rPr>
+        <w:t xml:space="preserve">If you rely on the PAT</w:t>
+      </w:r>
+      <w:r>
+        <w:rPr>
+          <w:rFonts w:ascii="DM Sans" w:hAnsi="DM Sans" w:cs="DM Sans"/>
+        </w:rPr>
+        <w:t xml:space="preserve"> → the PAT owner (user) must hold the permissions.</w:t>
       </w:r>
     </w:p>
     <w:p>
@@ -4423,8 +4448,52 @@
       <w:r>
         <w:rPr>
           <w:rFonts w:ascii="DM Sans" w:hAnsi="DM Sans" w:cs="DM Sans"/>
-        </w:rPr>
-        <w:t xml:space="preserve">Mosaic AI Agent Bricks preview enabled (Admin Console → Workspace Settings → Previews).</w:t>
+          <w:b/>
+        </w:rPr>
+        <w:t xml:space="preserve">If you want the fallback to work</w:t>
+      </w:r>
+      <w:r>
+        <w:rPr>
+          <w:rFonts w:ascii="DM Sans" w:hAnsi="DM Sans" w:cs="DM Sans"/>
+        </w:rPr>
+        <w:t xml:space="preserve"> → grant BOTH the SP and the PAT owner, on each workspace independently (target and source are separate identities).</w:t>
+      </w:r>
+    </w:p>
+    <w:p>
+      <w:pPr>
+        <w:spacing w:before="0" w:after="120"/>
+      </w:pPr>
+      <w:r>
+        <w:rPr>
+          <w:rFonts w:ascii="DM Sans" w:hAnsi="DM Sans" w:cs="DM Sans"/>
+          <w:b/>
+          <w:color w:val="FF3621"/>
+          <w:sz w:val="20"/>
+          <w:szCs w:val="20"/>
+        </w:rPr>
+        <w:t xml:space="preserve">Note:  </w:t>
+      </w:r>
+      <w:r>
+        <w:rPr>
+          <w:rFonts w:ascii="DM Sans" w:hAnsi="DM Sans" w:cs="DM Sans"/>
+          <w:i/>
+          <w:color w:val="5A6872"/>
+          <w:sz w:val="20"/>
+          <w:szCs w:val="20"/>
+        </w:rPr>
+        <w:t xml:space="preserve">This applies to every item below: target items 1–6 and 9 → the TARGET identity; source items 7–8 → the SOURCE identity.</w:t>
+      </w:r>
+    </w:p>
+    <w:p>
+      <w:pPr>
+        <w:pStyle w:val="Heading2"/>
+        <w:spacing w:before="0" w:after="120"/>
+      </w:pPr>
+      <w:r>
+        <w:rPr>
+          <w:rFonts w:ascii="DM Sans" w:hAnsi="DM Sans" w:cs="DM Sans"/>
+        </w:rPr>
+        <w:t xml:space="preserve">Workspace &amp; platform</w:t>
       </w:r>
     </w:p>
     <w:p>
@@ -4444,7 +4513,7 @@
         <w:rPr>
           <w:rFonts w:ascii="DM Sans" w:hAnsi="DM Sans" w:cs="DM Sans"/>
         </w:rPr>
-        <w:t xml:space="preserve">Serverless usage policy exists and the running identity has the User role on it (needed for KA / serverless AI).</w:t>
+        <w:t xml:space="preserve">TARGET workspace: Unity Catalog enabled, serverless compute enabled, Premium/Enterprise tier.</w:t>
       </w:r>
     </w:p>
     <w:p>
@@ -4464,6 +4533,66 @@
         <w:rPr>
           <w:rFonts w:ascii="DM Sans" w:hAnsi="DM Sans" w:cs="DM Sans"/>
         </w:rPr>
+        <w:t xml:space="preserve">TARGET workspace: NOT enrolled in the Serverless Access Controls Preview (it blocks KA creation).</w:t>
+      </w:r>
+    </w:p>
+    <w:p>
+      <w:pPr>
+        <w:ind w:left="360" w:hanging="180"/>
+        <w:spacing w:after="60"/>
+      </w:pPr>
+      <w:r>
+        <w:rPr>
+          <w:rFonts w:ascii="DM Sans" w:hAnsi="DM Sans" w:cs="DM Sans"/>
+          <w:b/>
+          <w:color w:val="FF3621"/>
+        </w:rPr>
+        <w:t xml:space="preserve">•  </w:t>
+      </w:r>
+      <w:r>
+        <w:rPr>
+          <w:rFonts w:ascii="DM Sans" w:hAnsi="DM Sans" w:cs="DM Sans"/>
+        </w:rPr>
+        <w:t xml:space="preserve">Mosaic AI Agent Bricks preview enabled (Admin Console → Workspace Settings → Previews).</w:t>
+      </w:r>
+    </w:p>
+    <w:p>
+      <w:pPr>
+        <w:ind w:left="360" w:hanging="180"/>
+        <w:spacing w:after="60"/>
+      </w:pPr>
+      <w:r>
+        <w:rPr>
+          <w:rFonts w:ascii="DM Sans" w:hAnsi="DM Sans" w:cs="DM Sans"/>
+          <w:b/>
+          <w:color w:val="FF3621"/>
+        </w:rPr>
+        <w:t xml:space="preserve">•  </w:t>
+      </w:r>
+      <w:r>
+        <w:rPr>
+          <w:rFonts w:ascii="DM Sans" w:hAnsi="DM Sans" w:cs="DM Sans"/>
+        </w:rPr>
+        <w:t xml:space="preserve">Serverless usage policy exists and the running identity has the User role on it (needed for KA / serverless AI).</w:t>
+      </w:r>
+    </w:p>
+    <w:p>
+      <w:pPr>
+        <w:ind w:left="360" w:hanging="180"/>
+        <w:spacing w:after="60"/>
+      </w:pPr>
+      <w:r>
+        <w:rPr>
+          <w:rFonts w:ascii="DM Sans" w:hAnsi="DM Sans" w:cs="DM Sans"/>
+          <w:b/>
+          <w:color w:val="FF3621"/>
+        </w:rPr>
+        <w:t xml:space="preserve">•  </w:t>
+      </w:r>
+      <w:r>
+        <w:rPr>
+          <w:rFonts w:ascii="DM Sans" w:hAnsi="DM Sans" w:cs="DM Sans"/>
+        </w:rPr>
         <w:t xml:space="preserve">Both workspaces are in a region where Knowledge Assistant is supported.</w:t>
       </w:r>
     </w:p>
@@ -4476,7 +4605,7 @@
         <w:rPr>
           <w:rFonts w:ascii="DM Sans" w:hAnsi="DM Sans" w:cs="DM Sans"/>
         </w:rPr>
-        <w:t xml:space="preserve">TARGET identity — Knowledge Assistant</w:t>
+        <w:t xml:space="preserve">TARGET identity — Knowledge Assistant (target SP, or target PAT owner on fallback)</w:t>
       </w:r>
     </w:p>
     <w:p>
@@ -4487,7 +4616,7 @@
         <w:rPr>
           <w:rFonts w:ascii="DM Sans" w:hAnsi="DM Sans" w:cs="DM Sans"/>
         </w:rPr>
-        <w:t xml:space="preserve">The job creates KAs via POST/DELETE on the knowledge-assistants REST API and reads examples/sources. The identity needs to create and manage KAs on the target.</w:t>
+        <w:t xml:space="preserve">Held by whichever identity authenticates to the TARGET workspace — the target Service Principal (DATABRICKS_CLIENT_ID / DATABRICKS_CLIENT_SECRET) if set, otherwise the target PAT (STAGING_TOKEN / PROD_TOKEN) owner. The job creates KAs via POST/DELETE on the knowledge-assistants REST API and reads examples/sources.</w:t>
       </w:r>
     </w:p>
     <w:p>
@@ -5331,7 +5460,7 @@
         <w:rPr>
           <w:rFonts w:ascii="DM Sans" w:hAnsi="DM Sans" w:cs="DM Sans"/>
         </w:rPr>
-        <w:t xml:space="preserve">SOURCE identity</w:t>
+        <w:t xml:space="preserve">SOURCE identity (source SP, or source PAT owner on fallback)</w:t>
       </w:r>
     </w:p>
     <w:p>
@@ -5342,7 +5471,7 @@
         <w:rPr>
           <w:rFonts w:ascii="DM Sans" w:hAnsi="DM Sans" w:cs="DM Sans"/>
         </w:rPr>
-        <w:t xml:space="preserve">Used to export KA definitions and (optionally) read volume files from the source workspace.</w:t>
+        <w:t xml:space="preserve">Held by whichever identity authenticates to the SOURCE workspace — the source Service Principal (source-client-id / source-client-secret) if set, otherwise the source PAT (source-token) owner. Used to export KA definitions and (optionally) read volume files.</w:t>
       </w:r>
     </w:p>
     <w:p>

</xml_diff>

<commit_message>
Add "Running the Tool Locally" section to user manual
New section 8 explains local execution:
- Prerequisites and target-workspace auth (profile or env vars; PAT or SP)
- Option A (bundle run from local, executes on Databricks) -> secret scope +
  source keys MUST exist on target beforehand
- Option B (direct python script, executes on laptop) -> secret scope NOT used;
  source creds via --source-* args or SOURCE_* env vars
- "Do I need the secret scope locally?" comparison table
- Secret-scope setup commands (for Option A) and the credential resolution order

Renumber later sections (Status -> 9, Copying -> 10, Troubleshooting -> 11) and
update the TOC.

Co-authored-by: Isaac
</commit_message>
<xml_diff>
--- a/KA_Deployment_User_Manual.docx
+++ b/KA_Deployment_User_Manual.docx
@@ -224,7 +224,7 @@
           <w:sz w:val="22"/>
           <w:szCs w:val="22"/>
         </w:rPr>
-        <w:t xml:space="preserve">8.  Status Tracking Tables</w:t>
+        <w:t xml:space="preserve">8.  Running the Tool Locally</w:t>
       </w:r>
     </w:p>
     <w:p>
@@ -239,7 +239,7 @@
           <w:sz w:val="22"/>
           <w:szCs w:val="22"/>
         </w:rPr>
-        <w:t xml:space="preserve">9.  Copying Examples</w:t>
+        <w:t xml:space="preserve">9.  Status Tracking Tables</w:t>
       </w:r>
     </w:p>
     <w:p>
@@ -254,7 +254,22 @@
           <w:sz w:val="22"/>
           <w:szCs w:val="22"/>
         </w:rPr>
-        <w:t xml:space="preserve">10.  Troubleshooting</w:t>
+        <w:t xml:space="preserve">10.  Copying Examples</w:t>
+      </w:r>
+    </w:p>
+    <w:p>
+      <w:pPr>
+        <w:spacing w:before="0" w:after="40"/>
+      </w:pPr>
+      <w:r>
+        <w:rPr>
+          <w:rFonts w:ascii="DM Sans" w:hAnsi="DM Sans" w:cs="DM Sans"/>
+          <w:b/>
+          <w:color w:val="1B3139"/>
+          <w:sz w:val="22"/>
+          <w:szCs w:val="22"/>
+        </w:rPr>
+        <w:t xml:space="preserve">11.  Troubleshooting</w:t>
       </w:r>
     </w:p>
     <w:p>
@@ -9758,7 +9773,1373 @@
         <w:rPr>
           <w:rFonts w:ascii="DM Sans" w:hAnsi="DM Sans" w:cs="DM Sans"/>
         </w:rPr>
-        <w:t xml:space="preserve">8.  Status Tracking Tables</w:t>
+        <w:t xml:space="preserve">8.  Running the Tool Locally</w:t>
+      </w:r>
+    </w:p>
+    <w:p>
+      <w:pPr>
+        <w:spacing w:before="0" w:after="120"/>
+      </w:pPr>
+      <w:r>
+        <w:rPr>
+          <w:rFonts w:ascii="DM Sans" w:hAnsi="DM Sans" w:cs="DM Sans"/>
+        </w:rPr>
+        <w:t xml:space="preserve">You can run from your laptop in two ways. Both need the Databricks CLI installed and authenticated to the TARGET workspace. The key difference is WHERE the code executes, which changes whether the source secret scope is used.</w:t>
+      </w:r>
+    </w:p>
+    <w:p>
+      <w:pPr>
+        <w:pStyle w:val="Heading2"/>
+        <w:spacing w:before="0" w:after="120"/>
+      </w:pPr>
+      <w:r>
+        <w:rPr>
+          <w:rFonts w:ascii="DM Sans" w:hAnsi="DM Sans" w:cs="DM Sans"/>
+        </w:rPr>
+        <w:t xml:space="preserve">Prerequisites</w:t>
+      </w:r>
+    </w:p>
+    <w:p>
+      <w:pPr>
+        <w:ind w:left="360" w:hanging="180"/>
+        <w:spacing w:after="60"/>
+      </w:pPr>
+      <w:r>
+        <w:rPr>
+          <w:rFonts w:ascii="DM Sans" w:hAnsi="DM Sans" w:cs="DM Sans"/>
+          <w:b/>
+          <w:color w:val="FF3621"/>
+        </w:rPr>
+        <w:t xml:space="preserve">•  </w:t>
+      </w:r>
+      <w:r>
+        <w:rPr>
+          <w:rFonts w:ascii="DM Sans" w:hAnsi="DM Sans" w:cs="DM Sans"/>
+        </w:rPr>
+        <w:t xml:space="preserve">Databricks CLI installed (databricks -v).</w:t>
+      </w:r>
+    </w:p>
+    <w:p>
+      <w:pPr>
+        <w:ind w:left="360" w:hanging="180"/>
+        <w:spacing w:after="60"/>
+      </w:pPr>
+      <w:r>
+        <w:rPr>
+          <w:rFonts w:ascii="DM Sans" w:hAnsi="DM Sans" w:cs="DM Sans"/>
+          <w:b/>
+          <w:color w:val="FF3621"/>
+        </w:rPr>
+        <w:t xml:space="preserve">•  </w:t>
+      </w:r>
+      <w:r>
+        <w:rPr>
+          <w:rFonts w:ascii="DM Sans" w:hAnsi="DM Sans" w:cs="DM Sans"/>
+        </w:rPr>
+        <w:t xml:space="preserve">A profile in ~/.databrickscfg for the target workspace, OR the DATABRICKS_HOST / auth env vars set.</w:t>
+      </w:r>
+    </w:p>
+    <w:p>
+      <w:pPr>
+        <w:ind w:left="360" w:hanging="180"/>
+        <w:spacing w:after="60"/>
+      </w:pPr>
+      <w:r>
+        <w:rPr>
+          <w:rFonts w:ascii="DM Sans" w:hAnsi="DM Sans" w:cs="DM Sans"/>
+          <w:b/>
+          <w:color w:val="FF3621"/>
+        </w:rPr>
+        <w:t xml:space="preserve">•  </w:t>
+      </w:r>
+      <w:r>
+        <w:rPr>
+          <w:rFonts w:ascii="DM Sans" w:hAnsi="DM Sans" w:cs="DM Sans"/>
+        </w:rPr>
+        <w:t xml:space="preserve">The same permissions from section 5 — held by the identity you authenticate as (SP or your user/PAT).</w:t>
+      </w:r>
+    </w:p>
+    <w:p>
+      <w:pPr>
+        <w:pStyle w:val="Heading2"/>
+        <w:spacing w:before="0" w:after="120"/>
+      </w:pPr>
+      <w:r>
+        <w:rPr>
+          <w:rFonts w:ascii="DM Sans" w:hAnsi="DM Sans" w:cs="DM Sans"/>
+        </w:rPr>
+        <w:t xml:space="preserve">Authenticate to the TARGET workspace</w:t>
+      </w:r>
+    </w:p>
+    <w:p>
+      <w:pPr>
+        <w:spacing w:before="0" w:after="120"/>
+      </w:pPr>
+      <w:r>
+        <w:rPr>
+          <w:rFonts w:ascii="DM Sans" w:hAnsi="DM Sans" w:cs="DM Sans"/>
+        </w:rPr>
+        <w:t xml:space="preserve">Pick ONE. A ~/.databrickscfg profile is simplest; env vars also work.</w:t>
+      </w:r>
+    </w:p>
+    <w:p>
+      <w:pPr>
+        <w:spacing w:before="0" w:after="120"/>
+      </w:pPr>
+      <w:r>
+        <w:rPr>
+          <w:rFonts w:ascii="DM Sans" w:hAnsi="DM Sans" w:cs="DM Sans"/>
+        </w:rPr>
+        <w:t xml:space="preserve">Profile (recommended):</w:t>
+      </w:r>
+    </w:p>
+    <w:p>
+      <w:pPr>
+        <w:shd w:val="clear" w:color="auto" w:fill="F5F5F0"/>
+        <w:ind w:left="120"/>
+        <w:spacing w:before="0" w:after="0"/>
+      </w:pPr>
+      <w:r>
+        <w:rPr>
+          <w:rFonts w:ascii="Consolas" w:hAnsi="Consolas" w:cs="Consolas"/>
+          <w:color w:val="1B3139"/>
+          <w:sz w:val="18"/>
+          <w:szCs w:val="18"/>
+        </w:rPr>
+        <w:t xml:space="preserve"># ~/.databrickscfg</w:t>
+      </w:r>
+    </w:p>
+    <w:p>
+      <w:pPr>
+        <w:shd w:val="clear" w:color="auto" w:fill="F5F5F0"/>
+        <w:ind w:left="120"/>
+        <w:spacing w:before="0" w:after="0"/>
+      </w:pPr>
+      <w:r>
+        <w:rPr>
+          <w:rFonts w:ascii="Consolas" w:hAnsi="Consolas" w:cs="Consolas"/>
+          <w:color w:val="1B3139"/>
+          <w:sz w:val="18"/>
+          <w:szCs w:val="18"/>
+        </w:rPr>
+        <w:t xml:space="preserve">[myprofile]</w:t>
+      </w:r>
+    </w:p>
+    <w:p>
+      <w:pPr>
+        <w:shd w:val="clear" w:color="auto" w:fill="F5F5F0"/>
+        <w:ind w:left="120"/>
+        <w:spacing w:before="0" w:after="0"/>
+      </w:pPr>
+      <w:r>
+        <w:rPr>
+          <w:rFonts w:ascii="Consolas" w:hAnsi="Consolas" w:cs="Consolas"/>
+          <w:color w:val="1B3139"/>
+          <w:sz w:val="18"/>
+          <w:szCs w:val="18"/>
+        </w:rPr>
+        <w:t xml:space="preserve">host  = https://adb-xxxx.7.azuredatabricks.net</w:t>
+      </w:r>
+    </w:p>
+    <w:p>
+      <w:pPr>
+        <w:shd w:val="clear" w:color="auto" w:fill="F5F5F0"/>
+        <w:ind w:left="120"/>
+        <w:spacing w:before="0" w:after="0"/>
+      </w:pPr>
+      <w:r>
+        <w:rPr>
+          <w:rFonts w:ascii="Consolas" w:hAnsi="Consolas" w:cs="Consolas"/>
+          <w:color w:val="1B3139"/>
+          <w:sz w:val="18"/>
+          <w:szCs w:val="18"/>
+        </w:rPr>
+        <w:t xml:space="preserve">token = dapiXXXXXXXXXXXXXXXX          # PAT</w:t>
+      </w:r>
+    </w:p>
+    <w:p>
+      <w:pPr>
+        <w:shd w:val="clear" w:color="auto" w:fill="F5F5F0"/>
+        <w:ind w:left="120"/>
+        <w:spacing w:before="0" w:after="0"/>
+      </w:pPr>
+      <w:r>
+        <w:rPr>
+          <w:rFonts w:ascii="Consolas" w:hAnsi="Consolas" w:cs="Consolas"/>
+          <w:color w:val="1B3139"/>
+          <w:sz w:val="18"/>
+          <w:szCs w:val="18"/>
+        </w:rPr>
+        <w:t xml:space="preserve"># --- or Service Principal (OAuth M2M) instead of token ---</w:t>
+      </w:r>
+    </w:p>
+    <w:p>
+      <w:pPr>
+        <w:shd w:val="clear" w:color="auto" w:fill="F5F5F0"/>
+        <w:ind w:left="120"/>
+        <w:spacing w:before="0" w:after="0"/>
+      </w:pPr>
+      <w:r>
+        <w:rPr>
+          <w:rFonts w:ascii="Consolas" w:hAnsi="Consolas" w:cs="Consolas"/>
+          <w:color w:val="1B3139"/>
+          <w:sz w:val="18"/>
+          <w:szCs w:val="18"/>
+        </w:rPr>
+        <w:t xml:space="preserve"># client_id     = &lt;sp-client-id&gt;</w:t>
+      </w:r>
+    </w:p>
+    <w:p>
+      <w:pPr>
+        <w:shd w:val="clear" w:color="auto" w:fill="F5F5F0"/>
+        <w:ind w:left="120"/>
+        <w:spacing w:before="0" w:after="0"/>
+      </w:pPr>
+      <w:r>
+        <w:rPr>
+          <w:rFonts w:ascii="Consolas" w:hAnsi="Consolas" w:cs="Consolas"/>
+          <w:color w:val="1B3139"/>
+          <w:sz w:val="18"/>
+          <w:szCs w:val="18"/>
+        </w:rPr>
+        <w:t xml:space="preserve"># client_secret = &lt;sp-client-secret&gt;</w:t>
+      </w:r>
+    </w:p>
+    <w:p>
+      <w:pPr>
+        <w:spacing w:before="0" w:after="80"/>
+      </w:pPr>
+      <w:r>
+        <w:rPr>
+          <w:rFonts w:ascii="DM Sans" w:hAnsi="DM Sans" w:cs="DM Sans"/>
+        </w:rPr>
+        <w:t xml:space="preserve"> </w:t>
+      </w:r>
+    </w:p>
+    <w:p>
+      <w:pPr>
+        <w:spacing w:before="0" w:after="120"/>
+      </w:pPr>
+      <w:r>
+        <w:rPr>
+          <w:rFonts w:ascii="DM Sans" w:hAnsi="DM Sans" w:cs="DM Sans"/>
+        </w:rPr>
+        <w:t xml:space="preserve">Environment variables (alternative):</w:t>
+      </w:r>
+    </w:p>
+    <w:p>
+      <w:pPr>
+        <w:shd w:val="clear" w:color="auto" w:fill="F5F5F0"/>
+        <w:ind w:left="120"/>
+        <w:spacing w:before="0" w:after="0"/>
+      </w:pPr>
+      <w:r>
+        <w:rPr>
+          <w:rFonts w:ascii="Consolas" w:hAnsi="Consolas" w:cs="Consolas"/>
+          <w:color w:val="1B3139"/>
+          <w:sz w:val="18"/>
+          <w:szCs w:val="18"/>
+        </w:rPr>
+        <w:t xml:space="preserve">export DATABRICKS_HOST=https://adb-xxxx.7.azuredatabricks.net</w:t>
+      </w:r>
+    </w:p>
+    <w:p>
+      <w:pPr>
+        <w:shd w:val="clear" w:color="auto" w:fill="F5F5F0"/>
+        <w:ind w:left="120"/>
+        <w:spacing w:before="0" w:after="0"/>
+      </w:pPr>
+      <w:r>
+        <w:rPr>
+          <w:rFonts w:ascii="Consolas" w:hAnsi="Consolas" w:cs="Consolas"/>
+          <w:color w:val="1B3139"/>
+          <w:sz w:val="18"/>
+          <w:szCs w:val="18"/>
+        </w:rPr>
+        <w:t xml:space="preserve">export DATABRICKS_TOKEN=dapiXXXXXXXXXXXXXXXX          # PAT</w:t>
+      </w:r>
+    </w:p>
+    <w:p>
+      <w:pPr>
+        <w:shd w:val="clear" w:color="auto" w:fill="F5F5F0"/>
+        <w:ind w:left="120"/>
+        <w:spacing w:before="0" w:after="0"/>
+      </w:pPr>
+      <w:r>
+        <w:rPr>
+          <w:rFonts w:ascii="Consolas" w:hAnsi="Consolas" w:cs="Consolas"/>
+          <w:color w:val="1B3139"/>
+          <w:sz w:val="18"/>
+          <w:szCs w:val="18"/>
+        </w:rPr>
+        <w:t xml:space="preserve"># --- or SP instead of token ---</w:t>
+      </w:r>
+    </w:p>
+    <w:p>
+      <w:pPr>
+        <w:shd w:val="clear" w:color="auto" w:fill="F5F5F0"/>
+        <w:ind w:left="120"/>
+        <w:spacing w:before="0" w:after="0"/>
+      </w:pPr>
+      <w:r>
+        <w:rPr>
+          <w:rFonts w:ascii="Consolas" w:hAnsi="Consolas" w:cs="Consolas"/>
+          <w:color w:val="1B3139"/>
+          <w:sz w:val="18"/>
+          <w:szCs w:val="18"/>
+        </w:rPr>
+        <w:t xml:space="preserve"># export DATABRICKS_CLIENT_ID=&lt;sp-client-id&gt;</w:t>
+      </w:r>
+    </w:p>
+    <w:p>
+      <w:pPr>
+        <w:shd w:val="clear" w:color="auto" w:fill="F5F5F0"/>
+        <w:ind w:left="120"/>
+        <w:spacing w:before="0" w:after="0"/>
+      </w:pPr>
+      <w:r>
+        <w:rPr>
+          <w:rFonts w:ascii="Consolas" w:hAnsi="Consolas" w:cs="Consolas"/>
+          <w:color w:val="1B3139"/>
+          <w:sz w:val="18"/>
+          <w:szCs w:val="18"/>
+        </w:rPr>
+        <w:t xml:space="preserve"># export DATABRICKS_CLIENT_SECRET=&lt;sp-client-secret&gt;</w:t>
+      </w:r>
+    </w:p>
+    <w:p>
+      <w:pPr>
+        <w:spacing w:before="0" w:after="80"/>
+      </w:pPr>
+      <w:r>
+        <w:rPr>
+          <w:rFonts w:ascii="DM Sans" w:hAnsi="DM Sans" w:cs="DM Sans"/>
+        </w:rPr>
+        <w:t xml:space="preserve"> </w:t>
+      </w:r>
+    </w:p>
+    <w:p>
+      <w:pPr>
+        <w:pStyle w:val="Heading2"/>
+        <w:spacing w:before="0" w:after="120"/>
+      </w:pPr>
+      <w:r>
+        <w:rPr>
+          <w:rFonts w:ascii="DM Sans" w:hAnsi="DM Sans" w:cs="DM Sans"/>
+        </w:rPr>
+        <w:t xml:space="preserve">Option A — Bundle CLI from local (runs ON Databricks compute)</w:t>
+      </w:r>
+    </w:p>
+    <w:p>
+      <w:pPr>
+        <w:spacing w:before="0" w:after="120"/>
+      </w:pPr>
+      <w:r>
+        <w:rPr>
+          <w:rFonts w:ascii="DM Sans" w:hAnsi="DM Sans" w:cs="DM Sans"/>
+        </w:rPr>
+        <w:t xml:space="preserve">This is the normal local workflow: you trigger the DAB from your laptop, but the job actually executes on Databricks. Use a target that maps to your workspace profile.</w:t>
+      </w:r>
+    </w:p>
+    <w:p>
+      <w:pPr>
+        <w:shd w:val="clear" w:color="auto" w:fill="F5F5F0"/>
+        <w:ind w:left="120"/>
+        <w:spacing w:before="0" w:after="0"/>
+      </w:pPr>
+      <w:r>
+        <w:rPr>
+          <w:rFonts w:ascii="Consolas" w:hAnsi="Consolas" w:cs="Consolas"/>
+          <w:color w:val="1B3139"/>
+          <w:sz w:val="18"/>
+          <w:szCs w:val="18"/>
+        </w:rPr>
+        <w:t xml:space="preserve">databricks bundle deploy -t dev -p myprofile</w:t>
+      </w:r>
+    </w:p>
+    <w:p>
+      <w:pPr>
+        <w:shd w:val="clear" w:color="auto" w:fill="F5F5F0"/>
+        <w:ind w:left="120"/>
+        <w:spacing w:before="0" w:after="0"/>
+      </w:pPr>
+      <w:r>
+        <w:rPr>
+          <w:rFonts w:ascii="Consolas" w:hAnsi="Consolas" w:cs="Consolas"/>
+          <w:color w:val="1B3139"/>
+          <w:sz w:val="18"/>
+          <w:szCs w:val="18"/>
+        </w:rPr>
+        <w:t xml:space="preserve">databricks bundle run batch_deploy_agents -t dev -p myprofile</w:t>
+      </w:r>
+    </w:p>
+    <w:p>
+      <w:pPr>
+        <w:shd w:val="clear" w:color="auto" w:fill="F5F5F0"/>
+        <w:ind w:left="120"/>
+        <w:spacing w:before="0" w:after="0"/>
+      </w:pPr>
+      <w:r>
+        <w:rPr>
+          <w:rFonts w:ascii="Consolas" w:hAnsi="Consolas" w:cs="Consolas"/>
+          <w:color w:val="1B3139"/>
+          <w:sz w:val="18"/>
+          <w:szCs w:val="18"/>
+        </w:rPr>
+        <w:t xml:space="preserve">databricks bundle run copy_examples_job  -t dev -p myprofile</w:t>
+      </w:r>
+    </w:p>
+    <w:p>
+      <w:pPr>
+        <w:spacing w:before="0" w:after="80"/>
+      </w:pPr>
+      <w:r>
+        <w:rPr>
+          <w:rFonts w:ascii="DM Sans" w:hAnsi="DM Sans" w:cs="DM Sans"/>
+        </w:rPr>
+        <w:t xml:space="preserve"> </w:t>
+      </w:r>
+    </w:p>
+    <w:p>
+      <w:pPr>
+        <w:spacing w:before="0" w:after="120"/>
+      </w:pPr>
+      <w:r>
+        <w:rPr>
+          <w:rFonts w:ascii="DM Sans" w:hAnsi="DM Sans" w:cs="DM Sans"/>
+          <w:b/>
+          <w:color w:val="FF3621"/>
+          <w:sz w:val="20"/>
+          <w:szCs w:val="20"/>
+        </w:rPr>
+        <w:t xml:space="preserve">Note:  </w:t>
+      </w:r>
+      <w:r>
+        <w:rPr>
+          <w:rFonts w:ascii="DM Sans" w:hAnsi="DM Sans" w:cs="DM Sans"/>
+          <w:i/>
+          <w:color w:val="5A6872"/>
+          <w:sz w:val="20"/>
+          <w:szCs w:val="20"/>
+        </w:rPr>
+        <w:t xml:space="preserve">Because the job runs on Databricks (dbutils is available), it reads SOURCE credentials from the secret scope. So the secret scope AND its keys (source-client-id, source-client-secret, source-token) MUST already exist on the target workspace before you run. See 'Set up the secret scope' below.</w:t>
+      </w:r>
+    </w:p>
+    <w:p>
+      <w:pPr>
+        <w:pStyle w:val="Heading2"/>
+        <w:spacing w:before="0" w:after="120"/>
+      </w:pPr>
+      <w:r>
+        <w:rPr>
+          <w:rFonts w:ascii="DM Sans" w:hAnsi="DM Sans" w:cs="DM Sans"/>
+        </w:rPr>
+        <w:t xml:space="preserve">Option B — Direct Python script (runs ON your laptop)</w:t>
+      </w:r>
+    </w:p>
+    <w:p>
+      <w:pPr>
+        <w:spacing w:before="0" w:after="120"/>
+      </w:pPr>
+      <w:r>
+        <w:rPr>
+          <w:rFonts w:ascii="DM Sans" w:hAnsi="DM Sans" w:cs="DM Sans"/>
+        </w:rPr>
+        <w:t xml:space="preserve">Runs the notebook code as a plain script. Requires a Spark session available locally (e.g. Databricks Connect). Here SOURCE credentials are passed as CLI args or env vars — the secret scope is NOT used at all (dbutils is absent locally).</w:t>
+      </w:r>
+    </w:p>
+    <w:p>
+      <w:pPr>
+        <w:shd w:val="clear" w:color="auto" w:fill="F5F5F0"/>
+        <w:ind w:left="120"/>
+        <w:spacing w:before="0" w:after="0"/>
+      </w:pPr>
+      <w:r>
+        <w:rPr>
+          <w:rFonts w:ascii="Consolas" w:hAnsi="Consolas" w:cs="Consolas"/>
+          <w:color w:val="1B3139"/>
+          <w:sz w:val="18"/>
+          <w:szCs w:val="18"/>
+        </w:rPr>
+        <w:t xml:space="preserve"># target auth from profile/env vars above; pass source creds explicitly</w:t>
+      </w:r>
+    </w:p>
+    <w:p>
+      <w:pPr>
+        <w:shd w:val="clear" w:color="auto" w:fill="F5F5F0"/>
+        <w:ind w:left="120"/>
+        <w:spacing w:before="0" w:after="0"/>
+      </w:pPr>
+      <w:r>
+        <w:rPr>
+          <w:rFonts w:ascii="Consolas" w:hAnsi="Consolas" w:cs="Consolas"/>
+          <w:color w:val="1B3139"/>
+          <w:sz w:val="18"/>
+          <w:szCs w:val="18"/>
+        </w:rPr>
+        <w:t xml:space="preserve">python src/orchestrator.py \</w:t>
+      </w:r>
+    </w:p>
+    <w:p>
+      <w:pPr>
+        <w:shd w:val="clear" w:color="auto" w:fill="F5F5F0"/>
+        <w:ind w:left="120"/>
+        <w:spacing w:before="0" w:after="0"/>
+      </w:pPr>
+      <w:r>
+        <w:rPr>
+          <w:rFonts w:ascii="Consolas" w:hAnsi="Consolas" w:cs="Consolas"/>
+          <w:color w:val="1B3139"/>
+          <w:sz w:val="18"/>
+          <w:szCs w:val="18"/>
+        </w:rPr>
+        <w:t xml:space="preserve">  --catalog prod_catalog --schema ka_schema \</w:t>
+      </w:r>
+    </w:p>
+    <w:p>
+      <w:pPr>
+        <w:shd w:val="clear" w:color="auto" w:fill="F5F5F0"/>
+        <w:ind w:left="120"/>
+        <w:spacing w:before="0" w:after="0"/>
+      </w:pPr>
+      <w:r>
+        <w:rPr>
+          <w:rFonts w:ascii="Consolas" w:hAnsi="Consolas" w:cs="Consolas"/>
+          <w:color w:val="1B3139"/>
+          <w:sz w:val="18"/>
+          <w:szCs w:val="18"/>
+        </w:rPr>
+        <w:t xml:space="preserve">  --source-host https://adb-source.7.azuredatabricks.net \</w:t>
+      </w:r>
+    </w:p>
+    <w:p>
+      <w:pPr>
+        <w:shd w:val="clear" w:color="auto" w:fill="F5F5F0"/>
+        <w:ind w:left="120"/>
+        <w:spacing w:before="0" w:after="0"/>
+      </w:pPr>
+      <w:r>
+        <w:rPr>
+          <w:rFonts w:ascii="Consolas" w:hAnsi="Consolas" w:cs="Consolas"/>
+          <w:color w:val="1B3139"/>
+          <w:sz w:val="18"/>
+          <w:szCs w:val="18"/>
+        </w:rPr>
+        <w:t xml:space="preserve">  --source-client-id &lt;sp-id&gt; --source-client-secret &lt;sp-secret&gt;</w:t>
+      </w:r>
+    </w:p>
+    <w:p>
+      <w:pPr>
+        <w:shd w:val="clear" w:color="auto" w:fill="F5F5F0"/>
+        <w:ind w:left="120"/>
+        <w:spacing w:before="0" w:after="0"/>
+      </w:pPr>
+      <w:r>
+        <w:rPr>
+          <w:rFonts w:ascii="Consolas" w:hAnsi="Consolas" w:cs="Consolas"/>
+          <w:color w:val="1B3139"/>
+          <w:sz w:val="18"/>
+          <w:szCs w:val="18"/>
+        </w:rPr>
+        <w:t xml:space="preserve"> </w:t>
+      </w:r>
+    </w:p>
+    <w:p>
+      <w:pPr>
+        <w:shd w:val="clear" w:color="auto" w:fill="F5F5F0"/>
+        <w:ind w:left="120"/>
+        <w:spacing w:before="0" w:after="0"/>
+      </w:pPr>
+      <w:r>
+        <w:rPr>
+          <w:rFonts w:ascii="Consolas" w:hAnsi="Consolas" w:cs="Consolas"/>
+          <w:color w:val="1B3139"/>
+          <w:sz w:val="18"/>
+          <w:szCs w:val="18"/>
+        </w:rPr>
+        <w:t xml:space="preserve"># or a source PAT instead of the SP:</w:t>
+      </w:r>
+    </w:p>
+    <w:p>
+      <w:pPr>
+        <w:shd w:val="clear" w:color="auto" w:fill="F5F5F0"/>
+        <w:ind w:left="120"/>
+        <w:spacing w:before="0" w:after="0"/>
+      </w:pPr>
+      <w:r>
+        <w:rPr>
+          <w:rFonts w:ascii="Consolas" w:hAnsi="Consolas" w:cs="Consolas"/>
+          <w:color w:val="1B3139"/>
+          <w:sz w:val="18"/>
+          <w:szCs w:val="18"/>
+        </w:rPr>
+        <w:t xml:space="preserve">#   --source-token dapiSOURCEXXted</w:t>
+      </w:r>
+    </w:p>
+    <w:p>
+      <w:pPr>
+        <w:spacing w:before="0" w:after="80"/>
+      </w:pPr>
+      <w:r>
+        <w:rPr>
+          <w:rFonts w:ascii="DM Sans" w:hAnsi="DM Sans" w:cs="DM Sans"/>
+        </w:rPr>
+        <w:t xml:space="preserve"> </w:t>
+      </w:r>
+    </w:p>
+    <w:p>
+      <w:pPr>
+        <w:spacing w:before="0" w:after="120"/>
+      </w:pPr>
+      <w:r>
+        <w:rPr>
+          <w:rFonts w:ascii="DM Sans" w:hAnsi="DM Sans" w:cs="DM Sans"/>
+        </w:rPr>
+        <w:t xml:space="preserve">Equivalent source env vars (used if the args are omitted):</w:t>
+      </w:r>
+    </w:p>
+    <w:tbl>
+      <w:tblPr>
+        <w:tblW w:w="9000" w:type="dxa"/>
+        <w:tblLayout w:type="fixed"/>
+        <w:tblBorders>
+          <w:top w:val="single" w:sz="4" w:color="C6CDD2"/>
+          <w:left w:val="single" w:sz="4" w:color="C6CDD2"/>
+          <w:bottom w:val="single" w:sz="4" w:color="C6CDD2"/>
+          <w:right w:val="single" w:sz="4" w:color="C6CDD2"/>
+          <w:insideH w:val="single" w:sz="4" w:color="C6CDD2"/>
+          <w:insideV w:val="single" w:sz="4" w:color="C6CDD2"/>
+        </w:tblBorders>
+      </w:tblPr>
+      <w:tblGrid>
+        <w:gridCol w:w="3200"/>
+        <w:gridCol w:w="5800"/>
+      </w:tblGrid>
+      <w:tr>
+        <w:tc>
+          <w:tcPr>
+            <w:tcW w:w="3200" w:type="dxa"/>
+            <w:shd w:val="clear" w:color="auto" w:fill="1B3139"/>
+            <w:tcMar>
+              <w:top w:w="50" w:type="dxa"/>
+              <w:bottom w:w="50" w:type="dxa"/>
+              <w:left w:w="90" w:type="dxa"/>
+              <w:right w:w="90" w:type="dxa"/>
+            </w:tcMar>
+            <w:vAlign w:val="center"/>
+          </w:tcPr>
+          <w:p>
+            <w:pPr>
+              <w:spacing w:after="20"/>
+            </w:pPr>
+            <w:r>
+              <w:rPr>
+                <w:rFonts w:ascii="DM Sans" w:hAnsi="DM Sans" w:cs="DM Sans"/>
+                <w:b/>
+                <w:color w:val="FFFFFF"/>
+                <w:sz w:val="18"/>
+                <w:szCs w:val="18"/>
+              </w:rPr>
+              <w:t xml:space="preserve">Env var</w:t>
+            </w:r>
+          </w:p>
+        </w:tc>
+        <w:tc>
+          <w:tcPr>
+            <w:tcW w:w="5800" w:type="dxa"/>
+            <w:shd w:val="clear" w:color="auto" w:fill="1B3139"/>
+            <w:tcMar>
+              <w:top w:w="50" w:type="dxa"/>
+              <w:bottom w:w="50" w:type="dxa"/>
+              <w:left w:w="90" w:type="dxa"/>
+              <w:right w:w="90" w:type="dxa"/>
+            </w:tcMar>
+            <w:vAlign w:val="center"/>
+          </w:tcPr>
+          <w:p>
+            <w:pPr>
+              <w:spacing w:after="20"/>
+            </w:pPr>
+            <w:r>
+              <w:rPr>
+                <w:rFonts w:ascii="DM Sans" w:hAnsi="DM Sans" w:cs="DM Sans"/>
+                <w:b/>
+                <w:color w:val="FFFFFF"/>
+                <w:sz w:val="18"/>
+                <w:szCs w:val="18"/>
+              </w:rPr>
+              <w:t xml:space="preserve">Purpose</w:t>
+            </w:r>
+          </w:p>
+        </w:tc>
+      </w:tr>
+      <w:tr>
+        <w:tc>
+          <w:tcPr>
+            <w:tcW w:w="3200" w:type="dxa"/>
+            <w:shd w:val="clear" w:color="auto" w:fill="FFFFFF"/>
+            <w:tcMar>
+              <w:top w:w="50" w:type="dxa"/>
+              <w:bottom w:w="50" w:type="dxa"/>
+              <w:left w:w="90" w:type="dxa"/>
+              <w:right w:w="90" w:type="dxa"/>
+            </w:tcMar>
+            <w:vAlign w:val="center"/>
+          </w:tcPr>
+          <w:p>
+            <w:pPr>
+              <w:spacing w:after="20"/>
+            </w:pPr>
+            <w:r>
+              <w:rPr>
+                <w:rFonts w:ascii="Consolas" w:hAnsi="Consolas" w:cs="Consolas"/>
+                <w:color w:val="1B3139"/>
+                <w:sz w:val="18"/>
+                <w:szCs w:val="18"/>
+              </w:rPr>
+              <w:t xml:space="preserve">SOURCE_CLIENT_ID</w:t>
+            </w:r>
+          </w:p>
+        </w:tc>
+        <w:tc>
+          <w:tcPr>
+            <w:tcW w:w="5800" w:type="dxa"/>
+            <w:shd w:val="clear" w:color="auto" w:fill="FFFFFF"/>
+            <w:tcMar>
+              <w:top w:w="50" w:type="dxa"/>
+              <w:bottom w:w="50" w:type="dxa"/>
+              <w:left w:w="90" w:type="dxa"/>
+              <w:right w:w="90" w:type="dxa"/>
+            </w:tcMar>
+            <w:vAlign w:val="center"/>
+          </w:tcPr>
+          <w:p>
+            <w:pPr>
+              <w:spacing w:after="20"/>
+            </w:pPr>
+            <w:r>
+              <w:rPr>
+                <w:rFonts w:ascii="DM Sans" w:hAnsi="DM Sans" w:cs="DM Sans"/>
+                <w:sz w:val="18"/>
+                <w:szCs w:val="18"/>
+              </w:rPr>
+              <w:t xml:space="preserve">Source SP client ID (tried first).</w:t>
+            </w:r>
+          </w:p>
+        </w:tc>
+      </w:tr>
+      <w:tr>
+        <w:tc>
+          <w:tcPr>
+            <w:tcW w:w="3200" w:type="dxa"/>
+            <w:shd w:val="clear" w:color="auto" w:fill="FFFFFF"/>
+            <w:tcMar>
+              <w:top w:w="50" w:type="dxa"/>
+              <w:bottom w:w="50" w:type="dxa"/>
+              <w:left w:w="90" w:type="dxa"/>
+              <w:right w:w="90" w:type="dxa"/>
+            </w:tcMar>
+            <w:vAlign w:val="center"/>
+          </w:tcPr>
+          <w:p>
+            <w:pPr>
+              <w:spacing w:after="20"/>
+            </w:pPr>
+            <w:r>
+              <w:rPr>
+                <w:rFonts w:ascii="Consolas" w:hAnsi="Consolas" w:cs="Consolas"/>
+                <w:color w:val="1B3139"/>
+                <w:sz w:val="18"/>
+                <w:szCs w:val="18"/>
+              </w:rPr>
+              <w:t xml:space="preserve">SOURCE_CLIENT_SECRET</w:t>
+            </w:r>
+          </w:p>
+        </w:tc>
+        <w:tc>
+          <w:tcPr>
+            <w:tcW w:w="5800" w:type="dxa"/>
+            <w:shd w:val="clear" w:color="auto" w:fill="FFFFFF"/>
+            <w:tcMar>
+              <w:top w:w="50" w:type="dxa"/>
+              <w:bottom w:w="50" w:type="dxa"/>
+              <w:left w:w="90" w:type="dxa"/>
+              <w:right w:w="90" w:type="dxa"/>
+            </w:tcMar>
+            <w:vAlign w:val="center"/>
+          </w:tcPr>
+          <w:p>
+            <w:pPr>
+              <w:spacing w:after="20"/>
+            </w:pPr>
+            <w:r>
+              <w:rPr>
+                <w:rFonts w:ascii="DM Sans" w:hAnsi="DM Sans" w:cs="DM Sans"/>
+                <w:sz w:val="18"/>
+                <w:szCs w:val="18"/>
+              </w:rPr>
+              <w:t xml:space="preserve">Source SP client secret.</w:t>
+            </w:r>
+          </w:p>
+        </w:tc>
+      </w:tr>
+      <w:tr>
+        <w:tc>
+          <w:tcPr>
+            <w:tcW w:w="3200" w:type="dxa"/>
+            <w:shd w:val="clear" w:color="auto" w:fill="FFFFFF"/>
+            <w:tcMar>
+              <w:top w:w="50" w:type="dxa"/>
+              <w:bottom w:w="50" w:type="dxa"/>
+              <w:left w:w="90" w:type="dxa"/>
+              <w:right w:w="90" w:type="dxa"/>
+            </w:tcMar>
+            <w:vAlign w:val="center"/>
+          </w:tcPr>
+          <w:p>
+            <w:pPr>
+              <w:spacing w:after="20"/>
+            </w:pPr>
+            <w:r>
+              <w:rPr>
+                <w:rFonts w:ascii="Consolas" w:hAnsi="Consolas" w:cs="Consolas"/>
+                <w:color w:val="1B3139"/>
+                <w:sz w:val="18"/>
+                <w:szCs w:val="18"/>
+              </w:rPr>
+              <w:t xml:space="preserve">SOURCE_DATABRICKS_TOKEN</w:t>
+            </w:r>
+          </w:p>
+        </w:tc>
+        <w:tc>
+          <w:tcPr>
+            <w:tcW w:w="5800" w:type="dxa"/>
+            <w:shd w:val="clear" w:color="auto" w:fill="FFFFFF"/>
+            <w:tcMar>
+              <w:top w:w="50" w:type="dxa"/>
+              <w:bottom w:w="50" w:type="dxa"/>
+              <w:left w:w="90" w:type="dxa"/>
+              <w:right w:w="90" w:type="dxa"/>
+            </w:tcMar>
+            <w:vAlign w:val="center"/>
+          </w:tcPr>
+          <w:p>
+            <w:pPr>
+              <w:spacing w:after="20"/>
+            </w:pPr>
+            <w:r>
+              <w:rPr>
+                <w:rFonts w:ascii="DM Sans" w:hAnsi="DM Sans" w:cs="DM Sans"/>
+                <w:sz w:val="18"/>
+                <w:szCs w:val="18"/>
+              </w:rPr>
+              <w:t xml:space="preserve">Source PAT (fallback if SP not set/failing).</w:t>
+            </w:r>
+          </w:p>
+        </w:tc>
+      </w:tr>
+    </w:tbl>
+    <w:p>
+      <w:pPr>
+        <w:spacing w:before="0" w:after="80"/>
+      </w:pPr>
+      <w:r>
+        <w:rPr>
+          <w:rFonts w:ascii="DM Sans" w:hAnsi="DM Sans" w:cs="DM Sans"/>
+        </w:rPr>
+        <w:t xml:space="preserve"> </w:t>
+      </w:r>
+    </w:p>
+    <w:p>
+      <w:pPr>
+        <w:pStyle w:val="Heading2"/>
+        <w:spacing w:before="0" w:after="120"/>
+      </w:pPr>
+      <w:r>
+        <w:rPr>
+          <w:rFonts w:ascii="DM Sans" w:hAnsi="DM Sans" w:cs="DM Sans"/>
+        </w:rPr>
+        <w:t xml:space="preserve">Do I need the secret scope locally?</w:t>
+      </w:r>
+    </w:p>
+    <w:tbl>
+      <w:tblPr>
+        <w:tblW w:w="9000" w:type="dxa"/>
+        <w:tblLayout w:type="fixed"/>
+        <w:tblBorders>
+          <w:top w:val="single" w:sz="4" w:color="C6CDD2"/>
+          <w:left w:val="single" w:sz="4" w:color="C6CDD2"/>
+          <w:bottom w:val="single" w:sz="4" w:color="C6CDD2"/>
+          <w:right w:val="single" w:sz="4" w:color="C6CDD2"/>
+          <w:insideH w:val="single" w:sz="4" w:color="C6CDD2"/>
+          <w:insideV w:val="single" w:sz="4" w:color="C6CDD2"/>
+        </w:tblBorders>
+      </w:tblPr>
+      <w:tblGrid>
+        <w:gridCol w:w="2600"/>
+        <w:gridCol w:w="2600"/>
+        <w:gridCol w:w="3800"/>
+      </w:tblGrid>
+      <w:tr>
+        <w:tc>
+          <w:tcPr>
+            <w:tcW w:w="2600" w:type="dxa"/>
+            <w:shd w:val="clear" w:color="auto" w:fill="1B3139"/>
+            <w:tcMar>
+              <w:top w:w="50" w:type="dxa"/>
+              <w:bottom w:w="50" w:type="dxa"/>
+              <w:left w:w="90" w:type="dxa"/>
+              <w:right w:w="90" w:type="dxa"/>
+            </w:tcMar>
+            <w:vAlign w:val="center"/>
+          </w:tcPr>
+          <w:p>
+            <w:pPr>
+              <w:spacing w:after="20"/>
+            </w:pPr>
+            <w:r>
+              <w:rPr>
+                <w:rFonts w:ascii="DM Sans" w:hAnsi="DM Sans" w:cs="DM Sans"/>
+                <w:b/>
+                <w:color w:val="FFFFFF"/>
+                <w:sz w:val="18"/>
+                <w:szCs w:val="18"/>
+              </w:rPr>
+              <w:t xml:space="preserve">How you run</w:t>
+            </w:r>
+          </w:p>
+        </w:tc>
+        <w:tc>
+          <w:tcPr>
+            <w:tcW w:w="2600" w:type="dxa"/>
+            <w:shd w:val="clear" w:color="auto" w:fill="1B3139"/>
+            <w:tcMar>
+              <w:top w:w="50" w:type="dxa"/>
+              <w:bottom w:w="50" w:type="dxa"/>
+              <w:left w:w="90" w:type="dxa"/>
+              <w:right w:w="90" w:type="dxa"/>
+            </w:tcMar>
+            <w:vAlign w:val="center"/>
+          </w:tcPr>
+          <w:p>
+            <w:pPr>
+              <w:spacing w:after="20"/>
+            </w:pPr>
+            <w:r>
+              <w:rPr>
+                <w:rFonts w:ascii="DM Sans" w:hAnsi="DM Sans" w:cs="DM Sans"/>
+                <w:b/>
+                <w:color w:val="FFFFFF"/>
+                <w:sz w:val="18"/>
+                <w:szCs w:val="18"/>
+              </w:rPr>
+              <w:t xml:space="preserve">Where it executes</w:t>
+            </w:r>
+          </w:p>
+        </w:tc>
+        <w:tc>
+          <w:tcPr>
+            <w:tcW w:w="3800" w:type="dxa"/>
+            <w:shd w:val="clear" w:color="auto" w:fill="1B3139"/>
+            <w:tcMar>
+              <w:top w:w="50" w:type="dxa"/>
+              <w:bottom w:w="50" w:type="dxa"/>
+              <w:left w:w="90" w:type="dxa"/>
+              <w:right w:w="90" w:type="dxa"/>
+            </w:tcMar>
+            <w:vAlign w:val="center"/>
+          </w:tcPr>
+          <w:p>
+            <w:pPr>
+              <w:spacing w:after="20"/>
+            </w:pPr>
+            <w:r>
+              <w:rPr>
+                <w:rFonts w:ascii="DM Sans" w:hAnsi="DM Sans" w:cs="DM Sans"/>
+                <w:b/>
+                <w:color w:val="FFFFFF"/>
+                <w:sz w:val="18"/>
+                <w:szCs w:val="18"/>
+              </w:rPr>
+              <w:t xml:space="preserve">Secret scope needed?</w:t>
+            </w:r>
+          </w:p>
+        </w:tc>
+      </w:tr>
+      <w:tr>
+        <w:tc>
+          <w:tcPr>
+            <w:tcW w:w="2600" w:type="dxa"/>
+            <w:shd w:val="clear" w:color="auto" w:fill="FFFFFF"/>
+            <w:tcMar>
+              <w:top w:w="50" w:type="dxa"/>
+              <w:bottom w:w="50" w:type="dxa"/>
+              <w:left w:w="90" w:type="dxa"/>
+              <w:right w:w="90" w:type="dxa"/>
+            </w:tcMar>
+            <w:vAlign w:val="center"/>
+          </w:tcPr>
+          <w:p>
+            <w:pPr>
+              <w:spacing w:after="20"/>
+            </w:pPr>
+            <w:r>
+              <w:rPr>
+                <w:rFonts w:ascii="DM Sans" w:hAnsi="DM Sans" w:cs="DM Sans"/>
+                <w:sz w:val="18"/>
+                <w:szCs w:val="18"/>
+              </w:rPr>
+              <w:t xml:space="preserve">Option A — bundle run</w:t>
+            </w:r>
+          </w:p>
+        </w:tc>
+        <w:tc>
+          <w:tcPr>
+            <w:tcW w:w="2600" w:type="dxa"/>
+            <w:shd w:val="clear" w:color="auto" w:fill="FFFFFF"/>
+            <w:tcMar>
+              <w:top w:w="50" w:type="dxa"/>
+              <w:bottom w:w="50" w:type="dxa"/>
+              <w:left w:w="90" w:type="dxa"/>
+              <w:right w:w="90" w:type="dxa"/>
+            </w:tcMar>
+            <w:vAlign w:val="center"/>
+          </w:tcPr>
+          <w:p>
+            <w:pPr>
+              <w:spacing w:after="20"/>
+            </w:pPr>
+            <w:r>
+              <w:rPr>
+                <w:rFonts w:ascii="DM Sans" w:hAnsi="DM Sans" w:cs="DM Sans"/>
+                <w:sz w:val="18"/>
+                <w:szCs w:val="18"/>
+              </w:rPr>
+              <w:t xml:space="preserve">Databricks compute</w:t>
+            </w:r>
+          </w:p>
+        </w:tc>
+        <w:tc>
+          <w:tcPr>
+            <w:tcW w:w="3800" w:type="dxa"/>
+            <w:shd w:val="clear" w:color="auto" w:fill="FFFFFF"/>
+            <w:tcMar>
+              <w:top w:w="50" w:type="dxa"/>
+              <w:bottom w:w="50" w:type="dxa"/>
+              <w:left w:w="90" w:type="dxa"/>
+              <w:right w:w="90" w:type="dxa"/>
+            </w:tcMar>
+            <w:vAlign w:val="center"/>
+          </w:tcPr>
+          <w:p>
+            <w:pPr>
+              <w:spacing w:after="20"/>
+            </w:pPr>
+            <w:r>
+              <w:rPr>
+                <w:rFonts w:ascii="DM Sans" w:hAnsi="DM Sans" w:cs="DM Sans"/>
+                <w:sz w:val="18"/>
+                <w:szCs w:val="18"/>
+              </w:rPr>
+              <w:t xml:space="preserve">YES — scope + source keys must exist on target first.</w:t>
+            </w:r>
+          </w:p>
+        </w:tc>
+      </w:tr>
+      <w:tr>
+        <w:tc>
+          <w:tcPr>
+            <w:tcW w:w="2600" w:type="dxa"/>
+            <w:shd w:val="clear" w:color="auto" w:fill="FFFFFF"/>
+            <w:tcMar>
+              <w:top w:w="50" w:type="dxa"/>
+              <w:bottom w:w="50" w:type="dxa"/>
+              <w:left w:w="90" w:type="dxa"/>
+              <w:right w:w="90" w:type="dxa"/>
+            </w:tcMar>
+            <w:vAlign w:val="center"/>
+          </w:tcPr>
+          <w:p>
+            <w:pPr>
+              <w:spacing w:after="20"/>
+            </w:pPr>
+            <w:r>
+              <w:rPr>
+                <w:rFonts w:ascii="DM Sans" w:hAnsi="DM Sans" w:cs="DM Sans"/>
+                <w:sz w:val="18"/>
+                <w:szCs w:val="18"/>
+              </w:rPr>
+              <w:t xml:space="preserve">Option B — python script</w:t>
+            </w:r>
+          </w:p>
+        </w:tc>
+        <w:tc>
+          <w:tcPr>
+            <w:tcW w:w="2600" w:type="dxa"/>
+            <w:shd w:val="clear" w:color="auto" w:fill="FFFFFF"/>
+            <w:tcMar>
+              <w:top w:w="50" w:type="dxa"/>
+              <w:bottom w:w="50" w:type="dxa"/>
+              <w:left w:w="90" w:type="dxa"/>
+              <w:right w:w="90" w:type="dxa"/>
+            </w:tcMar>
+            <w:vAlign w:val="center"/>
+          </w:tcPr>
+          <w:p>
+            <w:pPr>
+              <w:spacing w:after="20"/>
+            </w:pPr>
+            <w:r>
+              <w:rPr>
+                <w:rFonts w:ascii="DM Sans" w:hAnsi="DM Sans" w:cs="DM Sans"/>
+                <w:sz w:val="18"/>
+                <w:szCs w:val="18"/>
+              </w:rPr>
+              <w:t xml:space="preserve">Your laptop</w:t>
+            </w:r>
+          </w:p>
+        </w:tc>
+        <w:tc>
+          <w:tcPr>
+            <w:tcW w:w="3800" w:type="dxa"/>
+            <w:shd w:val="clear" w:color="auto" w:fill="FFFFFF"/>
+            <w:tcMar>
+              <w:top w:w="50" w:type="dxa"/>
+              <w:bottom w:w="50" w:type="dxa"/>
+              <w:left w:w="90" w:type="dxa"/>
+              <w:right w:w="90" w:type="dxa"/>
+            </w:tcMar>
+            <w:vAlign w:val="center"/>
+          </w:tcPr>
+          <w:p>
+            <w:pPr>
+              <w:spacing w:after="20"/>
+            </w:pPr>
+            <w:r>
+              <w:rPr>
+                <w:rFonts w:ascii="DM Sans" w:hAnsi="DM Sans" w:cs="DM Sans"/>
+                <w:sz w:val="18"/>
+                <w:szCs w:val="18"/>
+              </w:rPr>
+              <w:t xml:space="preserve">NO — pass source creds via --source-* args or SOURCE_* env vars.</w:t>
+            </w:r>
+          </w:p>
+        </w:tc>
+      </w:tr>
+    </w:tbl>
+    <w:p>
+      <w:pPr>
+        <w:spacing w:before="0" w:after="80"/>
+      </w:pPr>
+      <w:r>
+        <w:rPr>
+          <w:rFonts w:ascii="DM Sans" w:hAnsi="DM Sans" w:cs="DM Sans"/>
+        </w:rPr>
+        <w:t xml:space="preserve"> </w:t>
+      </w:r>
+    </w:p>
+    <w:p>
+      <w:pPr>
+        <w:pStyle w:val="Heading2"/>
+        <w:spacing w:before="0" w:after="120"/>
+      </w:pPr>
+      <w:r>
+        <w:rPr>
+          <w:rFonts w:ascii="DM Sans" w:hAnsi="DM Sans" w:cs="DM Sans"/>
+        </w:rPr>
+        <w:t xml:space="preserve">Set up the secret scope (only for Option A)</w:t>
+      </w:r>
+    </w:p>
+    <w:p>
+      <w:pPr>
+        <w:spacing w:before="0" w:after="120"/>
+      </w:pPr>
+      <w:r>
+        <w:rPr>
+          <w:rFonts w:ascii="DM Sans" w:hAnsi="DM Sans" w:cs="DM Sans"/>
+        </w:rPr>
+        <w:t xml:space="preserve">Create the scope once on the target workspace and add the source credential keys. The scope name must match the secret_scope variable (default: ka-deployment).</w:t>
+      </w:r>
+    </w:p>
+    <w:p>
+      <w:pPr>
+        <w:shd w:val="clear" w:color="auto" w:fill="F5F5F0"/>
+        <w:ind w:left="120"/>
+        <w:spacing w:before="0" w:after="0"/>
+      </w:pPr>
+      <w:r>
+        <w:rPr>
+          <w:rFonts w:ascii="Consolas" w:hAnsi="Consolas" w:cs="Consolas"/>
+          <w:color w:val="1B3139"/>
+          <w:sz w:val="18"/>
+          <w:szCs w:val="18"/>
+        </w:rPr>
+        <w:t xml:space="preserve">databricks secrets create-scope ka-deployment -p myprofile</w:t>
+      </w:r>
+    </w:p>
+    <w:p>
+      <w:pPr>
+        <w:shd w:val="clear" w:color="auto" w:fill="F5F5F0"/>
+        <w:ind w:left="120"/>
+        <w:spacing w:before="0" w:after="0"/>
+      </w:pPr>
+      <w:r>
+        <w:rPr>
+          <w:rFonts w:ascii="Consolas" w:hAnsi="Consolas" w:cs="Consolas"/>
+          <w:color w:val="1B3139"/>
+          <w:sz w:val="18"/>
+          <w:szCs w:val="18"/>
+        </w:rPr>
+        <w:t xml:space="preserve">databricks secrets put-secret ka-deployment source-client-id \</w:t>
+      </w:r>
+    </w:p>
+    <w:p>
+      <w:pPr>
+        <w:shd w:val="clear" w:color="auto" w:fill="F5F5F0"/>
+        <w:ind w:left="120"/>
+        <w:spacing w:before="0" w:after="0"/>
+      </w:pPr>
+      <w:r>
+        <w:rPr>
+          <w:rFonts w:ascii="Consolas" w:hAnsi="Consolas" w:cs="Consolas"/>
+          <w:color w:val="1B3139"/>
+          <w:sz w:val="18"/>
+          <w:szCs w:val="18"/>
+        </w:rPr>
+        <w:t xml:space="preserve">  --string-value &lt;sp-id&gt;        -p myprofile</w:t>
+      </w:r>
+    </w:p>
+    <w:p>
+      <w:pPr>
+        <w:shd w:val="clear" w:color="auto" w:fill="F5F5F0"/>
+        <w:ind w:left="120"/>
+        <w:spacing w:before="0" w:after="0"/>
+      </w:pPr>
+      <w:r>
+        <w:rPr>
+          <w:rFonts w:ascii="Consolas" w:hAnsi="Consolas" w:cs="Consolas"/>
+          <w:color w:val="1B3139"/>
+          <w:sz w:val="18"/>
+          <w:szCs w:val="18"/>
+        </w:rPr>
+        <w:t xml:space="preserve">databricks secrets put-secret ka-deployment source-client-secret \</w:t>
+      </w:r>
+    </w:p>
+    <w:p>
+      <w:pPr>
+        <w:shd w:val="clear" w:color="auto" w:fill="F5F5F0"/>
+        <w:ind w:left="120"/>
+        <w:spacing w:before="0" w:after="0"/>
+      </w:pPr>
+      <w:r>
+        <w:rPr>
+          <w:rFonts w:ascii="Consolas" w:hAnsi="Consolas" w:cs="Consolas"/>
+          <w:color w:val="1B3139"/>
+          <w:sz w:val="18"/>
+          <w:szCs w:val="18"/>
+        </w:rPr>
+        <w:t xml:space="preserve">  --string-value &lt;sp-secret&gt;    -p myprofile</w:t>
+      </w:r>
+    </w:p>
+    <w:p>
+      <w:pPr>
+        <w:shd w:val="clear" w:color="auto" w:fill="F5F5F0"/>
+        <w:ind w:left="120"/>
+        <w:spacing w:before="0" w:after="0"/>
+      </w:pPr>
+      <w:r>
+        <w:rPr>
+          <w:rFonts w:ascii="Consolas" w:hAnsi="Consolas" w:cs="Consolas"/>
+          <w:color w:val="1B3139"/>
+          <w:sz w:val="18"/>
+          <w:szCs w:val="18"/>
+        </w:rPr>
+        <w:t xml:space="preserve"># optional PAT fallback:</w:t>
+      </w:r>
+    </w:p>
+    <w:p>
+      <w:pPr>
+        <w:shd w:val="clear" w:color="auto" w:fill="F5F5F0"/>
+        <w:ind w:left="120"/>
+        <w:spacing w:before="0" w:after="0"/>
+      </w:pPr>
+      <w:r>
+        <w:rPr>
+          <w:rFonts w:ascii="Consolas" w:hAnsi="Consolas" w:cs="Consolas"/>
+          <w:color w:val="1B3139"/>
+          <w:sz w:val="18"/>
+          <w:szCs w:val="18"/>
+        </w:rPr>
+        <w:t xml:space="preserve">databricks secrets put-secret ka-deployment source-token \</w:t>
+      </w:r>
+    </w:p>
+    <w:p>
+      <w:pPr>
+        <w:shd w:val="clear" w:color="auto" w:fill="F5F5F0"/>
+        <w:ind w:left="120"/>
+        <w:spacing w:before="0" w:after="0"/>
+      </w:pPr>
+      <w:r>
+        <w:rPr>
+          <w:rFonts w:ascii="Consolas" w:hAnsi="Consolas" w:cs="Consolas"/>
+          <w:color w:val="1B3139"/>
+          <w:sz w:val="18"/>
+          <w:szCs w:val="18"/>
+        </w:rPr>
+        <w:t xml:space="preserve">  --string-value dapiSOURCEXXX  -p myprofile</w:t>
+      </w:r>
+    </w:p>
+    <w:p>
+      <w:pPr>
+        <w:spacing w:before="0" w:after="80"/>
+      </w:pPr>
+      <w:r>
+        <w:rPr>
+          <w:rFonts w:ascii="DM Sans" w:hAnsi="DM Sans" w:cs="DM Sans"/>
+        </w:rPr>
+        <w:t xml:space="preserve"> </w:t>
+      </w:r>
+    </w:p>
+    <w:p>
+      <w:pPr>
+        <w:spacing w:before="0" w:after="120"/>
+      </w:pPr>
+      <w:r>
+        <w:rPr>
+          <w:rFonts w:ascii="DM Sans" w:hAnsi="DM Sans" w:cs="DM Sans"/>
+          <w:b/>
+          <w:color w:val="FF3621"/>
+          <w:sz w:val="20"/>
+          <w:szCs w:val="20"/>
+        </w:rPr>
+        <w:t xml:space="preserve">Note:  </w:t>
+      </w:r>
+      <w:r>
+        <w:rPr>
+          <w:rFonts w:ascii="DM Sans" w:hAnsi="DM Sans" w:cs="DM Sans"/>
+          <w:i/>
+          <w:color w:val="5A6872"/>
+          <w:sz w:val="20"/>
+          <w:szCs w:val="20"/>
+        </w:rPr>
+        <w:t xml:space="preserve">Credential resolution order in code: secret scope (Databricks runs only) → explicit CLI args → SOURCE_* env vars. Locally via Option B, the scope step returns nothing, so args/env vars win.</w:t>
+      </w:r>
+    </w:p>
+    <w:p>
+      <w:r>
+        <w:br w:type="page"/>
+      </w:r>
+    </w:p>
+    <w:p>
+      <w:pPr>
+        <w:pStyle w:val="Heading1"/>
+        <w:spacing w:before="0" w:after="120"/>
+      </w:pPr>
+      <w:r>
+        <w:rPr>
+          <w:rFonts w:ascii="DM Sans" w:hAnsi="DM Sans" w:cs="DM Sans"/>
+        </w:rPr>
+        <w:t xml:space="preserve">9.  Status Tracking Tables</w:t>
       </w:r>
     </w:p>
     <w:p>
@@ -10798,7 +12179,7 @@
         <w:rPr>
           <w:rFonts w:ascii="DM Sans" w:hAnsi="DM Sans" w:cs="DM Sans"/>
         </w:rPr>
-        <w:t xml:space="preserve">9.  Copying Examples</w:t>
+        <w:t xml:space="preserve">10.  Copying Examples</w:t>
       </w:r>
     </w:p>
     <w:p>
@@ -10963,7 +12344,7 @@
         <w:rPr>
           <w:rFonts w:ascii="DM Sans" w:hAnsi="DM Sans" w:cs="DM Sans"/>
         </w:rPr>
-        <w:t xml:space="preserve">10.  Troubleshooting</w:t>
+        <w:t xml:space="preserve">11.  Troubleshooting</w:t>
       </w:r>
     </w:p>
     <w:tbl>

</xml_diff>